<commit_message>
docs: thêm 4 query insight mới vào mục 8 của Report.docx
Đồng bộ với sql/hoang/04_queries.sql (nhánh hoang/04-queries): xu hướng theo
năm, nền tảng bán chạy nhất, top game mỗi nền tảng (window function), doanh
số thể loại theo khu vực.

Co-Authored-By: Claude Sonnet 5 <noreply@anthropic.com>
</commit_message>
<xml_diff>
--- a/slide-report/Report.docx
+++ b/slide-report/Report.docx
@@ -3170,7 +3170,7 @@
     </w:p>
     <w:p>
       <w:r>
-        <w:t>Các truy vấn dưới đây được viết trong sql/hoang/04_queries.sql (phụ trách: Hoàng), đáp ứng đủ 5 loại yêu cầu: inner join, outer join, subquery trong WHERE, subquery trong FROM, group by + hàm aggregate.</w:t>
+        <w:t>Các truy vấn dưới đây được viết trong sql/hoang/04_queries.sql (phụ trách: Hoàng). 5 câu đầu đáp ứng đủ yêu cầu bắt buộc: inner join, outer join, subquery trong WHERE, subquery trong FROM, group by + hàm aggregate. 4 câu sau (8.6-8.9) là query insight bổ sung, phục vụ luôn cho few-shot examples của NL2SQL Agent (xem ai/nl2sql/schema.py).</w:t>
       </w:r>
     </w:p>
     <w:p>
@@ -3399,6 +3399,208 @@
         <w:t>GROUP BY p.publisher_name</w:t>
         <w:br/>
         <w:t>ORDER BY tong_doanh_so DESC;</w:t>
+      </w:r>
+    </w:p>
+    <w:p>
+      <w:r>
+        <w:rPr>
+          <w:i/>
+          <w:color w:val="808080"/>
+        </w:rPr>
+        <w:t>[Chèn ảnh chụp kết quả chạy trong SSMS]</w:t>
+      </w:r>
+    </w:p>
+    <w:p>
+      <w:pPr>
+        <w:pStyle w:val="Heading2"/>
+      </w:pPr>
+      <w:r>
+        <w:t>8.6. Xu hướng doanh số theo năm</w:t>
+      </w:r>
+    </w:p>
+    <w:p>
+      <w:r>
+        <w:t>Tổng doanh số toàn hệ thống theo từng năm phát hành.</w:t>
+      </w:r>
+    </w:p>
+    <w:p>
+      <w:pPr>
+        <w:spacing w:before="80" w:after="80"/>
+        <w:shd w:val="clear" w:fill="F2F2F2"/>
+      </w:pPr>
+      <w:r>
+        <w:rPr>
+          <w:rFonts w:ascii="Consolas" w:hAnsi="Consolas"/>
+          <w:sz w:val="20"/>
+        </w:rPr>
+        <w:t>SELECT gpl.release_year, SUM(rs.num_sales) AS tong_doanh_so</w:t>
+        <w:br/>
+        <w:t>FROM game_platform gpl</w:t>
+        <w:br/>
+        <w:t>JOIN region_sales rs ON rs.game_platform_id = gpl.id</w:t>
+        <w:br/>
+        <w:t>GROUP BY gpl.release_year</w:t>
+        <w:br/>
+        <w:t>ORDER BY gpl.release_year;</w:t>
+      </w:r>
+    </w:p>
+    <w:p>
+      <w:r>
+        <w:rPr>
+          <w:i/>
+          <w:color w:val="808080"/>
+        </w:rPr>
+        <w:t>[Chèn ảnh chụp kết quả chạy trong SSMS]</w:t>
+      </w:r>
+    </w:p>
+    <w:p>
+      <w:pPr>
+        <w:pStyle w:val="Heading2"/>
+      </w:pPr>
+      <w:r>
+        <w:t>8.7. Nền tảng bán chạy nhất</w:t>
+      </w:r>
+    </w:p>
+    <w:p>
+      <w:r>
+        <w:t>Tổng doanh số theo từng nền tảng (platform).</w:t>
+      </w:r>
+    </w:p>
+    <w:p>
+      <w:pPr>
+        <w:spacing w:before="80" w:after="80"/>
+        <w:shd w:val="clear" w:fill="F2F2F2"/>
+      </w:pPr>
+      <w:r>
+        <w:rPr>
+          <w:rFonts w:ascii="Consolas" w:hAnsi="Consolas"/>
+          <w:sz w:val="20"/>
+        </w:rPr>
+        <w:t>SELECT pf.platform_name, SUM(rs.num_sales) AS tong_doanh_so</w:t>
+        <w:br/>
+        <w:t>FROM platform pf</w:t>
+        <w:br/>
+        <w:t>JOIN game_platform gpl ON gpl.platform_id = pf.id</w:t>
+        <w:br/>
+        <w:t>JOIN region_sales rs ON rs.game_platform_id = gpl.id</w:t>
+        <w:br/>
+        <w:t>GROUP BY pf.platform_name</w:t>
+        <w:br/>
+        <w:t>ORDER BY tong_doanh_so DESC;</w:t>
+      </w:r>
+    </w:p>
+    <w:p>
+      <w:r>
+        <w:rPr>
+          <w:i/>
+          <w:color w:val="808080"/>
+        </w:rPr>
+        <w:t>[Chèn ảnh chụp kết quả chạy trong SSMS]</w:t>
+      </w:r>
+    </w:p>
+    <w:p>
+      <w:pPr>
+        <w:pStyle w:val="Heading2"/>
+      </w:pPr>
+      <w:r>
+        <w:t>8.8. Game bán chạy nhất trên mỗi nền tảng</w:t>
+      </w:r>
+    </w:p>
+    <w:p>
+      <w:r>
+        <w:t>Dùng window function ROW_NUMBER() để lấy game có doanh số cao nhất trên từng nền tảng.</w:t>
+      </w:r>
+    </w:p>
+    <w:p>
+      <w:pPr>
+        <w:spacing w:before="80" w:after="80"/>
+        <w:shd w:val="clear" w:fill="F2F2F2"/>
+      </w:pPr>
+      <w:r>
+        <w:rPr>
+          <w:rFonts w:ascii="Consolas" w:hAnsi="Consolas"/>
+          <w:sz w:val="20"/>
+        </w:rPr>
+        <w:t>SELECT platform_name, game_name, tong_doanh_so</w:t>
+        <w:br/>
+        <w:t>FROM (</w:t>
+        <w:br/>
+        <w:t xml:space="preserve">    SELECT pf.platform_name, g.game_name,</w:t>
+        <w:br/>
+        <w:t xml:space="preserve">           SUM(rs.num_sales) AS tong_doanh_so,</w:t>
+        <w:br/>
+        <w:t xml:space="preserve">           ROW_NUMBER() OVER (</w:t>
+        <w:br/>
+        <w:t xml:space="preserve">               PARTITION BY pf.platform_name</w:t>
+        <w:br/>
+        <w:t xml:space="preserve">               ORDER BY SUM(rs.num_sales) DESC) AS rn</w:t>
+        <w:br/>
+        <w:t xml:space="preserve">    FROM platform pf</w:t>
+        <w:br/>
+        <w:t xml:space="preserve">    JOIN game_platform gpl ON gpl.platform_id = pf.id</w:t>
+        <w:br/>
+        <w:t xml:space="preserve">    JOIN game_publisher gp ON gp.id = gpl.game_publisher_id</w:t>
+        <w:br/>
+        <w:t xml:space="preserve">    JOIN game g ON g.id = gp.game_id</w:t>
+        <w:br/>
+        <w:t xml:space="preserve">    JOIN region_sales rs ON rs.game_platform_id = gpl.id</w:t>
+        <w:br/>
+        <w:t xml:space="preserve">    GROUP BY pf.platform_name, g.game_name</w:t>
+        <w:br/>
+        <w:t>) t</w:t>
+        <w:br/>
+        <w:t>WHERE rn = 1;</w:t>
+      </w:r>
+    </w:p>
+    <w:p>
+      <w:r>
+        <w:rPr>
+          <w:i/>
+          <w:color w:val="808080"/>
+        </w:rPr>
+        <w:t>[Chèn ảnh chụp kết quả chạy trong SSMS]</w:t>
+      </w:r>
+    </w:p>
+    <w:p>
+      <w:pPr>
+        <w:pStyle w:val="Heading2"/>
+      </w:pPr>
+      <w:r>
+        <w:t>8.9. Doanh số thể loại theo khu vực</w:t>
+      </w:r>
+    </w:p>
+    <w:p>
+      <w:r>
+        <w:t>Doanh số từng thể loại (genre) tại từng khu vực (region), so sánh 2 chiều.</w:t>
+      </w:r>
+    </w:p>
+    <w:p>
+      <w:pPr>
+        <w:spacing w:before="80" w:after="80"/>
+        <w:shd w:val="clear" w:fill="F2F2F2"/>
+      </w:pPr>
+      <w:r>
+        <w:rPr>
+          <w:rFonts w:ascii="Consolas" w:hAnsi="Consolas"/>
+          <w:sz w:val="20"/>
+        </w:rPr>
+        <w:t>SELECT gr.genre_name, r.region_name, SUM(rs.num_sales) AS tong_doanh_so</w:t>
+        <w:br/>
+        <w:t>FROM genre gr</w:t>
+        <w:br/>
+        <w:t>JOIN game g ON g.genre_id = gr.id</w:t>
+        <w:br/>
+        <w:t>JOIN game_publisher gp ON gp.game_id = g.id</w:t>
+        <w:br/>
+        <w:t>JOIN game_platform gpl ON gpl.game_publisher_id = gp.id</w:t>
+        <w:br/>
+        <w:t>JOIN region_sales rs ON rs.game_platform_id = gpl.id</w:t>
+        <w:br/>
+        <w:t>JOIN region r ON r.id = rs.region_id</w:t>
+        <w:br/>
+        <w:t>GROUP BY gr.genre_name, r.region_name</w:t>
+        <w:br/>
+        <w:t>ORDER BY gr.genre_name, tong_doanh_so DESC;</w:t>
       </w:r>
     </w:p>
     <w:p>

</xml_diff>

<commit_message>
fix: thu gọn ảnh kết quả 9 câu query trong mục 8 Report.docx
Ảnh gốc là screenshot toàn màn hình SSMS (kéo dài ~30 dòng kết quả cuộn),
mỗi ảnh cao 3.5-3.7in. Crop chỉ giữ query + ~12 dòng kết quả đầu + thanh
trạng thái (vẫn thấy tổng số dòng), resize còn ~2.2-2.3in/ảnh - giảm hơn
1/3 chiều cao mỗi ảnh. Chỉ sửa 9 ảnh thuộc mục 8 (phần Hoàng phụ trách),
không đụng các ảnh/nội dung khác Trung vừa thêm.

Co-Authored-By: Claude Sonnet 5 <noreply@anthropic.com>
</commit_message>
<xml_diff>
--- a/slide-report/Report.docx
+++ b/slide-report/Report.docx
@@ -1,6 +1,6 @@
 
 <file path=word/document.xml><?xml version="1.0" encoding="utf-8"?>
-<w:document xmlns:wpc="http://schemas.microsoft.com/office/word/2010/wordprocessingCanvas" xmlns:cx="http://schemas.microsoft.com/office/drawing/2014/chartex" xmlns:cx1="http://schemas.microsoft.com/office/drawing/2015/9/8/chartex" xmlns:cx2="http://schemas.microsoft.com/office/drawing/2015/10/21/chartex" xmlns:cx3="http://schemas.microsoft.com/office/drawing/2016/5/9/chartex" xmlns:cx4="http://schemas.microsoft.com/office/drawing/2016/5/10/chartex" xmlns:cx5="http://schemas.microsoft.com/office/drawing/2016/5/11/chartex" xmlns:cx6="http://schemas.microsoft.com/office/drawing/2016/5/12/chartex" xmlns:cx7="http://schemas.microsoft.com/office/drawing/2016/5/13/chartex" xmlns:cx8="http://schemas.microsoft.com/office/drawing/2016/5/14/chartex" xmlns:mc="http://schemas.openxmlformats.org/markup-compatibility/2006" xmlns:aink="http://schemas.microsoft.com/office/drawing/2016/ink" xmlns:am3d="http://schemas.microsoft.com/office/drawing/2017/model3d" xmlns:o="urn:schemas-microsoft-com:office:office" xmlns:oel="http://schemas.microsoft.com/office/2019/extlst" xmlns:r="http://schemas.openxmlformats.org/officeDocument/2006/relationships" xmlns:m="http://schemas.openxmlformats.org/officeDocument/2006/math" xmlns:v="urn:schemas-microsoft-com:vml" xmlns:wp14="http://schemas.microsoft.com/office/word/2010/wordprocessingDrawing" xmlns:wp="http://schemas.openxmlformats.org/drawingml/2006/wordprocessingDrawing" xmlns:w10="urn:schemas-microsoft-com:office:word" xmlns:w="http://schemas.openxmlformats.org/wordprocessingml/2006/main" xmlns:w14="http://schemas.microsoft.com/office/word/2010/wordml" xmlns:w15="http://schemas.microsoft.com/office/word/2012/wordml" xmlns:w16cei="http://schemas.microsoft.com/office/word/2026/wordml/cei" xmlns:w16cex="http://schemas.microsoft.com/office/word/2018/wordml/cex" xmlns:w16cid="http://schemas.microsoft.com/office/word/2016/wordml/cid" xmlns:w16="http://schemas.microsoft.com/office/word/2018/wordml" xmlns:w16du="http://schemas.microsoft.com/office/word/2023/wordml/word16du" xmlns:w16sdtdh="http://schemas.microsoft.com/office/word/2020/wordml/sdtdatahash" xmlns:w16sdtfl="http://schemas.microsoft.com/office/word/2024/wordml/sdtformatlock" xmlns:w16se="http://schemas.microsoft.com/office/word/2015/wordml/symex" xmlns:wpg="http://schemas.microsoft.com/office/word/2010/wordprocessingGroup" xmlns:wpi="http://schemas.microsoft.com/office/word/2010/wordprocessingInk" xmlns:wne="http://schemas.microsoft.com/office/word/2006/wordml" xmlns:wps="http://schemas.microsoft.com/office/word/2010/wordprocessingShape" mc:Ignorable="w14 w15 w16se w16cid w16 w16cex w16sdtdh w16sdtfl w16du wp14">
+<w:document xmlns:wpc="http://schemas.microsoft.com/office/word/2010/wordprocessingCanvas" xmlns:cx="http://schemas.microsoft.com/office/drawing/2014/chartex" xmlns:cx1="http://schemas.microsoft.com/office/drawing/2015/9/8/chartex" xmlns:cx2="http://schemas.microsoft.com/office/drawing/2015/10/21/chartex" xmlns:cx3="http://schemas.microsoft.com/office/drawing/2016/5/9/chartex" xmlns:cx4="http://schemas.microsoft.com/office/drawing/2016/5/10/chartex" xmlns:cx5="http://schemas.microsoft.com/office/drawing/2016/5/11/chartex" xmlns:cx6="http://schemas.microsoft.com/office/drawing/2016/5/12/chartex" xmlns:cx7="http://schemas.microsoft.com/office/drawing/2016/5/13/chartex" xmlns:cx8="http://schemas.microsoft.com/office/drawing/2016/5/14/chartex" xmlns:mc="http://schemas.openxmlformats.org/markup-compatibility/2006" xmlns:aink="http://schemas.microsoft.com/office/drawing/2016/ink" xmlns:am3d="http://schemas.microsoft.com/office/drawing/2017/model3d" xmlns:o="urn:schemas-microsoft-com:office:office" xmlns:oel="http://schemas.microsoft.com/office/2019/extlst" xmlns:r="http://schemas.openxmlformats.org/officeDocument/2006/relationships" xmlns:m="http://schemas.openxmlformats.org/officeDocument/2006/math" xmlns:v="urn:schemas-microsoft-com:vml" xmlns:wp14="http://schemas.microsoft.com/office/word/2010/wordprocessingDrawing" xmlns:wp="http://schemas.openxmlformats.org/drawingml/2006/wordprocessingDrawing" xmlns:w10="urn:schemas-microsoft-com:office:word" xmlns:w="http://schemas.openxmlformats.org/wordprocessingml/2006/main" xmlns:w14="http://schemas.microsoft.com/office/word/2010/wordml" xmlns:w15="http://schemas.microsoft.com/office/word/2012/wordml" xmlns:w16cex="http://schemas.microsoft.com/office/word/2018/wordml/cex" xmlns:w16cid="http://schemas.microsoft.com/office/word/2016/wordml/cid" xmlns:w16="http://schemas.microsoft.com/office/word/2018/wordml" xmlns:w16du="http://schemas.microsoft.com/office/word/2023/wordml/word16du" xmlns:w16sdtdh="http://schemas.microsoft.com/office/word/2020/wordml/sdtdatahash" xmlns:w16sdtfl="http://schemas.microsoft.com/office/word/2024/wordml/sdtformatlock" xmlns:w16se="http://schemas.microsoft.com/office/word/2015/wordml/symex" xmlns:wpg="http://schemas.microsoft.com/office/word/2010/wordprocessingGroup" xmlns:wpi="http://schemas.microsoft.com/office/word/2010/wordprocessingInk" xmlns:wne="http://schemas.microsoft.com/office/word/2006/wordml" xmlns:wps="http://schemas.microsoft.com/office/word/2010/wordprocessingShape" mc:Ignorable="w14 w15 w16se w16cid w16 w16cex w16sdtdh w16sdtfl w16du wp14">
   <w:body>
     <w:p/>
     <w:p/>
@@ -137,7 +137,7 @@
     </w:p>
     <w:tbl>
       <w:tblPr>
-        <w:tblStyle w:val="LightGrid-Accent1"/>
+        <w:tblStyle w:val="LiMausang-Nhnmanh1"/>
         <w:tblW w:w="0" w:type="auto"/>
         <w:jc w:val="center"/>
         <w:tblLook w:val="04A0" w:firstRow="1" w:lastRow="0" w:firstColumn="1" w:lastColumn="0" w:noHBand="0" w:noVBand="1"/>
@@ -308,7 +308,7 @@
     </w:p>
     <w:p>
       <w:pPr>
-        <w:pStyle w:val="Heading1"/>
+        <w:pStyle w:val="u1"/>
         <w:jc w:val="center"/>
       </w:pPr>
       <w:r>
@@ -349,7 +349,7 @@
     </w:p>
     <w:p>
       <w:pPr>
-        <w:pStyle w:val="Heading1"/>
+        <w:pStyle w:val="u1"/>
         <w:jc w:val="center"/>
       </w:pPr>
       <w:r>
@@ -386,7 +386,7 @@
     <w:p/>
     <w:p>
       <w:pPr>
-        <w:pStyle w:val="Heading1"/>
+        <w:pStyle w:val="u1"/>
         <w:jc w:val="center"/>
       </w:pPr>
       <w:r>
@@ -426,7 +426,7 @@
     </w:p>
     <w:p>
       <w:pPr>
-        <w:pStyle w:val="Heading1"/>
+        <w:pStyle w:val="u1"/>
       </w:pPr>
       <w:r>
         <w:lastRenderedPageBreak/>
@@ -445,7 +445,7 @@
     </w:p>
     <w:p>
       <w:pPr>
-        <w:pStyle w:val="Heading1"/>
+        <w:pStyle w:val="u1"/>
       </w:pPr>
       <w:r>
         <w:t>2. Mô tả nghiệp vụ</w:t>
@@ -458,7 +458,7 @@
     </w:p>
     <w:p>
       <w:pPr>
-        <w:pStyle w:val="ListBullet"/>
+        <w:pStyle w:val="Duudong"/>
       </w:pPr>
       <w:r>
         <w:t>Thêm một game mới vào hệ thống, gán thể loại (genre) cho game.</w:t>
@@ -466,7 +466,7 @@
     </w:p>
     <w:p>
       <w:pPr>
-        <w:pStyle w:val="ListBullet"/>
+        <w:pStyle w:val="Duudong"/>
       </w:pPr>
       <w:r>
         <w:t>Gán game cho một nhà phát hành (publisher) - một game có thể có nhiều bản phát hành bởi các publisher khác nhau (quan hệ n-n giữa game và publisher).</w:t>
@@ -474,7 +474,7 @@
     </w:p>
     <w:p>
       <w:pPr>
-        <w:pStyle w:val="ListBullet"/>
+        <w:pStyle w:val="Duudong"/>
       </w:pPr>
       <w:r>
         <w:t>Gán một bản phát hành (game-publisher) cho một nền tảng (platform) cụ thể, kèm năm phát hành - một bản phát hành có thể lên nhiều platform (quan hệ n-n giữa game_publisher và platform).</w:t>
@@ -482,7 +482,7 @@
     </w:p>
     <w:p>
       <w:pPr>
-        <w:pStyle w:val="ListBullet"/>
+        <w:pStyle w:val="Duudong"/>
       </w:pPr>
       <w:r>
         <w:t>Ghi nhận doanh số bán (region_sales) của một bản phát hành-nền tảng tại từng khu vực (region) - quan hệ n-n giữa game_platform và region.</w:t>
@@ -490,7 +490,7 @@
     </w:p>
     <w:p>
       <w:pPr>
-        <w:pStyle w:val="ListBullet"/>
+        <w:pStyle w:val="Duudong"/>
       </w:pPr>
       <w:r>
         <w:t>Thống kê, tra cứu doanh số theo thể loại / nền tảng / nhà phát hành / khu vực.</w:t>
@@ -498,7 +498,7 @@
     </w:p>
     <w:p>
       <w:pPr>
-        <w:pStyle w:val="ListBullet"/>
+        <w:pStyle w:val="Duudong"/>
       </w:pPr>
       <w:r>
         <w:t>Gợi ý (recommend) các game tương tự dựa trên đặc trưng thể loại, nhà phát hành, nền tảng - phần mở rộng ứng dụng AI (Mục 12).</w:t>
@@ -506,7 +506,7 @@
     </w:p>
     <w:p>
       <w:pPr>
-        <w:pStyle w:val="Heading1"/>
+        <w:pStyle w:val="u1"/>
       </w:pPr>
       <w:r>
         <w:t>3. Mô hình ER (Entity - Relationship)</w:t>
@@ -574,7 +574,7 @@
     </w:p>
     <w:p>
       <w:pPr>
-        <w:pStyle w:val="Heading2"/>
+        <w:pStyle w:val="u2"/>
       </w:pPr>
       <w:r>
         <w:t>Giải thích các entity và quan hệ</w:t>
@@ -582,7 +582,7 @@
     </w:p>
     <w:tbl>
       <w:tblPr>
-        <w:tblStyle w:val="LightGrid-Accent1"/>
+        <w:tblStyle w:val="LiMausang-Nhnmanh1"/>
         <w:tblW w:w="0" w:type="auto"/>
         <w:jc w:val="center"/>
         <w:tblLook w:val="04A0" w:firstRow="1" w:lastRow="0" w:firstColumn="1" w:lastColumn="0" w:noHBand="0" w:noVBand="1"/>
@@ -1002,7 +1002,7 @@
     <w:p/>
     <w:p>
       <w:pPr>
-        <w:pStyle w:val="Heading2"/>
+        <w:pStyle w:val="u2"/>
       </w:pPr>
       <w:r>
         <w:t>Lý do thiết kế 2 bảng trung gian</w:t>
@@ -1010,7 +1010,7 @@
     </w:p>
     <w:p>
       <w:pPr>
-        <w:pStyle w:val="ListBullet"/>
+        <w:pStyle w:val="Duudong"/>
       </w:pPr>
       <w:r>
         <w:t>Một game có thể được nhiều publisher phát hành (n-n giữa Game và Publisher) -&gt; tách thành thực thể trung gian Game_Publisher.</w:t>
@@ -1018,7 +1018,7 @@
     </w:p>
     <w:p>
       <w:pPr>
-        <w:pStyle w:val="ListBullet"/>
+        <w:pStyle w:val="Duudong"/>
       </w:pPr>
       <w:r>
         <w:t>Một bản phát hành (Game_Publisher) có thể ra mắt trên nhiều platform vào các năm khác nhau (n-n giữa Game_Publisher và Platform) -&gt; tách thành thực thể trung gian Game_Platform.</w:t>
@@ -1026,7 +1026,7 @@
     </w:p>
     <w:p>
       <w:pPr>
-        <w:pStyle w:val="ListBullet"/>
+        <w:pStyle w:val="Duudong"/>
       </w:pPr>
       <w:r>
         <w:t>Doanh số gắn với từng cặp (Game_Platform, Region) cụ thể qua quan hệ N-N Sold_in (mang thuộc tính num_sales), vì cùng 1 game trên các platform/publisher khác nhau có doanh số khác nhau ở từng khu vực.</w:t>
@@ -1034,7 +1034,7 @@
     </w:p>
     <w:p>
       <w:pPr>
-        <w:pStyle w:val="Heading1"/>
+        <w:pStyle w:val="u1"/>
       </w:pPr>
       <w:r>
         <w:t>4. Mô hình quan hệ, phụ thuộc hàm và chuẩn hoá 3NF</w:t>
@@ -1047,7 +1047,7 @@
     </w:p>
     <w:tbl>
       <w:tblPr>
-        <w:tblStyle w:val="LightGrid-Accent1"/>
+        <w:tblStyle w:val="LiMausang-Nhnmanh1"/>
         <w:tblW w:w="0" w:type="auto"/>
         <w:jc w:val="center"/>
         <w:tblLook w:val="04A0" w:firstRow="1" w:lastRow="0" w:firstColumn="1" w:lastColumn="0" w:noHBand="0" w:noVBand="1"/>
@@ -1462,7 +1462,7 @@
     <w:p/>
     <w:p>
       <w:pPr>
-        <w:pStyle w:val="Heading2"/>
+        <w:pStyle w:val="u2"/>
       </w:pPr>
       <w:r>
         <w:t>Vì sao các bảng đạt chuẩn 3NF</w:t>
@@ -1475,7 +1475,7 @@
     </w:p>
     <w:p>
       <w:pPr>
-        <w:pStyle w:val="ListBullet"/>
+        <w:pStyle w:val="Duudong"/>
       </w:pPr>
       <w:r>
         <w:t>Đạt 1NF: mọi thuộc tính đều mang giá trị nguyên tố (atomic) - không có thuộc tính đa trị hay lặp nhóm.</w:t>
@@ -1483,7 +1483,7 @@
     </w:p>
     <w:p>
       <w:pPr>
-        <w:pStyle w:val="ListBullet"/>
+        <w:pStyle w:val="Duudong"/>
       </w:pPr>
       <w:r>
         <w:t>Đạt 2NF: 7/8 bảng có khoá chính là 1 cột (id) nên không thể có phụ thuộc bộ phận. Riêng region_sales có khoá chính phức hợp (region_id, game_platform_id), nhưng num_sales phụ thuộc đầy đủ vào cả 2 cột của khoá, không phụ thuộc riêng vào từng cột -&gt; không có phụ thuộc bộ phận.</w:t>
@@ -1491,7 +1491,7 @@
     </w:p>
     <w:p>
       <w:pPr>
-        <w:pStyle w:val="ListBullet"/>
+        <w:pStyle w:val="Duudong"/>
       </w:pPr>
       <w:r>
         <w:t>Đạt 3NF: ở từng bảng, các thuộc tính không khoá chỉ phụ thuộc trực tiếp vào khoá chính, không có thuộc tính không khoá nào xác định một thuộc tính không khoá khác (vd trong game, genre_id không xác định game_name; trong game_platform, game_publisher_id/platform_id/release_year độc lập với nhau).</w:t>
@@ -1504,7 +1504,7 @@
     </w:p>
     <w:p>
       <w:pPr>
-        <w:pStyle w:val="Heading1"/>
+        <w:pStyle w:val="u1"/>
       </w:pPr>
       <w:r>
         <w:t>5. Đặc tả yêu cầu dữ liệu (Data Dictionary)</w:t>
@@ -1517,7 +1517,7 @@
     </w:p>
     <w:p>
       <w:pPr>
-        <w:pStyle w:val="Heading2"/>
+        <w:pStyle w:val="u2"/>
       </w:pPr>
       <w:r>
         <w:t>Bảng genre</w:t>
@@ -1525,7 +1525,7 @@
     </w:p>
     <w:tbl>
       <w:tblPr>
-        <w:tblStyle w:val="LightGrid-Accent1"/>
+        <w:tblStyle w:val="LiMausang-Nhnmanh1"/>
         <w:tblW w:w="0" w:type="auto"/>
         <w:jc w:val="center"/>
         <w:tblLook w:val="04A0" w:firstRow="1" w:lastRow="0" w:firstColumn="1" w:lastColumn="0" w:noHBand="0" w:noVBand="1"/>
@@ -1767,7 +1767,7 @@
     <w:p/>
     <w:p>
       <w:pPr>
-        <w:pStyle w:val="Heading2"/>
+        <w:pStyle w:val="u2"/>
       </w:pPr>
       <w:r>
         <w:t>Bảng platform</w:t>
@@ -1775,7 +1775,7 @@
     </w:p>
     <w:tbl>
       <w:tblPr>
-        <w:tblStyle w:val="LightGrid-Accent1"/>
+        <w:tblStyle w:val="LiMausang-Nhnmanh1"/>
         <w:tblW w:w="0" w:type="auto"/>
         <w:jc w:val="center"/>
         <w:tblLook w:val="04A0" w:firstRow="1" w:lastRow="0" w:firstColumn="1" w:lastColumn="0" w:noHBand="0" w:noVBand="1"/>
@@ -2013,7 +2013,7 @@
     <w:p/>
     <w:p>
       <w:pPr>
-        <w:pStyle w:val="Heading2"/>
+        <w:pStyle w:val="u2"/>
       </w:pPr>
       <w:r>
         <w:t>Bảng publisher</w:t>
@@ -2021,7 +2021,7 @@
     </w:p>
     <w:tbl>
       <w:tblPr>
-        <w:tblStyle w:val="LightGrid-Accent1"/>
+        <w:tblStyle w:val="LiMausang-Nhnmanh1"/>
         <w:tblW w:w="0" w:type="auto"/>
         <w:jc w:val="center"/>
         <w:tblLook w:val="04A0" w:firstRow="1" w:lastRow="0" w:firstColumn="1" w:lastColumn="0" w:noHBand="0" w:noVBand="1"/>
@@ -2259,7 +2259,7 @@
     <w:p/>
     <w:p>
       <w:pPr>
-        <w:pStyle w:val="Heading2"/>
+        <w:pStyle w:val="u2"/>
       </w:pPr>
       <w:r>
         <w:t>Bảng region</w:t>
@@ -2267,7 +2267,7 @@
     </w:p>
     <w:tbl>
       <w:tblPr>
-        <w:tblStyle w:val="LightGrid-Accent1"/>
+        <w:tblStyle w:val="LiMausang-Nhnmanh1"/>
         <w:tblW w:w="0" w:type="auto"/>
         <w:jc w:val="center"/>
         <w:tblLook w:val="04A0" w:firstRow="1" w:lastRow="0" w:firstColumn="1" w:lastColumn="0" w:noHBand="0" w:noVBand="1"/>
@@ -2505,7 +2505,7 @@
     <w:p/>
     <w:p>
       <w:pPr>
-        <w:pStyle w:val="Heading2"/>
+        <w:pStyle w:val="u2"/>
       </w:pPr>
       <w:r>
         <w:t>Bảng game</w:t>
@@ -2513,7 +2513,7 @@
     </w:p>
     <w:tbl>
       <w:tblPr>
-        <w:tblStyle w:val="LightGrid-Accent1"/>
+        <w:tblStyle w:val="LiMausang-Nhnmanh1"/>
         <w:tblW w:w="0" w:type="auto"/>
         <w:jc w:val="center"/>
         <w:tblLook w:val="04A0" w:firstRow="1" w:lastRow="0" w:firstColumn="1" w:lastColumn="0" w:noHBand="0" w:noVBand="1"/>
@@ -2820,7 +2820,7 @@
     <w:p/>
     <w:p>
       <w:pPr>
-        <w:pStyle w:val="Heading2"/>
+        <w:pStyle w:val="u2"/>
       </w:pPr>
       <w:r>
         <w:t>Bảng game_publisher (bảng trung gian)</w:t>
@@ -2828,7 +2828,7 @@
     </w:p>
     <w:tbl>
       <w:tblPr>
-        <w:tblStyle w:val="LightGrid-Accent1"/>
+        <w:tblStyle w:val="LiMausang-Nhnmanh1"/>
         <w:tblW w:w="0" w:type="auto"/>
         <w:jc w:val="center"/>
         <w:tblLook w:val="04A0" w:firstRow="1" w:lastRow="0" w:firstColumn="1" w:lastColumn="0" w:noHBand="0" w:noVBand="1"/>
@@ -3135,7 +3135,7 @@
     <w:p/>
     <w:p>
       <w:pPr>
-        <w:pStyle w:val="Heading2"/>
+        <w:pStyle w:val="u2"/>
       </w:pPr>
       <w:r>
         <w:t>Bảng game_platform (bảng trung gian)</w:t>
@@ -3143,7 +3143,7 @@
     </w:p>
     <w:tbl>
       <w:tblPr>
-        <w:tblStyle w:val="LightGrid-Accent1"/>
+        <w:tblStyle w:val="LiMausang-Nhnmanh1"/>
         <w:tblW w:w="0" w:type="auto"/>
         <w:jc w:val="center"/>
         <w:tblLook w:val="04A0" w:firstRow="1" w:lastRow="0" w:firstColumn="1" w:lastColumn="0" w:noHBand="0" w:noVBand="1"/>
@@ -3524,7 +3524,7 @@
     <w:p/>
     <w:p>
       <w:pPr>
-        <w:pStyle w:val="Heading2"/>
+        <w:pStyle w:val="u2"/>
       </w:pPr>
       <w:r>
         <w:t>Bảng region_sales (PK phức hợp)</w:t>
@@ -3532,7 +3532,7 @@
     </w:p>
     <w:tbl>
       <w:tblPr>
-        <w:tblStyle w:val="LightGrid-Accent1"/>
+        <w:tblStyle w:val="LiMausang-Nhnmanh1"/>
         <w:tblW w:w="0" w:type="auto"/>
         <w:jc w:val="center"/>
         <w:tblLook w:val="04A0" w:firstRow="1" w:lastRow="0" w:firstColumn="1" w:lastColumn="0" w:noHBand="0" w:noVBand="1"/>
@@ -3844,7 +3844,7 @@
     </w:p>
     <w:p>
       <w:pPr>
-        <w:pStyle w:val="Heading1"/>
+        <w:pStyle w:val="u1"/>
       </w:pPr>
       <w:r>
         <w:lastRenderedPageBreak/>
@@ -3862,7 +3862,7 @@
     </w:p>
     <w:p>
       <w:pPr>
-        <w:pStyle w:val="Heading1"/>
+        <w:pStyle w:val="u1"/>
         <w:rPr>
           <w:lang w:val="vi-VN"/>
         </w:rPr>
@@ -3883,7 +3883,7 @@
     </w:p>
     <w:p>
       <w:pPr>
-        <w:pStyle w:val="Heading2"/>
+        <w:pStyle w:val="u2"/>
       </w:pPr>
       <w:r>
         <w:t>7.1. Tạo database và các bảng</w:t>
@@ -4425,6 +4425,7 @@
       </w:pPr>
       <w:r>
         <w:rPr>
+          <w:noProof/>
           <w:lang w:val="vi-VN"/>
         </w:rPr>
         <w:lastRenderedPageBreak/>
@@ -4467,7 +4468,7 @@
     </w:p>
     <w:p>
       <w:pPr>
-        <w:pStyle w:val="Heading2"/>
+        <w:pStyle w:val="u2"/>
       </w:pPr>
       <w:r>
         <w:t>7.2. Index phục vụ hiệu năng truy vấn</w:t>
@@ -4592,6 +4593,7 @@
       </w:pPr>
       <w:r>
         <w:rPr>
+          <w:noProof/>
           <w:lang w:val="vi-VN"/>
         </w:rPr>
         <w:lastRenderedPageBreak/>
@@ -4634,7 +4636,7 @@
     </w:p>
     <w:p>
       <w:pPr>
-        <w:pStyle w:val="Heading2"/>
+        <w:pStyle w:val="u2"/>
       </w:pPr>
       <w:r>
         <w:t>7.3. Nạp dữ liệu mẫu (insert.sql)</w:t>
@@ -4647,7 +4649,7 @@
     </w:p>
     <w:tbl>
       <w:tblPr>
-        <w:tblStyle w:val="LightGrid-Accent1"/>
+        <w:tblStyle w:val="LiMausang-Nhnmanh1"/>
         <w:tblW w:w="0" w:type="auto"/>
         <w:jc w:val="center"/>
         <w:tblLook w:val="04A0" w:firstRow="1" w:lastRow="0" w:firstColumn="1" w:lastColumn="0" w:noHBand="0" w:noVBand="1"/>
@@ -4940,7 +4942,7 @@
     </w:p>
     <w:p>
       <w:pPr>
-        <w:pStyle w:val="Heading2"/>
+        <w:pStyle w:val="u2"/>
       </w:pPr>
       <w:r>
         <w:t>Bảng platform (31 dòng)</w:t>
@@ -5022,6 +5024,7 @@
       </w:pPr>
       <w:r>
         <w:rPr>
+          <w:noProof/>
           <w:lang w:val="vi-VN"/>
         </w:rPr>
         <w:lastRenderedPageBreak/>
@@ -5064,7 +5067,7 @@
     </w:p>
     <w:p>
       <w:pPr>
-        <w:pStyle w:val="Heading2"/>
+        <w:pStyle w:val="u2"/>
       </w:pPr>
       <w:r>
         <w:t>Bảng genre (12 dòng)</w:t>
@@ -5146,6 +5149,7 @@
       </w:pPr>
       <w:r>
         <w:rPr>
+          <w:noProof/>
           <w:lang w:val="vi-VN"/>
         </w:rPr>
         <w:drawing>
@@ -5187,7 +5191,7 @@
     </w:p>
     <w:p>
       <w:pPr>
-        <w:pStyle w:val="Heading2"/>
+        <w:pStyle w:val="u2"/>
       </w:pPr>
       <w:r>
         <w:t>Bảng publisher (577 dòng)</w:t>
@@ -5276,6 +5280,7 @@
       </w:pPr>
       <w:r>
         <w:rPr>
+          <w:noProof/>
           <w:lang w:val="vi-VN"/>
         </w:rPr>
         <w:drawing>
@@ -5317,7 +5322,7 @@
     </w:p>
     <w:p>
       <w:pPr>
-        <w:pStyle w:val="Heading2"/>
+        <w:pStyle w:val="u2"/>
       </w:pPr>
       <w:r>
         <w:t>Bảng region (4 dòng)</w:t>
@@ -5383,6 +5388,7 @@
       </w:pPr>
       <w:r>
         <w:rPr>
+          <w:noProof/>
           <w:lang w:val="vi-VN"/>
         </w:rPr>
         <w:drawing>
@@ -5424,7 +5430,7 @@
     </w:p>
     <w:p>
       <w:pPr>
-        <w:pStyle w:val="Heading2"/>
+        <w:pStyle w:val="u2"/>
       </w:pPr>
       <w:r>
         <w:t>Bảng game (11.360 dòng)</w:t>
@@ -5506,6 +5512,7 @@
       </w:pPr>
       <w:r>
         <w:rPr>
+          <w:noProof/>
           <w:lang w:val="vi-VN"/>
         </w:rPr>
         <w:lastRenderedPageBreak/>
@@ -5548,7 +5555,7 @@
     </w:p>
     <w:p>
       <w:pPr>
-        <w:pStyle w:val="Heading2"/>
+        <w:pStyle w:val="u2"/>
       </w:pPr>
       <w:r>
         <w:t>Bảng game_publisher (11.732 dòng)</w:t>
@@ -5630,6 +5637,7 @@
       </w:pPr>
       <w:r>
         <w:rPr>
+          <w:noProof/>
           <w:lang w:val="vi-VN"/>
         </w:rPr>
         <w:drawing>
@@ -5671,7 +5679,7 @@
     </w:p>
     <w:p>
       <w:pPr>
-        <w:pStyle w:val="Heading2"/>
+        <w:pStyle w:val="u2"/>
       </w:pPr>
       <w:r>
         <w:lastRenderedPageBreak/>
@@ -5754,6 +5762,7 @@
       </w:pPr>
       <w:r>
         <w:rPr>
+          <w:noProof/>
           <w:lang w:val="vi-VN"/>
         </w:rPr>
         <w:drawing>
@@ -5795,7 +5804,7 @@
     </w:p>
     <w:p>
       <w:pPr>
-        <w:pStyle w:val="Heading2"/>
+        <w:pStyle w:val="u2"/>
       </w:pPr>
       <w:r>
         <w:t>Bảng region_sales (65.320 dòng)</w:t>
@@ -5877,6 +5886,7 @@
       </w:pPr>
       <w:r>
         <w:rPr>
+          <w:noProof/>
           <w:lang w:val="vi-VN"/>
         </w:rPr>
         <w:lastRenderedPageBreak/>
@@ -5926,7 +5936,7 @@
     </w:p>
     <w:p>
       <w:pPr>
-        <w:pStyle w:val="Heading1"/>
+        <w:pStyle w:val="u1"/>
       </w:pPr>
       <w:r>
         <w:t>8. Truy vấn (Queries)</w:t>
@@ -5939,7 +5949,7 @@
     </w:p>
     <w:p>
       <w:pPr>
-        <w:pStyle w:val="Heading2"/>
+        <w:pStyle w:val="u2"/>
       </w:pPr>
       <w:r>
         <w:t>8.1. Inner Join</w:t>
@@ -6003,7 +6013,7 @@
         <w:lastRenderedPageBreak/>
         <w:drawing>
           <wp:inline distT="0" distB="0" distL="0" distR="0" wp14:anchorId="0FAC703E" wp14:editId="655AC1EE">
-            <wp:extent cx="5580000" cy="3219231"/>
+            <wp:extent cx="5486400" cy="2094807"/>
             <wp:effectExtent l="0" t="0" r="0" b="0"/>
             <wp:docPr id="2" name="Picture 2"/>
             <wp:cNvGraphicFramePr>
@@ -6025,7 +6035,7 @@
                   <pic:spPr>
                     <a:xfrm>
                       <a:off x="0" y="0"/>
-                      <a:ext cx="5580000" cy="3219231"/>
+                      <a:ext cx="5486400" cy="2094807"/>
                     </a:xfrm>
                     <a:prstGeom prst="rect">
                       <a:avLst/>
@@ -6040,7 +6050,7 @@
     </w:p>
     <w:p>
       <w:pPr>
-        <w:pStyle w:val="Heading2"/>
+        <w:pStyle w:val="u2"/>
       </w:pPr>
       <w:r>
         <w:t>8.2. Outer Join</w:t>
@@ -6103,7 +6113,7 @@
         </w:rPr>
         <w:drawing>
           <wp:inline distT="0" distB="0" distL="0" distR="0" wp14:anchorId="65CEA545" wp14:editId="43A731CA">
-            <wp:extent cx="5580000" cy="3303081"/>
+            <wp:extent cx="5486400" cy="2078816"/>
             <wp:effectExtent l="0" t="0" r="0" b="0"/>
             <wp:docPr id="3" name="Picture 3"/>
             <wp:cNvGraphicFramePr>
@@ -6125,7 +6135,7 @@
                   <pic:spPr>
                     <a:xfrm>
                       <a:off x="0" y="0"/>
-                      <a:ext cx="5580000" cy="3303081"/>
+                      <a:ext cx="5486400" cy="2078816"/>
                     </a:xfrm>
                     <a:prstGeom prst="rect">
                       <a:avLst/>
@@ -6140,10 +6150,9 @@
     </w:p>
     <w:p>
       <w:pPr>
-        <w:pStyle w:val="Heading2"/>
+        <w:pStyle w:val="u2"/>
       </w:pPr>
       <w:r>
-        <w:lastRenderedPageBreak/>
         <w:t>8.3. Subquery trong WHERE</w:t>
       </w:r>
     </w:p>
@@ -6210,9 +6219,10 @@
         <w:rPr>
           <w:noProof/>
         </w:rPr>
+        <w:lastRenderedPageBreak/>
         <w:drawing>
           <wp:inline distT="0" distB="0" distL="0" distR="0" wp14:anchorId="002DF78A" wp14:editId="7E7E24D9">
-            <wp:extent cx="5580000" cy="3190213"/>
+            <wp:extent cx="5486400" cy="2055987"/>
             <wp:effectExtent l="0" t="0" r="0" b="0"/>
             <wp:docPr id="4" name="Picture 4"/>
             <wp:cNvGraphicFramePr>
@@ -6234,7 +6244,7 @@
                   <pic:spPr>
                     <a:xfrm>
                       <a:off x="0" y="0"/>
-                      <a:ext cx="5580000" cy="3190213"/>
+                      <a:ext cx="5486400" cy="2055987"/>
                     </a:xfrm>
                     <a:prstGeom prst="rect">
                       <a:avLst/>
@@ -6249,7 +6259,7 @@
     </w:p>
     <w:p>
       <w:pPr>
-        <w:pStyle w:val="Heading2"/>
+        <w:pStyle w:val="u2"/>
       </w:pPr>
       <w:r>
         <w:t>8.4. Subquery trong FROM</w:t>
@@ -6358,10 +6368,9 @@
         <w:rPr>
           <w:noProof/>
         </w:rPr>
-        <w:lastRenderedPageBreak/>
         <w:drawing>
           <wp:inline distT="0" distB="0" distL="0" distR="0" wp14:anchorId="4858901F" wp14:editId="089DBDB9">
-            <wp:extent cx="5580000" cy="3281010"/>
+            <wp:extent cx="5486400" cy="2043365"/>
             <wp:effectExtent l="0" t="0" r="0" b="0"/>
             <wp:docPr id="5" name="Picture 5"/>
             <wp:cNvGraphicFramePr>
@@ -6383,7 +6392,7 @@
                   <pic:spPr>
                     <a:xfrm>
                       <a:off x="0" y="0"/>
-                      <a:ext cx="5580000" cy="3281010"/>
+                      <a:ext cx="5486400" cy="2043365"/>
                     </a:xfrm>
                     <a:prstGeom prst="rect">
                       <a:avLst/>
@@ -6398,7 +6407,7 @@
     </w:p>
     <w:p>
       <w:pPr>
-        <w:pStyle w:val="Heading2"/>
+        <w:pStyle w:val="u2"/>
       </w:pPr>
       <w:r>
         <w:t>8.5. Group By + Aggregate</w:t>
@@ -6451,6 +6460,13 @@
           <w:sz w:val="20"/>
         </w:rPr>
         <w:br/>
+      </w:r>
+      <w:r>
+        <w:rPr>
+          <w:rFonts w:ascii="Consolas" w:hAnsi="Consolas"/>
+          <w:sz w:val="20"/>
+        </w:rPr>
+        <w:lastRenderedPageBreak/>
         <w:t>JOIN game g ON g.id = gp.game_id</w:t>
       </w:r>
       <w:r>
@@ -6491,10 +6507,9 @@
         <w:rPr>
           <w:noProof/>
         </w:rPr>
-        <w:lastRenderedPageBreak/>
         <w:drawing>
           <wp:inline distT="0" distB="0" distL="0" distR="0" wp14:anchorId="2684081F" wp14:editId="323863A8">
-            <wp:extent cx="5580000" cy="3343308"/>
+            <wp:extent cx="5486400" cy="2099211"/>
             <wp:effectExtent l="0" t="0" r="0" b="0"/>
             <wp:docPr id="6" name="Picture 6"/>
             <wp:cNvGraphicFramePr>
@@ -6516,7 +6531,7 @@
                   <pic:spPr>
                     <a:xfrm>
                       <a:off x="0" y="0"/>
-                      <a:ext cx="5580000" cy="3343308"/>
+                      <a:ext cx="5486400" cy="2099211"/>
                     </a:xfrm>
                     <a:prstGeom prst="rect">
                       <a:avLst/>
@@ -6531,7 +6546,7 @@
     </w:p>
     <w:p>
       <w:pPr>
-        <w:pStyle w:val="Heading2"/>
+        <w:pStyle w:val="u2"/>
       </w:pPr>
       <w:r>
         <w:t>8.6. Xu hướng doanh số theo năm</w:t>
@@ -6592,10 +6607,9 @@
         <w:rPr>
           <w:noProof/>
         </w:rPr>
-        <w:lastRenderedPageBreak/>
         <w:drawing>
           <wp:inline distT="0" distB="0" distL="0" distR="0" wp14:anchorId="3853E811" wp14:editId="05FAAB52">
-            <wp:extent cx="5580000" cy="3351889"/>
+            <wp:extent cx="5486400" cy="2087508"/>
             <wp:effectExtent l="0" t="0" r="0" b="0"/>
             <wp:docPr id="7" name="Picture 7"/>
             <wp:cNvGraphicFramePr>
@@ -6617,7 +6631,7 @@
                   <pic:spPr>
                     <a:xfrm>
                       <a:off x="0" y="0"/>
-                      <a:ext cx="5580000" cy="3351889"/>
+                      <a:ext cx="5486400" cy="2087508"/>
                     </a:xfrm>
                     <a:prstGeom prst="rect">
                       <a:avLst/>
@@ -6632,7 +6646,7 @@
     </w:p>
     <w:p>
       <w:pPr>
-        <w:pStyle w:val="Heading2"/>
+        <w:pStyle w:val="u2"/>
       </w:pPr>
       <w:r>
         <w:t>8.7. Nền tảng bán chạy nhất</w:t>
@@ -6685,6 +6699,13 @@
           <w:sz w:val="20"/>
         </w:rPr>
         <w:br/>
+      </w:r>
+      <w:r>
+        <w:rPr>
+          <w:rFonts w:ascii="Consolas" w:hAnsi="Consolas"/>
+          <w:sz w:val="20"/>
+        </w:rPr>
+        <w:lastRenderedPageBreak/>
         <w:t>GROUP BY pf.platform_name</w:t>
       </w:r>
       <w:r>
@@ -6701,10 +6722,9 @@
         <w:rPr>
           <w:noProof/>
         </w:rPr>
-        <w:lastRenderedPageBreak/>
         <w:drawing>
           <wp:inline distT="0" distB="0" distL="0" distR="0" wp14:anchorId="7C8B25C7" wp14:editId="01353DF4">
-            <wp:extent cx="5580000" cy="3293051"/>
+            <wp:extent cx="5486400" cy="2077374"/>
             <wp:effectExtent l="0" t="0" r="0" b="0"/>
             <wp:docPr id="8" name="Picture 8"/>
             <wp:cNvGraphicFramePr>
@@ -6726,7 +6746,7 @@
                   <pic:spPr>
                     <a:xfrm>
                       <a:off x="0" y="0"/>
-                      <a:ext cx="5580000" cy="3293051"/>
+                      <a:ext cx="5486400" cy="2077374"/>
                     </a:xfrm>
                     <a:prstGeom prst="rect">
                       <a:avLst/>
@@ -6741,7 +6761,7 @@
     </w:p>
     <w:p>
       <w:pPr>
-        <w:pStyle w:val="Heading2"/>
+        <w:pStyle w:val="u2"/>
       </w:pPr>
       <w:r>
         <w:t>8.8. Game bán chạy nhất trên mỗi nền tảng</w:t>
@@ -6882,10 +6902,9 @@
         <w:rPr>
           <w:noProof/>
         </w:rPr>
-        <w:lastRenderedPageBreak/>
         <w:drawing>
           <wp:inline distT="0" distB="0" distL="0" distR="0" wp14:anchorId="72967A73" wp14:editId="11E4928E">
-            <wp:extent cx="5580000" cy="3323925"/>
+            <wp:extent cx="5486400" cy="2084602"/>
             <wp:effectExtent l="0" t="0" r="0" b="0"/>
             <wp:docPr id="9" name="Picture 9"/>
             <wp:cNvGraphicFramePr>
@@ -6907,7 +6926,7 @@
                   <pic:spPr>
                     <a:xfrm>
                       <a:off x="0" y="0"/>
-                      <a:ext cx="5580000" cy="3323925"/>
+                      <a:ext cx="5486400" cy="2084602"/>
                     </a:xfrm>
                     <a:prstGeom prst="rect">
                       <a:avLst/>
@@ -6922,9 +6941,10 @@
     </w:p>
     <w:p>
       <w:pPr>
-        <w:pStyle w:val="Heading2"/>
+        <w:pStyle w:val="u2"/>
       </w:pPr>
       <w:r>
+        <w:lastRenderedPageBreak/>
         <w:t>8.9. Doanh số thể loại theo khu vực</w:t>
       </w:r>
     </w:p>
@@ -7015,10 +7035,9 @@
         <w:rPr>
           <w:noProof/>
         </w:rPr>
-        <w:lastRenderedPageBreak/>
         <w:drawing>
           <wp:inline distT="0" distB="0" distL="0" distR="0" wp14:anchorId="08D70B82" wp14:editId="3CE13D5D">
-            <wp:extent cx="5580000" cy="3321062"/>
+            <wp:extent cx="5486400" cy="2065913"/>
             <wp:effectExtent l="0" t="0" r="0" b="0"/>
             <wp:docPr id="10" name="Picture 10"/>
             <wp:cNvGraphicFramePr>
@@ -7040,7 +7059,7 @@
                   <pic:spPr>
                     <a:xfrm>
                       <a:off x="0" y="0"/>
-                      <a:ext cx="5580000" cy="3321062"/>
+                      <a:ext cx="5486400" cy="2065913"/>
                     </a:xfrm>
                     <a:prstGeom prst="rect">
                       <a:avLst/>
@@ -7055,7 +7074,7 @@
     </w:p>
     <w:p>
       <w:pPr>
-        <w:pStyle w:val="Heading1"/>
+        <w:pStyle w:val="u1"/>
       </w:pPr>
       <w:r>
         <w:t>9. Transaction</w:t>
@@ -7072,7 +7091,7 @@
     </w:p>
     <w:p>
       <w:pPr>
-        <w:pStyle w:val="Heading1"/>
+        <w:pStyle w:val="u1"/>
       </w:pPr>
       <w:r>
         <w:t>10. Trigger</w:t>
@@ -7089,7 +7108,7 @@
     </w:p>
     <w:p>
       <w:pPr>
-        <w:pStyle w:val="Heading1"/>
+        <w:pStyle w:val="u1"/>
         <w:rPr>
           <w:lang w:val="vi-VN"/>
         </w:rPr>
@@ -7105,7 +7124,7 @@
     </w:p>
     <w:p>
       <w:pPr>
-        <w:pStyle w:val="Heading2"/>
+        <w:pStyle w:val="u2"/>
       </w:pPr>
       <w:r>
         <w:t>11.1. sp_GetTopGamesByRegion</w:t>
@@ -7147,6 +7166,13 @@
           <w:sz w:val="18"/>
         </w:rPr>
         <w:br/>
+      </w:r>
+      <w:r>
+        <w:rPr>
+          <w:rFonts w:ascii="Consolas" w:hAnsi="Consolas"/>
+          <w:sz w:val="18"/>
+        </w:rPr>
+        <w:lastRenderedPageBreak/>
         <w:t xml:space="preserve">    @TopN INT = 10</w:t>
       </w:r>
       <w:r>
@@ -7194,13 +7220,6 @@
           <w:sz w:val="18"/>
         </w:rPr>
         <w:br/>
-      </w:r>
-      <w:r>
-        <w:rPr>
-          <w:rFonts w:ascii="Consolas" w:hAnsi="Consolas"/>
-          <w:sz w:val="18"/>
-        </w:rPr>
-        <w:lastRenderedPageBreak/>
         <w:t xml:space="preserve">        g.id AS game_id,</w:t>
       </w:r>
       <w:r>
@@ -7334,6 +7353,7 @@
       </w:pPr>
       <w:r>
         <w:rPr>
+          <w:noProof/>
           <w:lang w:val="vi-VN"/>
         </w:rPr>
         <w:drawing>
@@ -7375,7 +7395,7 @@
     </w:p>
     <w:p>
       <w:pPr>
-        <w:pStyle w:val="Heading2"/>
+        <w:pStyle w:val="u2"/>
       </w:pPr>
       <w:r>
         <w:t>11.2. sp_AddNewGame</w:t>
@@ -7425,6 +7445,13 @@
           <w:sz w:val="18"/>
         </w:rPr>
         <w:br/>
+      </w:r>
+      <w:r>
+        <w:rPr>
+          <w:rFonts w:ascii="Consolas" w:hAnsi="Consolas"/>
+          <w:sz w:val="18"/>
+        </w:rPr>
+        <w:lastRenderedPageBreak/>
         <w:t xml:space="preserve">    @PublisherId INT,</w:t>
       </w:r>
       <w:r>
@@ -7473,13 +7500,6 @@
           <w:sz w:val="18"/>
         </w:rPr>
         <w:br/>
-      </w:r>
-      <w:r>
-        <w:rPr>
-          <w:rFonts w:ascii="Consolas" w:hAnsi="Consolas"/>
-          <w:sz w:val="18"/>
-        </w:rPr>
-        <w:lastRenderedPageBreak/>
         <w:t>AS</w:t>
       </w:r>
       <w:r>
@@ -7744,8 +7764,10 @@
       </w:pPr>
       <w:r>
         <w:rPr>
+          <w:noProof/>
           <w:lang w:val="vi-VN"/>
         </w:rPr>
+        <w:lastRenderedPageBreak/>
         <w:drawing>
           <wp:inline distT="0" distB="0" distL="0" distR="0" wp14:anchorId="16377344" wp14:editId="08A5AA6D">
             <wp:extent cx="5486400" cy="2841625"/>
@@ -7785,10 +7807,9 @@
     </w:p>
     <w:p>
       <w:pPr>
-        <w:pStyle w:val="Heading2"/>
+        <w:pStyle w:val="u2"/>
       </w:pPr>
       <w:r>
-        <w:lastRenderedPageBreak/>
         <w:t>11.3. sp_UpdateGameSales</w:t>
       </w:r>
     </w:p>
@@ -8026,6 +8047,13 @@
           <w:sz w:val="18"/>
         </w:rPr>
         <w:br/>
+      </w:r>
+      <w:r>
+        <w:rPr>
+          <w:rFonts w:ascii="Consolas" w:hAnsi="Consolas"/>
+          <w:sz w:val="18"/>
+        </w:rPr>
+        <w:lastRenderedPageBreak/>
         <w:t xml:space="preserve">    END</w:t>
       </w:r>
       <w:r>
@@ -8047,9 +8075,9 @@
       </w:pPr>
       <w:r>
         <w:rPr>
+          <w:noProof/>
           <w:lang w:val="vi-VN"/>
         </w:rPr>
-        <w:lastRenderedPageBreak/>
         <w:drawing>
           <wp:inline distT="0" distB="0" distL="0" distR="0" wp14:anchorId="0C098352" wp14:editId="0771EB8E">
             <wp:extent cx="5486400" cy="2848610"/>
@@ -8089,7 +8117,7 @@
     </w:p>
     <w:p>
       <w:pPr>
-        <w:pStyle w:val="Heading2"/>
+        <w:pStyle w:val="u2"/>
       </w:pPr>
       <w:r>
         <w:t>11.4. sp_DeleteGame</w:t>
@@ -8310,6 +8338,7 @@
           <w:rFonts w:ascii="Consolas" w:hAnsi="Consolas"/>
           <w:sz w:val="18"/>
         </w:rPr>
+        <w:lastRenderedPageBreak/>
         <w:br/>
         <w:t xml:space="preserve">        DELETE FROM game_publisher WHERE game_id = @GameId;</w:t>
       </w:r>
@@ -8333,7 +8362,6 @@
           <w:rFonts w:ascii="Consolas" w:hAnsi="Consolas"/>
           <w:sz w:val="18"/>
         </w:rPr>
-        <w:lastRenderedPageBreak/>
         <w:br/>
         <w:t xml:space="preserve">        COMMIT TRANSACTION;</w:t>
       </w:r>
@@ -8396,6 +8424,7 @@
       </w:pPr>
       <w:r>
         <w:rPr>
+          <w:noProof/>
           <w:lang w:val="vi-VN"/>
         </w:rPr>
         <w:drawing>
@@ -8437,7 +8466,7 @@
     </w:p>
     <w:p>
       <w:pPr>
-        <w:pStyle w:val="Heading2"/>
+        <w:pStyle w:val="u2"/>
       </w:pPr>
       <w:r>
         <w:t>11.5. sp_SearchGames</w:t>
@@ -8598,6 +8627,13 @@
           <w:sz w:val="18"/>
         </w:rPr>
         <w:br/>
+      </w:r>
+      <w:r>
+        <w:rPr>
+          <w:rFonts w:ascii="Consolas" w:hAnsi="Consolas"/>
+          <w:sz w:val="18"/>
+        </w:rPr>
+        <w:lastRenderedPageBreak/>
         <w:t xml:space="preserve">    FROM game g</w:t>
       </w:r>
       <w:r>
@@ -8622,13 +8658,6 @@
           <w:sz w:val="18"/>
         </w:rPr>
         <w:br/>
-      </w:r>
-      <w:r>
-        <w:rPr>
-          <w:rFonts w:ascii="Consolas" w:hAnsi="Consolas"/>
-          <w:sz w:val="18"/>
-        </w:rPr>
-        <w:lastRenderedPageBreak/>
         <w:t xml:space="preserve">    LEFT JOIN publisher p ON p.id = gp.publisher_id</w:t>
       </w:r>
       <w:r>
@@ -8722,6 +8751,7 @@
       </w:pPr>
       <w:r>
         <w:rPr>
+          <w:noProof/>
           <w:lang w:val="vi-VN"/>
         </w:rPr>
         <w:drawing>
@@ -8763,7 +8793,7 @@
     </w:p>
     <w:p>
       <w:pPr>
-        <w:pStyle w:val="Heading2"/>
+        <w:pStyle w:val="u2"/>
       </w:pPr>
       <w:r>
         <w:t>11.6. fn_GetTotalSalesByGame</w:t>
@@ -8883,6 +8913,13 @@
           <w:sz w:val="18"/>
         </w:rPr>
         <w:br/>
+      </w:r>
+      <w:r>
+        <w:rPr>
+          <w:rFonts w:ascii="Consolas" w:hAnsi="Consolas"/>
+          <w:sz w:val="18"/>
+        </w:rPr>
+        <w:lastRenderedPageBreak/>
         <w:t xml:space="preserve">    RETURN @Total;</w:t>
       </w:r>
       <w:r>
@@ -8903,7 +8940,9 @@
         </w:rPr>
       </w:pPr>
       <w:r>
-        <w:lastRenderedPageBreak/>
+        <w:rPr>
+          <w:noProof/>
+        </w:rPr>
         <w:drawing>
           <wp:inline distT="0" distB="0" distL="0" distR="0" wp14:anchorId="0FEF343B" wp14:editId="09F9EBAE">
             <wp:extent cx="5486400" cy="2482215"/>
@@ -8947,6 +8986,9 @@
         <w:spacing w:before="80" w:after="80"/>
       </w:pPr>
       <w:r>
+        <w:rPr>
+          <w:noProof/>
+        </w:rPr>
         <w:drawing>
           <wp:inline distT="0" distB="0" distL="0" distR="0" wp14:anchorId="0752275A" wp14:editId="75BC6116">
             <wp:extent cx="2981741" cy="1695687"/>
@@ -8989,7 +9031,7 @@
     </w:p>
     <w:p>
       <w:pPr>
-        <w:pStyle w:val="Heading1"/>
+        <w:pStyle w:val="u1"/>
       </w:pPr>
       <w:r>
         <w:lastRenderedPageBreak/>
@@ -9003,7 +9045,7 @@
     </w:p>
     <w:p>
       <w:pPr>
-        <w:pStyle w:val="Heading2"/>
+        <w:pStyle w:val="u2"/>
       </w:pPr>
       <w:r>
         <w:t>12.1. Gợi ý game tương tự (content-based recommendation)</w:t>
@@ -9038,7 +9080,7 @@
     </w:p>
     <w:p>
       <w:pPr>
-        <w:pStyle w:val="Heading2"/>
+        <w:pStyle w:val="u2"/>
       </w:pPr>
       <w:r>
         <w:t>12.2. NL2SQL Agent - hỏi đáp dữ liệu bằng ngôn ngữ tự nhiên</w:t>
@@ -9055,7 +9097,7 @@
     </w:p>
     <w:p>
       <w:pPr>
-        <w:pStyle w:val="Heading1"/>
+        <w:pStyle w:val="u1"/>
       </w:pPr>
       <w:r>
         <w:t>13. Kết luận, hướng phát triển</w:t>
@@ -9063,7 +9105,7 @@
     </w:p>
     <w:p>
       <w:pPr>
-        <w:pStyle w:val="Heading2"/>
+        <w:pStyle w:val="u2"/>
       </w:pPr>
       <w:r>
         <w:t>Kết luận</w:t>
@@ -9080,7 +9122,7 @@
     </w:p>
     <w:p>
       <w:pPr>
-        <w:pStyle w:val="Heading2"/>
+        <w:pStyle w:val="u2"/>
       </w:pPr>
       <w:r>
         <w:t>Hạn chế</w:t>
@@ -9088,7 +9130,7 @@
     </w:p>
     <w:p>
       <w:pPr>
-        <w:pStyle w:val="ListBullet"/>
+        <w:pStyle w:val="Duudong"/>
       </w:pPr>
       <w:r>
         <w:t>Dữ liệu doanh số hiện là dữ liệu tĩnh (dataset Video Game Sales), chưa cập nhật theo thời gian thực.</w:t>
@@ -9096,7 +9138,7 @@
     </w:p>
     <w:p>
       <w:pPr>
-        <w:pStyle w:val="ListBullet"/>
+        <w:pStyle w:val="Duudong"/>
       </w:pPr>
       <w:r>
         <w:t>Chưa có cơ chế phân quyền người dùng (role-based access) đầy đủ cho web demo.</w:t>
@@ -9104,7 +9146,7 @@
     </w:p>
     <w:p>
       <w:pPr>
-        <w:pStyle w:val="Heading2"/>
+        <w:pStyle w:val="u2"/>
       </w:pPr>
       <w:r>
         <w:t>Hướng phát triển</w:t>
@@ -9112,7 +9154,7 @@
     </w:p>
     <w:p>
       <w:pPr>
-        <w:pStyle w:val="ListBullet"/>
+        <w:pStyle w:val="Duudong"/>
       </w:pPr>
       <w:r>
         <w:t>Bổ sung bảng đánh giá/review game (rating, review) để làm giàu dữ liệu cho AI.</w:t>
@@ -9120,7 +9162,7 @@
     </w:p>
     <w:p>
       <w:pPr>
-        <w:pStyle w:val="ListBullet"/>
+        <w:pStyle w:val="Duudong"/>
       </w:pPr>
       <w:r>
         <w:t>Mở rộng recommend.py sang collaborative filtering dựa trên doanh số vùng.</w:t>
@@ -9128,7 +9170,7 @@
     </w:p>
     <w:p>
       <w:pPr>
-        <w:pStyle w:val="ListBullet"/>
+        <w:pStyle w:val="Duudong"/>
       </w:pPr>
       <w:r>
         <w:t>Hoàn thiện NL2SQL Agent theo kiến trúc ở Mục 12.2, triển khai giám sát production (monitoring, guardrail) như mô tả trong ai/NL2SQL_ARCHITECTURE.md.</w:t>
@@ -9136,7 +9178,7 @@
     </w:p>
     <w:p>
       <w:pPr>
-        <w:pStyle w:val="Heading1"/>
+        <w:pStyle w:val="u1"/>
       </w:pPr>
       <w:r>
         <w:lastRenderedPageBreak/>
@@ -9154,7 +9196,7 @@
     </w:p>
     <w:tbl>
       <w:tblPr>
-        <w:tblStyle w:val="LightGrid-Accent1"/>
+        <w:tblStyle w:val="LiMausang-Nhnmanh1"/>
         <w:tblW w:w="0" w:type="auto"/>
         <w:jc w:val="center"/>
         <w:tblLook w:val="04A0" w:firstRow="1" w:lastRow="0" w:firstColumn="1" w:lastColumn="0" w:noHBand="0" w:noVBand="1"/>
@@ -9470,7 +9512,7 @@
 </file>
 
 <file path=word/numbering.xml><?xml version="1.0" encoding="utf-8"?>
-<w:numbering xmlns:wpc="http://schemas.microsoft.com/office/word/2010/wordprocessingCanvas" xmlns:cx="http://schemas.microsoft.com/office/drawing/2014/chartex" xmlns:cx1="http://schemas.microsoft.com/office/drawing/2015/9/8/chartex" xmlns:cx2="http://schemas.microsoft.com/office/drawing/2015/10/21/chartex" xmlns:cx3="http://schemas.microsoft.com/office/drawing/2016/5/9/chartex" xmlns:cx4="http://schemas.microsoft.com/office/drawing/2016/5/10/chartex" xmlns:cx5="http://schemas.microsoft.com/office/drawing/2016/5/11/chartex" xmlns:cx6="http://schemas.microsoft.com/office/drawing/2016/5/12/chartex" xmlns:cx7="http://schemas.microsoft.com/office/drawing/2016/5/13/chartex" xmlns:cx8="http://schemas.microsoft.com/office/drawing/2016/5/14/chartex" xmlns:mc="http://schemas.openxmlformats.org/markup-compatibility/2006" xmlns:aink="http://schemas.microsoft.com/office/drawing/2016/ink" xmlns:am3d="http://schemas.microsoft.com/office/drawing/2017/model3d" xmlns:o="urn:schemas-microsoft-com:office:office" xmlns:oel="http://schemas.microsoft.com/office/2019/extlst" xmlns:r="http://schemas.openxmlformats.org/officeDocument/2006/relationships" xmlns:m="http://schemas.openxmlformats.org/officeDocument/2006/math" xmlns:v="urn:schemas-microsoft-com:vml" xmlns:wp14="http://schemas.microsoft.com/office/word/2010/wordprocessingDrawing" xmlns:wp="http://schemas.openxmlformats.org/drawingml/2006/wordprocessingDrawing" xmlns:w10="urn:schemas-microsoft-com:office:word" xmlns:w="http://schemas.openxmlformats.org/wordprocessingml/2006/main" xmlns:w14="http://schemas.microsoft.com/office/word/2010/wordml" xmlns:w15="http://schemas.microsoft.com/office/word/2012/wordml" xmlns:w16cei="http://schemas.microsoft.com/office/word/2026/wordml/cei" xmlns:w16cex="http://schemas.microsoft.com/office/word/2018/wordml/cex" xmlns:w16cid="http://schemas.microsoft.com/office/word/2016/wordml/cid" xmlns:w16="http://schemas.microsoft.com/office/word/2018/wordml" xmlns:w16du="http://schemas.microsoft.com/office/word/2023/wordml/word16du" xmlns:w16sdtdh="http://schemas.microsoft.com/office/word/2020/wordml/sdtdatahash" xmlns:w16sdtfl="http://schemas.microsoft.com/office/word/2024/wordml/sdtformatlock" xmlns:w16se="http://schemas.microsoft.com/office/word/2015/wordml/symex" xmlns:wpg="http://schemas.microsoft.com/office/word/2010/wordprocessingGroup" xmlns:wpi="http://schemas.microsoft.com/office/word/2010/wordprocessingInk" xmlns:wne="http://schemas.microsoft.com/office/word/2006/wordml" xmlns:wps="http://schemas.microsoft.com/office/word/2010/wordprocessingShape" mc:Ignorable="w14 w15 w16se w16cid w16 w16cex w16sdtdh w16sdtfl w16du wp14">
+<w:numbering xmlns:wpc="http://schemas.microsoft.com/office/word/2010/wordprocessingCanvas" xmlns:cx="http://schemas.microsoft.com/office/drawing/2014/chartex" xmlns:cx1="http://schemas.microsoft.com/office/drawing/2015/9/8/chartex" xmlns:cx2="http://schemas.microsoft.com/office/drawing/2015/10/21/chartex" xmlns:cx3="http://schemas.microsoft.com/office/drawing/2016/5/9/chartex" xmlns:cx4="http://schemas.microsoft.com/office/drawing/2016/5/10/chartex" xmlns:cx5="http://schemas.microsoft.com/office/drawing/2016/5/11/chartex" xmlns:cx6="http://schemas.microsoft.com/office/drawing/2016/5/12/chartex" xmlns:cx7="http://schemas.microsoft.com/office/drawing/2016/5/13/chartex" xmlns:cx8="http://schemas.microsoft.com/office/drawing/2016/5/14/chartex" xmlns:mc="http://schemas.openxmlformats.org/markup-compatibility/2006" xmlns:aink="http://schemas.microsoft.com/office/drawing/2016/ink" xmlns:am3d="http://schemas.microsoft.com/office/drawing/2017/model3d" xmlns:o="urn:schemas-microsoft-com:office:office" xmlns:oel="http://schemas.microsoft.com/office/2019/extlst" xmlns:r="http://schemas.openxmlformats.org/officeDocument/2006/relationships" xmlns:m="http://schemas.openxmlformats.org/officeDocument/2006/math" xmlns:v="urn:schemas-microsoft-com:vml" xmlns:wp14="http://schemas.microsoft.com/office/word/2010/wordprocessingDrawing" xmlns:wp="http://schemas.openxmlformats.org/drawingml/2006/wordprocessingDrawing" xmlns:w10="urn:schemas-microsoft-com:office:word" xmlns:w="http://schemas.openxmlformats.org/wordprocessingml/2006/main" xmlns:w14="http://schemas.microsoft.com/office/word/2010/wordml" xmlns:w15="http://schemas.microsoft.com/office/word/2012/wordml" xmlns:w16cex="http://schemas.microsoft.com/office/word/2018/wordml/cex" xmlns:w16cid="http://schemas.microsoft.com/office/word/2016/wordml/cid" xmlns:w16="http://schemas.microsoft.com/office/word/2018/wordml" xmlns:w16du="http://schemas.microsoft.com/office/word/2023/wordml/word16du" xmlns:w16sdtdh="http://schemas.microsoft.com/office/word/2020/wordml/sdtdatahash" xmlns:w16sdtfl="http://schemas.microsoft.com/office/word/2024/wordml/sdtformatlock" xmlns:w16se="http://schemas.microsoft.com/office/word/2015/wordml/symex" xmlns:wpg="http://schemas.microsoft.com/office/word/2010/wordprocessingGroup" xmlns:wpi="http://schemas.microsoft.com/office/word/2010/wordprocessingInk" xmlns:wne="http://schemas.microsoft.com/office/word/2006/wordml" xmlns:wps="http://schemas.microsoft.com/office/word/2010/wordprocessingShape" mc:Ignorable="w14 w15 w16se w16cid w16 w16cex w16sdtdh w16sdtfl w16du wp14">
   <w:abstractNum w:abstractNumId="0" w15:restartNumberingAfterBreak="0">
     <w:nsid w:val="FFFFFF7C"/>
     <w:multiLevelType w:val="singleLevel"/>
@@ -9512,7 +9554,7 @@
     <w:lvl w:ilvl="0">
       <w:start w:val="1"/>
       <w:numFmt w:val="decimal"/>
-      <w:pStyle w:val="ListNumber3"/>
+      <w:pStyle w:val="Sudong3"/>
       <w:lvlText w:val="%1."/>
       <w:lvlJc w:val="left"/>
       <w:pPr>
@@ -9530,7 +9572,7 @@
     <w:lvl w:ilvl="0">
       <w:start w:val="1"/>
       <w:numFmt w:val="decimal"/>
-      <w:pStyle w:val="ListNumber2"/>
+      <w:pStyle w:val="Sudong2"/>
       <w:lvlText w:val="%1."/>
       <w:lvlJc w:val="left"/>
       <w:pPr>
@@ -9568,7 +9610,7 @@
     <w:lvl w:ilvl="0">
       <w:start w:val="1"/>
       <w:numFmt w:val="bullet"/>
-      <w:pStyle w:val="ListBullet3"/>
+      <w:pStyle w:val="Duudong3"/>
       <w:lvlText w:val=""/>
       <w:lvlJc w:val="left"/>
       <w:pPr>
@@ -9589,7 +9631,7 @@
     <w:lvl w:ilvl="0">
       <w:start w:val="1"/>
       <w:numFmt w:val="bullet"/>
-      <w:pStyle w:val="ListBullet2"/>
+      <w:pStyle w:val="Duudong2"/>
       <w:lvlText w:val=""/>
       <w:lvlJc w:val="left"/>
       <w:pPr>
@@ -9610,7 +9652,7 @@
     <w:lvl w:ilvl="0">
       <w:start w:val="1"/>
       <w:numFmt w:val="decimal"/>
-      <w:pStyle w:val="ListNumber"/>
+      <w:pStyle w:val="Sudong"/>
       <w:lvlText w:val="%1."/>
       <w:lvlJc w:val="left"/>
       <w:pPr>
@@ -9628,7 +9670,7 @@
     <w:lvl w:ilvl="0">
       <w:start w:val="1"/>
       <w:numFmt w:val="bullet"/>
-      <w:pStyle w:val="ListBullet"/>
+      <w:pStyle w:val="Duudong"/>
       <w:lvlText w:val=""/>
       <w:lvlJc w:val="left"/>
       <w:pPr>
@@ -10058,7 +10100,7 @@
     <w:lsdException w:name="Unresolved Mention" w:semiHidden="1" w:unhideWhenUsed="1"/>
     <w:lsdException w:name="Smart Link" w:semiHidden="1" w:unhideWhenUsed="1"/>
   </w:latentStyles>
-  <w:style w:type="paragraph" w:default="1" w:styleId="Normal">
+  <w:style w:type="paragraph" w:default="1" w:styleId="Binhthng">
     <w:name w:val="Normal"/>
     <w:qFormat/>
     <w:rsid w:val="00FC693F"/>
@@ -10067,11 +10109,11 @@
       <w:sz w:val="26"/>
     </w:rPr>
   </w:style>
-  <w:style w:type="paragraph" w:styleId="Heading1">
+  <w:style w:type="paragraph" w:styleId="u1">
     <w:name w:val="heading 1"/>
-    <w:basedOn w:val="Normal"/>
-    <w:next w:val="Normal"/>
-    <w:link w:val="Heading1Char"/>
+    <w:basedOn w:val="Binhthng"/>
+    <w:next w:val="Binhthng"/>
+    <w:link w:val="u1Char"/>
     <w:uiPriority w:val="9"/>
     <w:qFormat/>
     <w:rsid w:val="00FC693F"/>
@@ -10090,11 +10132,11 @@
       <w:szCs w:val="28"/>
     </w:rPr>
   </w:style>
-  <w:style w:type="paragraph" w:styleId="Heading2">
+  <w:style w:type="paragraph" w:styleId="u2">
     <w:name w:val="heading 2"/>
-    <w:basedOn w:val="Normal"/>
-    <w:next w:val="Normal"/>
-    <w:link w:val="Heading2Char"/>
+    <w:basedOn w:val="Binhthng"/>
+    <w:next w:val="Binhthng"/>
+    <w:link w:val="u2Char"/>
     <w:uiPriority w:val="9"/>
     <w:unhideWhenUsed/>
     <w:qFormat/>
@@ -10114,11 +10156,11 @@
       <w:szCs w:val="26"/>
     </w:rPr>
   </w:style>
-  <w:style w:type="paragraph" w:styleId="Heading3">
+  <w:style w:type="paragraph" w:styleId="u3">
     <w:name w:val="heading 3"/>
-    <w:basedOn w:val="Normal"/>
-    <w:next w:val="Normal"/>
-    <w:link w:val="Heading3Char"/>
+    <w:basedOn w:val="Binhthng"/>
+    <w:next w:val="Binhthng"/>
+    <w:link w:val="u3Char"/>
     <w:uiPriority w:val="9"/>
     <w:unhideWhenUsed/>
     <w:qFormat/>
@@ -10136,11 +10178,11 @@
       <w:color w:val="000000"/>
     </w:rPr>
   </w:style>
-  <w:style w:type="paragraph" w:styleId="Heading4">
+  <w:style w:type="paragraph" w:styleId="u4">
     <w:name w:val="heading 4"/>
-    <w:basedOn w:val="Normal"/>
-    <w:next w:val="Normal"/>
-    <w:link w:val="Heading4Char"/>
+    <w:basedOn w:val="Binhthng"/>
+    <w:next w:val="Binhthng"/>
+    <w:link w:val="u4Char"/>
     <w:uiPriority w:val="9"/>
     <w:semiHidden/>
     <w:unhideWhenUsed/>
@@ -10161,11 +10203,11 @@
       <w:color w:val="4F81BD" w:themeColor="accent1"/>
     </w:rPr>
   </w:style>
-  <w:style w:type="paragraph" w:styleId="Heading5">
+  <w:style w:type="paragraph" w:styleId="u5">
     <w:name w:val="heading 5"/>
-    <w:basedOn w:val="Normal"/>
-    <w:next w:val="Normal"/>
-    <w:link w:val="Heading5Char"/>
+    <w:basedOn w:val="Binhthng"/>
+    <w:next w:val="Binhthng"/>
+    <w:link w:val="u5Char"/>
     <w:uiPriority w:val="9"/>
     <w:semiHidden/>
     <w:unhideWhenUsed/>
@@ -10182,11 +10224,11 @@
       <w:color w:val="243F60" w:themeColor="accent1" w:themeShade="7F"/>
     </w:rPr>
   </w:style>
-  <w:style w:type="paragraph" w:styleId="Heading6">
+  <w:style w:type="paragraph" w:styleId="u6">
     <w:name w:val="heading 6"/>
-    <w:basedOn w:val="Normal"/>
-    <w:next w:val="Normal"/>
-    <w:link w:val="Heading6Char"/>
+    <w:basedOn w:val="Binhthng"/>
+    <w:next w:val="Binhthng"/>
+    <w:link w:val="u6Char"/>
     <w:uiPriority w:val="9"/>
     <w:semiHidden/>
     <w:unhideWhenUsed/>
@@ -10205,11 +10247,11 @@
       <w:color w:val="243F60" w:themeColor="accent1" w:themeShade="7F"/>
     </w:rPr>
   </w:style>
-  <w:style w:type="paragraph" w:styleId="Heading7">
+  <w:style w:type="paragraph" w:styleId="u7">
     <w:name w:val="heading 7"/>
-    <w:basedOn w:val="Normal"/>
-    <w:next w:val="Normal"/>
-    <w:link w:val="Heading7Char"/>
+    <w:basedOn w:val="Binhthng"/>
+    <w:next w:val="Binhthng"/>
+    <w:link w:val="u7Char"/>
     <w:uiPriority w:val="9"/>
     <w:semiHidden/>
     <w:unhideWhenUsed/>
@@ -10228,11 +10270,11 @@
       <w:color w:val="404040" w:themeColor="text1" w:themeTint="BF"/>
     </w:rPr>
   </w:style>
-  <w:style w:type="paragraph" w:styleId="Heading8">
+  <w:style w:type="paragraph" w:styleId="u8">
     <w:name w:val="heading 8"/>
-    <w:basedOn w:val="Normal"/>
-    <w:next w:val="Normal"/>
-    <w:link w:val="Heading8Char"/>
+    <w:basedOn w:val="Binhthng"/>
+    <w:next w:val="Binhthng"/>
+    <w:link w:val="u8Char"/>
     <w:uiPriority w:val="9"/>
     <w:semiHidden/>
     <w:unhideWhenUsed/>
@@ -10251,11 +10293,11 @@
       <w:szCs w:val="20"/>
     </w:rPr>
   </w:style>
-  <w:style w:type="paragraph" w:styleId="Heading9">
+  <w:style w:type="paragraph" w:styleId="u9">
     <w:name w:val="heading 9"/>
-    <w:basedOn w:val="Normal"/>
-    <w:next w:val="Normal"/>
-    <w:link w:val="Heading9Char"/>
+    <w:basedOn w:val="Binhthng"/>
+    <w:next w:val="Binhthng"/>
+    <w:link w:val="u9Char"/>
     <w:uiPriority w:val="9"/>
     <w:semiHidden/>
     <w:unhideWhenUsed/>
@@ -10276,13 +10318,13 @@
       <w:szCs w:val="20"/>
     </w:rPr>
   </w:style>
-  <w:style w:type="character" w:default="1" w:styleId="DefaultParagraphFont">
+  <w:style w:type="character" w:default="1" w:styleId="Phngmcinhcuaoanvn">
     <w:name w:val="Default Paragraph Font"/>
     <w:uiPriority w:val="1"/>
     <w:semiHidden/>
     <w:unhideWhenUsed/>
   </w:style>
-  <w:style w:type="table" w:default="1" w:styleId="TableNormal">
+  <w:style w:type="table" w:default="1" w:styleId="BangThngthng">
     <w:name w:val="Normal Table"/>
     <w:uiPriority w:val="99"/>
     <w:semiHidden/>
@@ -10297,16 +10339,16 @@
       </w:tblCellMar>
     </w:tblPr>
   </w:style>
-  <w:style w:type="numbering" w:default="1" w:styleId="NoList">
+  <w:style w:type="numbering" w:default="1" w:styleId="Khngco">
     <w:name w:val="No List"/>
     <w:uiPriority w:val="99"/>
     <w:semiHidden/>
     <w:unhideWhenUsed/>
   </w:style>
-  <w:style w:type="paragraph" w:styleId="Header">
+  <w:style w:type="paragraph" w:styleId="utrang">
     <w:name w:val="header"/>
-    <w:basedOn w:val="Normal"/>
-    <w:link w:val="HeaderChar"/>
+    <w:basedOn w:val="Binhthng"/>
+    <w:link w:val="utrangChar"/>
     <w:uiPriority w:val="99"/>
     <w:unhideWhenUsed/>
     <w:rsid w:val="00E618BF"/>
@@ -10318,17 +10360,17 @@
       <w:spacing w:after="0" w:line="240" w:lineRule="auto"/>
     </w:pPr>
   </w:style>
-  <w:style w:type="character" w:customStyle="1" w:styleId="HeaderChar">
-    <w:name w:val="Header Char"/>
-    <w:basedOn w:val="DefaultParagraphFont"/>
-    <w:link w:val="Header"/>
+  <w:style w:type="character" w:customStyle="1" w:styleId="utrangChar">
+    <w:name w:val="Đầu trang Char"/>
+    <w:basedOn w:val="Phngmcinhcuaoanvn"/>
+    <w:link w:val="utrang"/>
     <w:uiPriority w:val="99"/>
     <w:rsid w:val="00E618BF"/>
   </w:style>
-  <w:style w:type="paragraph" w:styleId="Footer">
+  <w:style w:type="paragraph" w:styleId="Chntrang">
     <w:name w:val="footer"/>
-    <w:basedOn w:val="Normal"/>
-    <w:link w:val="FooterChar"/>
+    <w:basedOn w:val="Binhthng"/>
+    <w:link w:val="ChntrangChar"/>
     <w:uiPriority w:val="99"/>
     <w:unhideWhenUsed/>
     <w:rsid w:val="00E618BF"/>
@@ -10340,14 +10382,14 @@
       <w:spacing w:after="0" w:line="240" w:lineRule="auto"/>
     </w:pPr>
   </w:style>
-  <w:style w:type="character" w:customStyle="1" w:styleId="FooterChar">
-    <w:name w:val="Footer Char"/>
-    <w:basedOn w:val="DefaultParagraphFont"/>
-    <w:link w:val="Footer"/>
+  <w:style w:type="character" w:customStyle="1" w:styleId="ChntrangChar">
+    <w:name w:val="Chân trang Char"/>
+    <w:basedOn w:val="Phngmcinhcuaoanvn"/>
+    <w:link w:val="Chntrang"/>
     <w:uiPriority w:val="99"/>
     <w:rsid w:val="00E618BF"/>
   </w:style>
-  <w:style w:type="paragraph" w:styleId="NoSpacing">
+  <w:style w:type="paragraph" w:styleId="KhngDncch">
     <w:name w:val="No Spacing"/>
     <w:uiPriority w:val="1"/>
     <w:qFormat/>
@@ -10356,10 +10398,10 @@
       <w:spacing w:after="0" w:line="240" w:lineRule="auto"/>
     </w:pPr>
   </w:style>
-  <w:style w:type="character" w:customStyle="1" w:styleId="Heading1Char">
-    <w:name w:val="Heading 1 Char"/>
-    <w:basedOn w:val="DefaultParagraphFont"/>
-    <w:link w:val="Heading1"/>
+  <w:style w:type="character" w:customStyle="1" w:styleId="u1Char">
+    <w:name w:val="Đầu đề 1 Char"/>
+    <w:basedOn w:val="Phngmcinhcuaoanvn"/>
+    <w:link w:val="u1"/>
     <w:uiPriority w:val="9"/>
     <w:rsid w:val="00FC693F"/>
     <w:rPr>
@@ -10371,10 +10413,10 @@
       <w:szCs w:val="28"/>
     </w:rPr>
   </w:style>
-  <w:style w:type="character" w:customStyle="1" w:styleId="Heading2Char">
-    <w:name w:val="Heading 2 Char"/>
-    <w:basedOn w:val="DefaultParagraphFont"/>
-    <w:link w:val="Heading2"/>
+  <w:style w:type="character" w:customStyle="1" w:styleId="u2Char">
+    <w:name w:val="Đầu đề 2 Char"/>
+    <w:basedOn w:val="Phngmcinhcuaoanvn"/>
+    <w:link w:val="u2"/>
     <w:uiPriority w:val="9"/>
     <w:rsid w:val="00FC693F"/>
     <w:rPr>
@@ -10386,10 +10428,10 @@
       <w:szCs w:val="26"/>
     </w:rPr>
   </w:style>
-  <w:style w:type="character" w:customStyle="1" w:styleId="Heading3Char">
-    <w:name w:val="Heading 3 Char"/>
-    <w:basedOn w:val="DefaultParagraphFont"/>
-    <w:link w:val="Heading3"/>
+  <w:style w:type="character" w:customStyle="1" w:styleId="u3Char">
+    <w:name w:val="Đầu đề 3 Char"/>
+    <w:basedOn w:val="Phngmcinhcuaoanvn"/>
+    <w:link w:val="u3"/>
     <w:uiPriority w:val="9"/>
     <w:rsid w:val="00FC693F"/>
     <w:rPr>
@@ -10399,11 +10441,11 @@
       <w:color w:val="4F81BD" w:themeColor="accent1"/>
     </w:rPr>
   </w:style>
-  <w:style w:type="paragraph" w:styleId="Title">
+  <w:style w:type="paragraph" w:styleId="Tiu">
     <w:name w:val="Title"/>
-    <w:basedOn w:val="Normal"/>
-    <w:next w:val="Normal"/>
-    <w:link w:val="TitleChar"/>
+    <w:basedOn w:val="Binhthng"/>
+    <w:next w:val="Binhthng"/>
+    <w:link w:val="TiuChar"/>
     <w:uiPriority w:val="10"/>
     <w:qFormat/>
     <w:rsid w:val="00FC693F"/>
@@ -10423,10 +10465,10 @@
       <w:szCs w:val="52"/>
     </w:rPr>
   </w:style>
-  <w:style w:type="character" w:customStyle="1" w:styleId="TitleChar">
-    <w:name w:val="Title Char"/>
-    <w:basedOn w:val="DefaultParagraphFont"/>
-    <w:link w:val="Title"/>
+  <w:style w:type="character" w:customStyle="1" w:styleId="TiuChar">
+    <w:name w:val="Tiêu đề Char"/>
+    <w:basedOn w:val="Phngmcinhcuaoanvn"/>
+    <w:link w:val="Tiu"/>
     <w:uiPriority w:val="10"/>
     <w:rsid w:val="00FC693F"/>
     <w:rPr>
@@ -10438,11 +10480,11 @@
       <w:szCs w:val="52"/>
     </w:rPr>
   </w:style>
-  <w:style w:type="paragraph" w:styleId="Subtitle">
+  <w:style w:type="paragraph" w:styleId="Tiuphu">
     <w:name w:val="Subtitle"/>
-    <w:basedOn w:val="Normal"/>
-    <w:next w:val="Normal"/>
-    <w:link w:val="SubtitleChar"/>
+    <w:basedOn w:val="Binhthng"/>
+    <w:next w:val="Binhthng"/>
+    <w:link w:val="TiuphuChar"/>
     <w:uiPriority w:val="11"/>
     <w:qFormat/>
     <w:rsid w:val="00FC693F"/>
@@ -10461,10 +10503,10 @@
       <w:szCs w:val="24"/>
     </w:rPr>
   </w:style>
-  <w:style w:type="character" w:customStyle="1" w:styleId="SubtitleChar">
-    <w:name w:val="Subtitle Char"/>
-    <w:basedOn w:val="DefaultParagraphFont"/>
-    <w:link w:val="Subtitle"/>
+  <w:style w:type="character" w:customStyle="1" w:styleId="TiuphuChar">
+    <w:name w:val="Tiêu đề phụ Char"/>
+    <w:basedOn w:val="Phngmcinhcuaoanvn"/>
+    <w:link w:val="Tiuphu"/>
     <w:uiPriority w:val="11"/>
     <w:rsid w:val="00FC693F"/>
     <w:rPr>
@@ -10477,9 +10519,9 @@
       <w:szCs w:val="24"/>
     </w:rPr>
   </w:style>
-  <w:style w:type="paragraph" w:styleId="ListParagraph">
+  <w:style w:type="paragraph" w:styleId="oancuaDanhsach">
     <w:name w:val="List Paragraph"/>
-    <w:basedOn w:val="Normal"/>
+    <w:basedOn w:val="Binhthng"/>
     <w:uiPriority w:val="34"/>
     <w:qFormat/>
     <w:rsid w:val="00FC693F"/>
@@ -10488,10 +10530,10 @@
       <w:contextualSpacing/>
     </w:pPr>
   </w:style>
-  <w:style w:type="paragraph" w:styleId="BodyText">
+  <w:style w:type="paragraph" w:styleId="ThnVnban">
     <w:name w:val="Body Text"/>
-    <w:basedOn w:val="Normal"/>
-    <w:link w:val="BodyTextChar"/>
+    <w:basedOn w:val="Binhthng"/>
+    <w:link w:val="ThnVnbanChar"/>
     <w:uiPriority w:val="99"/>
     <w:unhideWhenUsed/>
     <w:rsid w:val="00AA1D8D"/>
@@ -10499,17 +10541,17 @@
       <w:spacing w:after="120"/>
     </w:pPr>
   </w:style>
-  <w:style w:type="character" w:customStyle="1" w:styleId="BodyTextChar">
-    <w:name w:val="Body Text Char"/>
-    <w:basedOn w:val="DefaultParagraphFont"/>
-    <w:link w:val="BodyText"/>
+  <w:style w:type="character" w:customStyle="1" w:styleId="ThnVnbanChar">
+    <w:name w:val="Thân Văn bản Char"/>
+    <w:basedOn w:val="Phngmcinhcuaoanvn"/>
+    <w:link w:val="ThnVnban"/>
     <w:uiPriority w:val="99"/>
     <w:rsid w:val="00AA1D8D"/>
   </w:style>
-  <w:style w:type="paragraph" w:styleId="BodyText2">
+  <w:style w:type="paragraph" w:styleId="Thnvnban2">
     <w:name w:val="Body Text 2"/>
-    <w:basedOn w:val="Normal"/>
-    <w:link w:val="BodyText2Char"/>
+    <w:basedOn w:val="Binhthng"/>
+    <w:link w:val="Thnvnban2Char"/>
     <w:uiPriority w:val="99"/>
     <w:unhideWhenUsed/>
     <w:rsid w:val="00AA1D8D"/>
@@ -10517,17 +10559,17 @@
       <w:spacing w:after="120" w:line="480" w:lineRule="auto"/>
     </w:pPr>
   </w:style>
-  <w:style w:type="character" w:customStyle="1" w:styleId="BodyText2Char">
-    <w:name w:val="Body Text 2 Char"/>
-    <w:basedOn w:val="DefaultParagraphFont"/>
-    <w:link w:val="BodyText2"/>
+  <w:style w:type="character" w:customStyle="1" w:styleId="Thnvnban2Char">
+    <w:name w:val="Thân văn bản 2 Char"/>
+    <w:basedOn w:val="Phngmcinhcuaoanvn"/>
+    <w:link w:val="Thnvnban2"/>
     <w:uiPriority w:val="99"/>
     <w:rsid w:val="00AA1D8D"/>
   </w:style>
-  <w:style w:type="paragraph" w:styleId="BodyText3">
+  <w:style w:type="paragraph" w:styleId="Thnvnban3">
     <w:name w:val="Body Text 3"/>
-    <w:basedOn w:val="Normal"/>
-    <w:link w:val="BodyText3Char"/>
+    <w:basedOn w:val="Binhthng"/>
+    <w:link w:val="Thnvnban3Char"/>
     <w:uiPriority w:val="99"/>
     <w:unhideWhenUsed/>
     <w:rsid w:val="00AA1D8D"/>
@@ -10539,10 +10581,10 @@
       <w:szCs w:val="16"/>
     </w:rPr>
   </w:style>
-  <w:style w:type="character" w:customStyle="1" w:styleId="BodyText3Char">
-    <w:name w:val="Body Text 3 Char"/>
-    <w:basedOn w:val="DefaultParagraphFont"/>
-    <w:link w:val="BodyText3"/>
+  <w:style w:type="character" w:customStyle="1" w:styleId="Thnvnban3Char">
+    <w:name w:val="Thân văn bản 3 Char"/>
+    <w:basedOn w:val="Phngmcinhcuaoanvn"/>
+    <w:link w:val="Thnvnban3"/>
     <w:uiPriority w:val="99"/>
     <w:rsid w:val="00AA1D8D"/>
     <w:rPr>
@@ -10550,9 +10592,9 @@
       <w:szCs w:val="16"/>
     </w:rPr>
   </w:style>
-  <w:style w:type="paragraph" w:styleId="List">
+  <w:style w:type="paragraph" w:styleId="Danhsach">
     <w:name w:val="List"/>
-    <w:basedOn w:val="Normal"/>
+    <w:basedOn w:val="Binhthng"/>
     <w:uiPriority w:val="99"/>
     <w:unhideWhenUsed/>
     <w:rsid w:val="00AA1D8D"/>
@@ -10561,9 +10603,9 @@
       <w:contextualSpacing/>
     </w:pPr>
   </w:style>
-  <w:style w:type="paragraph" w:styleId="List2">
+  <w:style w:type="paragraph" w:styleId="Danhsach2">
     <w:name w:val="List 2"/>
-    <w:basedOn w:val="Normal"/>
+    <w:basedOn w:val="Binhthng"/>
     <w:uiPriority w:val="99"/>
     <w:unhideWhenUsed/>
     <w:rsid w:val="00326F90"/>
@@ -10572,9 +10614,9 @@
       <w:contextualSpacing/>
     </w:pPr>
   </w:style>
-  <w:style w:type="paragraph" w:styleId="List3">
+  <w:style w:type="paragraph" w:styleId="Danhsach3">
     <w:name w:val="List 3"/>
-    <w:basedOn w:val="Normal"/>
+    <w:basedOn w:val="Binhthng"/>
     <w:uiPriority w:val="99"/>
     <w:unhideWhenUsed/>
     <w:rsid w:val="00326F90"/>
@@ -10583,9 +10625,9 @@
       <w:contextualSpacing/>
     </w:pPr>
   </w:style>
-  <w:style w:type="paragraph" w:styleId="ListBullet">
+  <w:style w:type="paragraph" w:styleId="Duudong">
     <w:name w:val="List Bullet"/>
-    <w:basedOn w:val="Normal"/>
+    <w:basedOn w:val="Binhthng"/>
     <w:uiPriority w:val="99"/>
     <w:unhideWhenUsed/>
     <w:rsid w:val="00326F90"/>
@@ -10596,9 +10638,9 @@
       <w:contextualSpacing/>
     </w:pPr>
   </w:style>
-  <w:style w:type="paragraph" w:styleId="ListBullet2">
+  <w:style w:type="paragraph" w:styleId="Duudong2">
     <w:name w:val="List Bullet 2"/>
-    <w:basedOn w:val="Normal"/>
+    <w:basedOn w:val="Binhthng"/>
     <w:uiPriority w:val="99"/>
     <w:unhideWhenUsed/>
     <w:rsid w:val="00326F90"/>
@@ -10609,9 +10651,9 @@
       <w:contextualSpacing/>
     </w:pPr>
   </w:style>
-  <w:style w:type="paragraph" w:styleId="ListBullet3">
+  <w:style w:type="paragraph" w:styleId="Duudong3">
     <w:name w:val="List Bullet 3"/>
-    <w:basedOn w:val="Normal"/>
+    <w:basedOn w:val="Binhthng"/>
     <w:uiPriority w:val="99"/>
     <w:unhideWhenUsed/>
     <w:rsid w:val="00326F90"/>
@@ -10622,9 +10664,9 @@
       <w:contextualSpacing/>
     </w:pPr>
   </w:style>
-  <w:style w:type="paragraph" w:styleId="ListNumber">
+  <w:style w:type="paragraph" w:styleId="Sudong">
     <w:name w:val="List Number"/>
-    <w:basedOn w:val="Normal"/>
+    <w:basedOn w:val="Binhthng"/>
     <w:uiPriority w:val="99"/>
     <w:unhideWhenUsed/>
     <w:rsid w:val="00326F90"/>
@@ -10635,9 +10677,9 @@
       <w:contextualSpacing/>
     </w:pPr>
   </w:style>
-  <w:style w:type="paragraph" w:styleId="ListNumber2">
+  <w:style w:type="paragraph" w:styleId="Sudong2">
     <w:name w:val="List Number 2"/>
-    <w:basedOn w:val="Normal"/>
+    <w:basedOn w:val="Binhthng"/>
     <w:uiPriority w:val="99"/>
     <w:unhideWhenUsed/>
     <w:rsid w:val="0029639D"/>
@@ -10648,9 +10690,9 @@
       <w:contextualSpacing/>
     </w:pPr>
   </w:style>
-  <w:style w:type="paragraph" w:styleId="ListNumber3">
+  <w:style w:type="paragraph" w:styleId="Sudong3">
     <w:name w:val="List Number 3"/>
-    <w:basedOn w:val="Normal"/>
+    <w:basedOn w:val="Binhthng"/>
     <w:uiPriority w:val="99"/>
     <w:unhideWhenUsed/>
     <w:rsid w:val="0029639D"/>
@@ -10661,9 +10703,9 @@
       <w:contextualSpacing/>
     </w:pPr>
   </w:style>
-  <w:style w:type="paragraph" w:styleId="ListContinue">
+  <w:style w:type="paragraph" w:styleId="Danhsachlintuc">
     <w:name w:val="List Continue"/>
-    <w:basedOn w:val="Normal"/>
+    <w:basedOn w:val="Binhthng"/>
     <w:uiPriority w:val="99"/>
     <w:unhideWhenUsed/>
     <w:rsid w:val="0029639D"/>
@@ -10673,9 +10715,9 @@
       <w:contextualSpacing/>
     </w:pPr>
   </w:style>
-  <w:style w:type="paragraph" w:styleId="ListContinue2">
+  <w:style w:type="paragraph" w:styleId="Danhsachlintuc2">
     <w:name w:val="List Continue 2"/>
-    <w:basedOn w:val="Normal"/>
+    <w:basedOn w:val="Binhthng"/>
     <w:uiPriority w:val="99"/>
     <w:unhideWhenUsed/>
     <w:rsid w:val="0029639D"/>
@@ -10685,9 +10727,9 @@
       <w:contextualSpacing/>
     </w:pPr>
   </w:style>
-  <w:style w:type="paragraph" w:styleId="ListContinue3">
+  <w:style w:type="paragraph" w:styleId="Danhsachlintuc3">
     <w:name w:val="List Continue 3"/>
-    <w:basedOn w:val="Normal"/>
+    <w:basedOn w:val="Binhthng"/>
     <w:uiPriority w:val="99"/>
     <w:unhideWhenUsed/>
     <w:rsid w:val="0029639D"/>
@@ -10697,9 +10739,9 @@
       <w:contextualSpacing/>
     </w:pPr>
   </w:style>
-  <w:style w:type="paragraph" w:styleId="MacroText">
+  <w:style w:type="paragraph" w:styleId="VnbanMacro">
     <w:name w:val="macro"/>
-    <w:link w:val="MacroTextChar"/>
+    <w:link w:val="VnbanMacroChar"/>
     <w:uiPriority w:val="99"/>
     <w:unhideWhenUsed/>
     <w:rsid w:val="0029639D"/>
@@ -10720,10 +10762,10 @@
       <w:szCs w:val="20"/>
     </w:rPr>
   </w:style>
-  <w:style w:type="character" w:customStyle="1" w:styleId="MacroTextChar">
-    <w:name w:val="Macro Text Char"/>
-    <w:basedOn w:val="DefaultParagraphFont"/>
-    <w:link w:val="MacroText"/>
+  <w:style w:type="character" w:customStyle="1" w:styleId="VnbanMacroChar">
+    <w:name w:val="Văn bản Macro Char"/>
+    <w:basedOn w:val="Phngmcinhcuaoanvn"/>
+    <w:link w:val="VnbanMacro"/>
     <w:uiPriority w:val="99"/>
     <w:rsid w:val="0029639D"/>
     <w:rPr>
@@ -10732,11 +10774,11 @@
       <w:szCs w:val="20"/>
     </w:rPr>
   </w:style>
-  <w:style w:type="paragraph" w:styleId="Quote">
+  <w:style w:type="paragraph" w:styleId="Litrichdn">
     <w:name w:val="Quote"/>
-    <w:basedOn w:val="Normal"/>
-    <w:next w:val="Normal"/>
-    <w:link w:val="QuoteChar"/>
+    <w:basedOn w:val="Binhthng"/>
+    <w:next w:val="Binhthng"/>
+    <w:link w:val="LitrichdnChar"/>
     <w:uiPriority w:val="29"/>
     <w:qFormat/>
     <w:rsid w:val="00FC693F"/>
@@ -10746,10 +10788,10 @@
       <w:color w:val="000000" w:themeColor="text1"/>
     </w:rPr>
   </w:style>
-  <w:style w:type="character" w:customStyle="1" w:styleId="QuoteChar">
-    <w:name w:val="Quote Char"/>
-    <w:basedOn w:val="DefaultParagraphFont"/>
-    <w:link w:val="Quote"/>
+  <w:style w:type="character" w:customStyle="1" w:styleId="LitrichdnChar">
+    <w:name w:val="Lời trích dẫn Char"/>
+    <w:basedOn w:val="Phngmcinhcuaoanvn"/>
+    <w:link w:val="Litrichdn"/>
     <w:uiPriority w:val="29"/>
     <w:rsid w:val="00FC693F"/>
     <w:rPr>
@@ -10758,10 +10800,10 @@
       <w:color w:val="000000" w:themeColor="text1"/>
     </w:rPr>
   </w:style>
-  <w:style w:type="character" w:customStyle="1" w:styleId="Heading4Char">
-    <w:name w:val="Heading 4 Char"/>
-    <w:basedOn w:val="DefaultParagraphFont"/>
-    <w:link w:val="Heading4"/>
+  <w:style w:type="character" w:customStyle="1" w:styleId="u4Char">
+    <w:name w:val="Đầu đề 4 Char"/>
+    <w:basedOn w:val="Phngmcinhcuaoanvn"/>
+    <w:link w:val="u4"/>
     <w:uiPriority w:val="9"/>
     <w:semiHidden/>
     <w:rsid w:val="00FC693F"/>
@@ -10774,10 +10816,10 @@
       <w:color w:val="4F81BD" w:themeColor="accent1"/>
     </w:rPr>
   </w:style>
-  <w:style w:type="character" w:customStyle="1" w:styleId="Heading5Char">
-    <w:name w:val="Heading 5 Char"/>
-    <w:basedOn w:val="DefaultParagraphFont"/>
-    <w:link w:val="Heading5"/>
+  <w:style w:type="character" w:customStyle="1" w:styleId="u5Char">
+    <w:name w:val="Đầu đề 5 Char"/>
+    <w:basedOn w:val="Phngmcinhcuaoanvn"/>
+    <w:link w:val="u5"/>
     <w:uiPriority w:val="9"/>
     <w:semiHidden/>
     <w:rsid w:val="00FC693F"/>
@@ -10786,10 +10828,10 @@
       <w:color w:val="243F60" w:themeColor="accent1" w:themeShade="7F"/>
     </w:rPr>
   </w:style>
-  <w:style w:type="character" w:customStyle="1" w:styleId="Heading6Char">
-    <w:name w:val="Heading 6 Char"/>
-    <w:basedOn w:val="DefaultParagraphFont"/>
-    <w:link w:val="Heading6"/>
+  <w:style w:type="character" w:customStyle="1" w:styleId="u6Char">
+    <w:name w:val="Đầu đề 6 Char"/>
+    <w:basedOn w:val="Phngmcinhcuaoanvn"/>
+    <w:link w:val="u6"/>
     <w:uiPriority w:val="9"/>
     <w:semiHidden/>
     <w:rsid w:val="00FC693F"/>
@@ -10800,10 +10842,10 @@
       <w:color w:val="243F60" w:themeColor="accent1" w:themeShade="7F"/>
     </w:rPr>
   </w:style>
-  <w:style w:type="character" w:customStyle="1" w:styleId="Heading7Char">
-    <w:name w:val="Heading 7 Char"/>
-    <w:basedOn w:val="DefaultParagraphFont"/>
-    <w:link w:val="Heading7"/>
+  <w:style w:type="character" w:customStyle="1" w:styleId="u7Char">
+    <w:name w:val="Đầu đề 7 Char"/>
+    <w:basedOn w:val="Phngmcinhcuaoanvn"/>
+    <w:link w:val="u7"/>
     <w:uiPriority w:val="9"/>
     <w:semiHidden/>
     <w:rsid w:val="00FC693F"/>
@@ -10814,10 +10856,10 @@
       <w:color w:val="404040" w:themeColor="text1" w:themeTint="BF"/>
     </w:rPr>
   </w:style>
-  <w:style w:type="character" w:customStyle="1" w:styleId="Heading8Char">
-    <w:name w:val="Heading 8 Char"/>
-    <w:basedOn w:val="DefaultParagraphFont"/>
-    <w:link w:val="Heading8"/>
+  <w:style w:type="character" w:customStyle="1" w:styleId="u8Char">
+    <w:name w:val="Đầu đề 8 Char"/>
+    <w:basedOn w:val="Phngmcinhcuaoanvn"/>
+    <w:link w:val="u8"/>
     <w:uiPriority w:val="9"/>
     <w:semiHidden/>
     <w:rsid w:val="00FC693F"/>
@@ -10828,10 +10870,10 @@
       <w:szCs w:val="20"/>
     </w:rPr>
   </w:style>
-  <w:style w:type="character" w:customStyle="1" w:styleId="Heading9Char">
-    <w:name w:val="Heading 9 Char"/>
-    <w:basedOn w:val="DefaultParagraphFont"/>
-    <w:link w:val="Heading9"/>
+  <w:style w:type="character" w:customStyle="1" w:styleId="u9Char">
+    <w:name w:val="Đầu đề 9 Char"/>
+    <w:basedOn w:val="Phngmcinhcuaoanvn"/>
+    <w:link w:val="u9"/>
     <w:uiPriority w:val="9"/>
     <w:semiHidden/>
     <w:rsid w:val="00FC693F"/>
@@ -10844,10 +10886,10 @@
       <w:szCs w:val="20"/>
     </w:rPr>
   </w:style>
-  <w:style w:type="paragraph" w:styleId="Caption">
+  <w:style w:type="paragraph" w:styleId="Chuthich">
     <w:name w:val="caption"/>
-    <w:basedOn w:val="Normal"/>
-    <w:next w:val="Normal"/>
+    <w:basedOn w:val="Binhthng"/>
+    <w:next w:val="Binhthng"/>
     <w:uiPriority w:val="35"/>
     <w:semiHidden/>
     <w:unhideWhenUsed/>
@@ -10864,9 +10906,9 @@
       <w:szCs w:val="18"/>
     </w:rPr>
   </w:style>
-  <w:style w:type="character" w:styleId="Strong">
+  <w:style w:type="character" w:styleId="Manh">
     <w:name w:val="Strong"/>
-    <w:basedOn w:val="DefaultParagraphFont"/>
+    <w:basedOn w:val="Phngmcinhcuaoanvn"/>
     <w:uiPriority w:val="22"/>
     <w:qFormat/>
     <w:rsid w:val="00FC693F"/>
@@ -10875,9 +10917,9 @@
       <w:bCs/>
     </w:rPr>
   </w:style>
-  <w:style w:type="character" w:styleId="Emphasis">
+  <w:style w:type="character" w:styleId="Nhnmanh">
     <w:name w:val="Emphasis"/>
-    <w:basedOn w:val="DefaultParagraphFont"/>
+    <w:basedOn w:val="Phngmcinhcuaoanvn"/>
     <w:uiPriority w:val="20"/>
     <w:qFormat/>
     <w:rsid w:val="00FC693F"/>
@@ -10886,11 +10928,11 @@
       <w:iCs/>
     </w:rPr>
   </w:style>
-  <w:style w:type="paragraph" w:styleId="IntenseQuote">
+  <w:style w:type="paragraph" w:styleId="Nhaykepm">
     <w:name w:val="Intense Quote"/>
-    <w:basedOn w:val="Normal"/>
-    <w:next w:val="Normal"/>
-    <w:link w:val="IntenseQuoteChar"/>
+    <w:basedOn w:val="Binhthng"/>
+    <w:next w:val="Binhthng"/>
+    <w:link w:val="NhaykepmChar"/>
     <w:uiPriority w:val="30"/>
     <w:qFormat/>
     <w:rsid w:val="00FC693F"/>
@@ -10909,10 +10951,10 @@
       <w:color w:val="4F81BD" w:themeColor="accent1"/>
     </w:rPr>
   </w:style>
-  <w:style w:type="character" w:customStyle="1" w:styleId="IntenseQuoteChar">
-    <w:name w:val="Intense Quote Char"/>
-    <w:basedOn w:val="DefaultParagraphFont"/>
-    <w:link w:val="IntenseQuote"/>
+  <w:style w:type="character" w:customStyle="1" w:styleId="NhaykepmChar">
+    <w:name w:val="Nháy kép Đậm Char"/>
+    <w:basedOn w:val="Phngmcinhcuaoanvn"/>
+    <w:link w:val="Nhaykepm"/>
     <w:uiPriority w:val="30"/>
     <w:rsid w:val="00FC693F"/>
     <w:rPr>
@@ -10923,9 +10965,9 @@
       <w:color w:val="4F81BD" w:themeColor="accent1"/>
     </w:rPr>
   </w:style>
-  <w:style w:type="character" w:styleId="SubtleEmphasis">
+  <w:style w:type="character" w:styleId="NhnmanhTinht">
     <w:name w:val="Subtle Emphasis"/>
-    <w:basedOn w:val="DefaultParagraphFont"/>
+    <w:basedOn w:val="Phngmcinhcuaoanvn"/>
     <w:uiPriority w:val="19"/>
     <w:qFormat/>
     <w:rsid w:val="00FC693F"/>
@@ -10935,9 +10977,9 @@
       <w:color w:val="808080" w:themeColor="text1" w:themeTint="7F"/>
     </w:rPr>
   </w:style>
-  <w:style w:type="character" w:styleId="IntenseEmphasis">
+  <w:style w:type="character" w:styleId="NhnmnhThm">
     <w:name w:val="Intense Emphasis"/>
-    <w:basedOn w:val="DefaultParagraphFont"/>
+    <w:basedOn w:val="Phngmcinhcuaoanvn"/>
     <w:uiPriority w:val="21"/>
     <w:qFormat/>
     <w:rsid w:val="00FC693F"/>
@@ -10949,9 +10991,9 @@
       <w:color w:val="4F81BD" w:themeColor="accent1"/>
     </w:rPr>
   </w:style>
-  <w:style w:type="character" w:styleId="SubtleReference">
+  <w:style w:type="character" w:styleId="ThamchiuTinht">
     <w:name w:val="Subtle Reference"/>
-    <w:basedOn w:val="DefaultParagraphFont"/>
+    <w:basedOn w:val="Phngmcinhcuaoanvn"/>
     <w:uiPriority w:val="31"/>
     <w:qFormat/>
     <w:rsid w:val="00FC693F"/>
@@ -10961,9 +11003,9 @@
       <w:u w:val="single"/>
     </w:rPr>
   </w:style>
-  <w:style w:type="character" w:styleId="IntenseReference">
+  <w:style w:type="character" w:styleId="ThamchiuNhnmnh">
     <w:name w:val="Intense Reference"/>
-    <w:basedOn w:val="DefaultParagraphFont"/>
+    <w:basedOn w:val="Phngmcinhcuaoanvn"/>
     <w:uiPriority w:val="32"/>
     <w:qFormat/>
     <w:rsid w:val="00FC693F"/>
@@ -10976,9 +11018,9 @@
       <w:u w:val="single"/>
     </w:rPr>
   </w:style>
-  <w:style w:type="character" w:styleId="BookTitle">
+  <w:style w:type="character" w:styleId="TiuSach">
     <w:name w:val="Book Title"/>
-    <w:basedOn w:val="DefaultParagraphFont"/>
+    <w:basedOn w:val="Phngmcinhcuaoanvn"/>
     <w:uiPriority w:val="33"/>
     <w:qFormat/>
     <w:rsid w:val="00FC693F"/>
@@ -10989,10 +11031,10 @@
       <w:spacing w:val="5"/>
     </w:rPr>
   </w:style>
-  <w:style w:type="paragraph" w:styleId="TOCHeading">
+  <w:style w:type="paragraph" w:styleId="uMucluc">
     <w:name w:val="TOC Heading"/>
-    <w:basedOn w:val="Heading1"/>
-    <w:next w:val="Normal"/>
+    <w:basedOn w:val="u1"/>
+    <w:next w:val="Binhthng"/>
     <w:uiPriority w:val="39"/>
     <w:semiHidden/>
     <w:unhideWhenUsed/>
@@ -11002,9 +11044,9 @@
       <w:outlineLvl w:val="9"/>
     </w:pPr>
   </w:style>
-  <w:style w:type="table" w:styleId="TableGrid">
+  <w:style w:type="table" w:styleId="LiBang">
     <w:name w:val="Table Grid"/>
-    <w:basedOn w:val="TableNormal"/>
+    <w:basedOn w:val="BangThngthng"/>
     <w:uiPriority w:val="59"/>
     <w:rsid w:val="00FC693F"/>
     <w:pPr>
@@ -11021,9 +11063,9 @@
       </w:tblBorders>
     </w:tblPr>
   </w:style>
-  <w:style w:type="table" w:styleId="LightShading">
+  <w:style w:type="table" w:styleId="TnnMausang">
     <w:name w:val="Light Shading"/>
-    <w:basedOn w:val="TableNormal"/>
+    <w:basedOn w:val="BangThngthng"/>
     <w:uiPriority w:val="60"/>
     <w:rsid w:val="00FC693F"/>
     <w:pPr>
@@ -11117,9 +11159,9 @@
       </w:tcPr>
     </w:tblStylePr>
   </w:style>
-  <w:style w:type="table" w:styleId="LightShading-Accent1">
+  <w:style w:type="table" w:styleId="TnnMausang-Nhnmanh1">
     <w:name w:val="Light Shading Accent 1"/>
-    <w:basedOn w:val="TableNormal"/>
+    <w:basedOn w:val="BangThngthng"/>
     <w:uiPriority w:val="60"/>
     <w:rsid w:val="00FC693F"/>
     <w:pPr>
@@ -11213,9 +11255,9 @@
       </w:tcPr>
     </w:tblStylePr>
   </w:style>
-  <w:style w:type="table" w:styleId="LightShading-Accent2">
+  <w:style w:type="table" w:styleId="TnnMausang-Nhnmanh2">
     <w:name w:val="Light Shading Accent 2"/>
-    <w:basedOn w:val="TableNormal"/>
+    <w:basedOn w:val="BangThngthng"/>
     <w:uiPriority w:val="60"/>
     <w:rsid w:val="00FC693F"/>
     <w:pPr>
@@ -11309,9 +11351,9 @@
       </w:tcPr>
     </w:tblStylePr>
   </w:style>
-  <w:style w:type="table" w:styleId="LightShading-Accent3">
+  <w:style w:type="table" w:styleId="TnnMausang-Nhnmanh3">
     <w:name w:val="Light Shading Accent 3"/>
-    <w:basedOn w:val="TableNormal"/>
+    <w:basedOn w:val="BangThngthng"/>
     <w:uiPriority w:val="60"/>
     <w:rsid w:val="00FC693F"/>
     <w:pPr>
@@ -11405,9 +11447,9 @@
       </w:tcPr>
     </w:tblStylePr>
   </w:style>
-  <w:style w:type="table" w:styleId="LightShading-Accent4">
+  <w:style w:type="table" w:styleId="TnnMausang-Nhnmanh4">
     <w:name w:val="Light Shading Accent 4"/>
-    <w:basedOn w:val="TableNormal"/>
+    <w:basedOn w:val="BangThngthng"/>
     <w:uiPriority w:val="60"/>
     <w:rsid w:val="00FC693F"/>
     <w:pPr>
@@ -11501,9 +11543,9 @@
       </w:tcPr>
     </w:tblStylePr>
   </w:style>
-  <w:style w:type="table" w:styleId="LightShading-Accent5">
+  <w:style w:type="table" w:styleId="TnnMausang-Nhnmanh5">
     <w:name w:val="Light Shading Accent 5"/>
-    <w:basedOn w:val="TableNormal"/>
+    <w:basedOn w:val="BangThngthng"/>
     <w:uiPriority w:val="60"/>
     <w:rsid w:val="00FC693F"/>
     <w:pPr>
@@ -11597,9 +11639,9 @@
       </w:tcPr>
     </w:tblStylePr>
   </w:style>
-  <w:style w:type="table" w:styleId="LightShading-Accent6">
+  <w:style w:type="table" w:styleId="TnnMausang-Nhnmanh6">
     <w:name w:val="Light Shading Accent 6"/>
-    <w:basedOn w:val="TableNormal"/>
+    <w:basedOn w:val="BangThngthng"/>
     <w:uiPriority w:val="60"/>
     <w:rsid w:val="00FC693F"/>
     <w:pPr>
@@ -11693,9 +11735,9 @@
       </w:tcPr>
     </w:tblStylePr>
   </w:style>
-  <w:style w:type="table" w:styleId="LightList">
+  <w:style w:type="table" w:styleId="DanhsachMausang">
     <w:name w:val="Light List"/>
-    <w:basedOn w:val="TableNormal"/>
+    <w:basedOn w:val="BangThngthng"/>
     <w:uiPriority w:val="61"/>
     <w:rsid w:val="00FC693F"/>
     <w:pPr>
@@ -11778,9 +11820,9 @@
       </w:tcPr>
     </w:tblStylePr>
   </w:style>
-  <w:style w:type="table" w:styleId="LightList-Accent1">
+  <w:style w:type="table" w:styleId="DanhsachMausang-Nhnmanh1">
     <w:name w:val="Light List Accent 1"/>
-    <w:basedOn w:val="TableNormal"/>
+    <w:basedOn w:val="BangThngthng"/>
     <w:uiPriority w:val="61"/>
     <w:rsid w:val="00FC693F"/>
     <w:pPr>
@@ -11863,9 +11905,9 @@
       </w:tcPr>
     </w:tblStylePr>
   </w:style>
-  <w:style w:type="table" w:styleId="LightList-Accent2">
+  <w:style w:type="table" w:styleId="DanhsachMausang-Nhnmanh2">
     <w:name w:val="Light List Accent 2"/>
-    <w:basedOn w:val="TableNormal"/>
+    <w:basedOn w:val="BangThngthng"/>
     <w:uiPriority w:val="61"/>
     <w:rsid w:val="00CB0664"/>
     <w:pPr>
@@ -11948,9 +11990,9 @@
       </w:tcPr>
     </w:tblStylePr>
   </w:style>
-  <w:style w:type="table" w:styleId="LightList-Accent3">
+  <w:style w:type="table" w:styleId="DanhsachMausang-Nhnmanh3">
     <w:name w:val="Light List Accent 3"/>
-    <w:basedOn w:val="TableNormal"/>
+    <w:basedOn w:val="BangThngthng"/>
     <w:uiPriority w:val="61"/>
     <w:rsid w:val="00CB0664"/>
     <w:pPr>
@@ -12033,9 +12075,9 @@
       </w:tcPr>
     </w:tblStylePr>
   </w:style>
-  <w:style w:type="table" w:styleId="LightList-Accent4">
+  <w:style w:type="table" w:styleId="DanhsachMausang-Nhnmanh4">
     <w:name w:val="Light List Accent 4"/>
-    <w:basedOn w:val="TableNormal"/>
+    <w:basedOn w:val="BangThngthng"/>
     <w:uiPriority w:val="61"/>
     <w:rsid w:val="00CB0664"/>
     <w:pPr>
@@ -12118,9 +12160,9 @@
       </w:tcPr>
     </w:tblStylePr>
   </w:style>
-  <w:style w:type="table" w:styleId="LightList-Accent5">
+  <w:style w:type="table" w:styleId="DanhsachMausang-Nhnmanh5">
     <w:name w:val="Light List Accent 5"/>
-    <w:basedOn w:val="TableNormal"/>
+    <w:basedOn w:val="BangThngthng"/>
     <w:uiPriority w:val="61"/>
     <w:rsid w:val="00CB0664"/>
     <w:pPr>
@@ -12203,9 +12245,9 @@
       </w:tcPr>
     </w:tblStylePr>
   </w:style>
-  <w:style w:type="table" w:styleId="LightList-Accent6">
+  <w:style w:type="table" w:styleId="DanhsachMausang-Nhnmanh6">
     <w:name w:val="Light List Accent 6"/>
-    <w:basedOn w:val="TableNormal"/>
+    <w:basedOn w:val="BangThngthng"/>
     <w:uiPriority w:val="61"/>
     <w:rsid w:val="00CB0664"/>
     <w:pPr>
@@ -12288,9 +12330,9 @@
       </w:tcPr>
     </w:tblStylePr>
   </w:style>
-  <w:style w:type="table" w:styleId="LightGrid">
+  <w:style w:type="table" w:styleId="LiMausang">
     <w:name w:val="Light Grid"/>
-    <w:basedOn w:val="TableNormal"/>
+    <w:basedOn w:val="BangThngthng"/>
     <w:uiPriority w:val="62"/>
     <w:rsid w:val="00CB0664"/>
     <w:pPr>
@@ -12411,9 +12453,9 @@
       </w:tcPr>
     </w:tblStylePr>
   </w:style>
-  <w:style w:type="table" w:styleId="LightGrid-Accent1">
+  <w:style w:type="table" w:styleId="LiMausang-Nhnmanh1">
     <w:name w:val="Light Grid Accent 1"/>
-    <w:basedOn w:val="TableNormal"/>
+    <w:basedOn w:val="BangThngthng"/>
     <w:uiPriority w:val="62"/>
     <w:rsid w:val="00CB0664"/>
     <w:pPr>
@@ -12534,9 +12576,9 @@
       </w:tcPr>
     </w:tblStylePr>
   </w:style>
-  <w:style w:type="table" w:styleId="LightGrid-Accent2">
+  <w:style w:type="table" w:styleId="LiMausang-Nhnmanh2">
     <w:name w:val="Light Grid Accent 2"/>
-    <w:basedOn w:val="TableNormal"/>
+    <w:basedOn w:val="BangThngthng"/>
     <w:uiPriority w:val="62"/>
     <w:rsid w:val="00CB0664"/>
     <w:pPr>
@@ -12657,9 +12699,9 @@
       </w:tcPr>
     </w:tblStylePr>
   </w:style>
-  <w:style w:type="table" w:styleId="LightGrid-Accent3">
+  <w:style w:type="table" w:styleId="LiMausang-Nhnmanh3">
     <w:name w:val="Light Grid Accent 3"/>
-    <w:basedOn w:val="TableNormal"/>
+    <w:basedOn w:val="BangThngthng"/>
     <w:uiPriority w:val="62"/>
     <w:rsid w:val="00CB0664"/>
     <w:pPr>
@@ -12780,9 +12822,9 @@
       </w:tcPr>
     </w:tblStylePr>
   </w:style>
-  <w:style w:type="table" w:styleId="LightGrid-Accent4">
+  <w:style w:type="table" w:styleId="LiMausang-Nhnmanh4">
     <w:name w:val="Light Grid Accent 4"/>
-    <w:basedOn w:val="TableNormal"/>
+    <w:basedOn w:val="BangThngthng"/>
     <w:uiPriority w:val="62"/>
     <w:rsid w:val="00CB0664"/>
     <w:pPr>
@@ -12903,9 +12945,9 @@
       </w:tcPr>
     </w:tblStylePr>
   </w:style>
-  <w:style w:type="table" w:styleId="LightGrid-Accent5">
+  <w:style w:type="table" w:styleId="LiMausang-Nhnmanh5">
     <w:name w:val="Light Grid Accent 5"/>
-    <w:basedOn w:val="TableNormal"/>
+    <w:basedOn w:val="BangThngthng"/>
     <w:uiPriority w:val="62"/>
     <w:rsid w:val="00CB0664"/>
     <w:pPr>
@@ -13026,9 +13068,9 @@
       </w:tcPr>
     </w:tblStylePr>
   </w:style>
-  <w:style w:type="table" w:styleId="LightGrid-Accent6">
+  <w:style w:type="table" w:styleId="LiMausang-Nhnmanh6">
     <w:name w:val="Light Grid Accent 6"/>
-    <w:basedOn w:val="TableNormal"/>
+    <w:basedOn w:val="BangThngthng"/>
     <w:uiPriority w:val="62"/>
     <w:rsid w:val="00CB0664"/>
     <w:pPr>
@@ -13149,9 +13191,9 @@
       </w:tcPr>
     </w:tblStylePr>
   </w:style>
-  <w:style w:type="table" w:styleId="MediumShading1">
+  <w:style w:type="table" w:styleId="TnnVa1">
     <w:name w:val="Medium Shading 1"/>
-    <w:basedOn w:val="TableNormal"/>
+    <w:basedOn w:val="BangThngthng"/>
     <w:uiPriority w:val="63"/>
     <w:rsid w:val="00CB0664"/>
     <w:pPr>
@@ -13248,9 +13290,9 @@
       </w:tcPr>
     </w:tblStylePr>
   </w:style>
-  <w:style w:type="table" w:styleId="MediumShading1-Accent1">
+  <w:style w:type="table" w:styleId="TnnVa1-Nhnmanh1">
     <w:name w:val="Medium Shading 1 Accent 1"/>
-    <w:basedOn w:val="TableNormal"/>
+    <w:basedOn w:val="BangThngthng"/>
     <w:uiPriority w:val="63"/>
     <w:rsid w:val="00CB0664"/>
     <w:pPr>
@@ -13347,9 +13389,9 @@
       </w:tcPr>
     </w:tblStylePr>
   </w:style>
-  <w:style w:type="table" w:styleId="MediumShading1-Accent2">
+  <w:style w:type="table" w:styleId="TnnVa1-Nhnmanh2">
     <w:name w:val="Medium Shading 1 Accent 2"/>
-    <w:basedOn w:val="TableNormal"/>
+    <w:basedOn w:val="BangThngthng"/>
     <w:uiPriority w:val="63"/>
     <w:rsid w:val="00CB0664"/>
     <w:pPr>
@@ -13446,9 +13488,9 @@
       </w:tcPr>
     </w:tblStylePr>
   </w:style>
-  <w:style w:type="table" w:styleId="MediumShading1-Accent3">
+  <w:style w:type="table" w:styleId="TnnVa1-Nhnmanh3">
     <w:name w:val="Medium Shading 1 Accent 3"/>
-    <w:basedOn w:val="TableNormal"/>
+    <w:basedOn w:val="BangThngthng"/>
     <w:uiPriority w:val="63"/>
     <w:rsid w:val="00CB0664"/>
     <w:pPr>
@@ -13545,9 +13587,9 @@
       </w:tcPr>
     </w:tblStylePr>
   </w:style>
-  <w:style w:type="table" w:styleId="MediumShading1-Accent4">
+  <w:style w:type="table" w:styleId="TnnVa1-Nhnmanh4">
     <w:name w:val="Medium Shading 1 Accent 4"/>
-    <w:basedOn w:val="TableNormal"/>
+    <w:basedOn w:val="BangThngthng"/>
     <w:uiPriority w:val="63"/>
     <w:rsid w:val="00CB0664"/>
     <w:pPr>
@@ -13644,9 +13686,9 @@
       </w:tcPr>
     </w:tblStylePr>
   </w:style>
-  <w:style w:type="table" w:styleId="MediumShading1-Accent5">
+  <w:style w:type="table" w:styleId="TnnVa1-Nhnmanh5">
     <w:name w:val="Medium Shading 1 Accent 5"/>
-    <w:basedOn w:val="TableNormal"/>
+    <w:basedOn w:val="BangThngthng"/>
     <w:uiPriority w:val="63"/>
     <w:rsid w:val="00CB0664"/>
     <w:pPr>
@@ -13743,9 +13785,9 @@
       </w:tcPr>
     </w:tblStylePr>
   </w:style>
-  <w:style w:type="table" w:styleId="MediumShading1-Accent6">
+  <w:style w:type="table" w:styleId="TnnVa1-Nhnmanh6">
     <w:name w:val="Medium Shading 1 Accent 6"/>
-    <w:basedOn w:val="TableNormal"/>
+    <w:basedOn w:val="BangThngthng"/>
     <w:uiPriority w:val="63"/>
     <w:rsid w:val="00CB0664"/>
     <w:pPr>
@@ -13842,9 +13884,9 @@
       </w:tcPr>
     </w:tblStylePr>
   </w:style>
-  <w:style w:type="table" w:styleId="MediumShading2">
+  <w:style w:type="table" w:styleId="TnnVa2">
     <w:name w:val="Medium Shading 2"/>
-    <w:basedOn w:val="TableNormal"/>
+    <w:basedOn w:val="BangThngthng"/>
     <w:uiPriority w:val="64"/>
     <w:rsid w:val="00CB0664"/>
     <w:pPr>
@@ -13984,9 +14026,9 @@
       </w:tcPr>
     </w:tblStylePr>
   </w:style>
-  <w:style w:type="table" w:styleId="MediumShading2-Accent1">
+  <w:style w:type="table" w:styleId="TnnVa2-Nhnmanh1">
     <w:name w:val="Medium Shading 2 Accent 1"/>
-    <w:basedOn w:val="TableNormal"/>
+    <w:basedOn w:val="BangThngthng"/>
     <w:uiPriority w:val="64"/>
     <w:rsid w:val="00CB0664"/>
     <w:pPr>
@@ -14126,9 +14168,9 @@
       </w:tcPr>
     </w:tblStylePr>
   </w:style>
-  <w:style w:type="table" w:styleId="MediumShading2-Accent2">
+  <w:style w:type="table" w:styleId="TnnVa2-Nhnmanh2">
     <w:name w:val="Medium Shading 2 Accent 2"/>
-    <w:basedOn w:val="TableNormal"/>
+    <w:basedOn w:val="BangThngthng"/>
     <w:uiPriority w:val="64"/>
     <w:rsid w:val="00CB0664"/>
     <w:pPr>
@@ -14268,9 +14310,9 @@
       </w:tcPr>
     </w:tblStylePr>
   </w:style>
-  <w:style w:type="table" w:styleId="MediumShading2-Accent3">
+  <w:style w:type="table" w:styleId="TnnVa2-Nhnmanh3">
     <w:name w:val="Medium Shading 2 Accent 3"/>
-    <w:basedOn w:val="TableNormal"/>
+    <w:basedOn w:val="BangThngthng"/>
     <w:uiPriority w:val="64"/>
     <w:rsid w:val="00CB0664"/>
     <w:pPr>
@@ -14410,9 +14452,9 @@
       </w:tcPr>
     </w:tblStylePr>
   </w:style>
-  <w:style w:type="table" w:styleId="MediumShading2-Accent4">
+  <w:style w:type="table" w:styleId="TnnVa2-Nhnmanh4">
     <w:name w:val="Medium Shading 2 Accent 4"/>
-    <w:basedOn w:val="TableNormal"/>
+    <w:basedOn w:val="BangThngthng"/>
     <w:uiPriority w:val="64"/>
     <w:rsid w:val="00CB0664"/>
     <w:pPr>
@@ -14552,9 +14594,9 @@
       </w:tcPr>
     </w:tblStylePr>
   </w:style>
-  <w:style w:type="table" w:styleId="MediumShading2-Accent5">
+  <w:style w:type="table" w:styleId="TnnVa2-Nhnmanh5">
     <w:name w:val="Medium Shading 2 Accent 5"/>
-    <w:basedOn w:val="TableNormal"/>
+    <w:basedOn w:val="BangThngthng"/>
     <w:uiPriority w:val="64"/>
     <w:rsid w:val="00CB0664"/>
     <w:pPr>
@@ -14694,9 +14736,9 @@
       </w:tcPr>
     </w:tblStylePr>
   </w:style>
-  <w:style w:type="table" w:styleId="MediumShading2-Accent6">
+  <w:style w:type="table" w:styleId="TnnVa2-Nhnmanh6">
     <w:name w:val="Medium Shading 2 Accent 6"/>
-    <w:basedOn w:val="TableNormal"/>
+    <w:basedOn w:val="BangThngthng"/>
     <w:uiPriority w:val="64"/>
     <w:rsid w:val="00CB0664"/>
     <w:pPr>
@@ -14836,9 +14878,9 @@
       </w:tcPr>
     </w:tblStylePr>
   </w:style>
-  <w:style w:type="table" w:styleId="MediumList1">
+  <w:style w:type="table" w:styleId="DanhsachVa1">
     <w:name w:val="Medium List 1"/>
-    <w:basedOn w:val="TableNormal"/>
+    <w:basedOn w:val="BangThngthng"/>
     <w:uiPriority w:val="65"/>
     <w:rsid w:val="00CB0664"/>
     <w:pPr>
@@ -14913,9 +14955,9 @@
       </w:tcPr>
     </w:tblStylePr>
   </w:style>
-  <w:style w:type="table" w:styleId="MediumList1-Accent1">
+  <w:style w:type="table" w:styleId="DanhsachVa1-Nhnmanh1">
     <w:name w:val="Medium List 1 Accent 1"/>
-    <w:basedOn w:val="TableNormal"/>
+    <w:basedOn w:val="BangThngthng"/>
     <w:uiPriority w:val="65"/>
     <w:rsid w:val="00CB0664"/>
     <w:pPr>
@@ -14990,9 +15032,9 @@
       </w:tcPr>
     </w:tblStylePr>
   </w:style>
-  <w:style w:type="table" w:styleId="MediumList1-Accent2">
+  <w:style w:type="table" w:styleId="DanhsachVa1-Nhnmanh2">
     <w:name w:val="Medium List 1 Accent 2"/>
-    <w:basedOn w:val="TableNormal"/>
+    <w:basedOn w:val="BangThngthng"/>
     <w:uiPriority w:val="65"/>
     <w:rsid w:val="00CB0664"/>
     <w:pPr>
@@ -15067,9 +15109,9 @@
       </w:tcPr>
     </w:tblStylePr>
   </w:style>
-  <w:style w:type="table" w:styleId="MediumList1-Accent3">
+  <w:style w:type="table" w:styleId="DanhsachVa1-Nhnmanh3">
     <w:name w:val="Medium List 1 Accent 3"/>
-    <w:basedOn w:val="TableNormal"/>
+    <w:basedOn w:val="BangThngthng"/>
     <w:uiPriority w:val="65"/>
     <w:rsid w:val="00CB0664"/>
     <w:pPr>
@@ -15144,9 +15186,9 @@
       </w:tcPr>
     </w:tblStylePr>
   </w:style>
-  <w:style w:type="table" w:styleId="MediumList1-Accent4">
+  <w:style w:type="table" w:styleId="DanhsachVa1-Nhnmanh4">
     <w:name w:val="Medium List 1 Accent 4"/>
-    <w:basedOn w:val="TableNormal"/>
+    <w:basedOn w:val="BangThngthng"/>
     <w:uiPriority w:val="65"/>
     <w:rsid w:val="00CB0664"/>
     <w:pPr>
@@ -15221,9 +15263,9 @@
       </w:tcPr>
     </w:tblStylePr>
   </w:style>
-  <w:style w:type="table" w:styleId="MediumList1-Accent5">
+  <w:style w:type="table" w:styleId="DanhsachVa1-Nhnmanh5">
     <w:name w:val="Medium List 1 Accent 5"/>
-    <w:basedOn w:val="TableNormal"/>
+    <w:basedOn w:val="BangThngthng"/>
     <w:uiPriority w:val="65"/>
     <w:rsid w:val="00CB0664"/>
     <w:pPr>
@@ -15298,9 +15340,9 @@
       </w:tcPr>
     </w:tblStylePr>
   </w:style>
-  <w:style w:type="table" w:styleId="MediumList1-Accent6">
+  <w:style w:type="table" w:styleId="DanhsachVa1-Nhnmanh6">
     <w:name w:val="Medium List 1 Accent 6"/>
-    <w:basedOn w:val="TableNormal"/>
+    <w:basedOn w:val="BangThngthng"/>
     <w:uiPriority w:val="65"/>
     <w:rsid w:val="00CB0664"/>
     <w:pPr>
@@ -15375,9 +15417,9 @@
       </w:tcPr>
     </w:tblStylePr>
   </w:style>
-  <w:style w:type="table" w:styleId="MediumList2">
+  <w:style w:type="table" w:styleId="DanhsachVa2">
     <w:name w:val="Medium List 2"/>
-    <w:basedOn w:val="TableNormal"/>
+    <w:basedOn w:val="BangThngthng"/>
     <w:uiPriority w:val="66"/>
     <w:rsid w:val="00CB0664"/>
     <w:pPr>
@@ -15496,9 +15538,9 @@
       </w:tcPr>
     </w:tblStylePr>
   </w:style>
-  <w:style w:type="table" w:styleId="MediumList2-Accent1">
+  <w:style w:type="table" w:styleId="DanhsachVa2-Nhnmanh1">
     <w:name w:val="Medium List 2 Accent 1"/>
-    <w:basedOn w:val="TableNormal"/>
+    <w:basedOn w:val="BangThngthng"/>
     <w:uiPriority w:val="66"/>
     <w:rsid w:val="00CB0664"/>
     <w:pPr>
@@ -15617,9 +15659,9 @@
       </w:tcPr>
     </w:tblStylePr>
   </w:style>
-  <w:style w:type="table" w:styleId="MediumList2-Accent2">
+  <w:style w:type="table" w:styleId="DanhsachVa2-Nhnmanh2">
     <w:name w:val="Medium List 2 Accent 2"/>
-    <w:basedOn w:val="TableNormal"/>
+    <w:basedOn w:val="BangThngthng"/>
     <w:uiPriority w:val="66"/>
     <w:rsid w:val="00CB0664"/>
     <w:pPr>
@@ -15738,9 +15780,9 @@
       </w:tcPr>
     </w:tblStylePr>
   </w:style>
-  <w:style w:type="table" w:styleId="MediumList2-Accent3">
+  <w:style w:type="table" w:styleId="DanhsachVa2-Nhnmanh3">
     <w:name w:val="Medium List 2 Accent 3"/>
-    <w:basedOn w:val="TableNormal"/>
+    <w:basedOn w:val="BangThngthng"/>
     <w:uiPriority w:val="66"/>
     <w:rsid w:val="00CB0664"/>
     <w:pPr>
@@ -15859,9 +15901,9 @@
       </w:tcPr>
     </w:tblStylePr>
   </w:style>
-  <w:style w:type="table" w:styleId="MediumList2-Accent4">
+  <w:style w:type="table" w:styleId="DanhsachVa2-Nhnmanh4">
     <w:name w:val="Medium List 2 Accent 4"/>
-    <w:basedOn w:val="TableNormal"/>
+    <w:basedOn w:val="BangThngthng"/>
     <w:uiPriority w:val="66"/>
     <w:rsid w:val="00CB0664"/>
     <w:pPr>
@@ -15980,9 +16022,9 @@
       </w:tcPr>
     </w:tblStylePr>
   </w:style>
-  <w:style w:type="table" w:styleId="MediumList2-Accent5">
+  <w:style w:type="table" w:styleId="DanhsachVa2-Nhnmanh5">
     <w:name w:val="Medium List 2 Accent 5"/>
-    <w:basedOn w:val="TableNormal"/>
+    <w:basedOn w:val="BangThngthng"/>
     <w:uiPriority w:val="66"/>
     <w:rsid w:val="00CB0664"/>
     <w:pPr>
@@ -16101,9 +16143,9 @@
       </w:tcPr>
     </w:tblStylePr>
   </w:style>
-  <w:style w:type="table" w:styleId="MediumList2-Accent6">
+  <w:style w:type="table" w:styleId="DanhsachVa2-Nhnmanh6">
     <w:name w:val="Medium List 2 Accent 6"/>
-    <w:basedOn w:val="TableNormal"/>
+    <w:basedOn w:val="BangThngthng"/>
     <w:uiPriority w:val="66"/>
     <w:rsid w:val="00CB0664"/>
     <w:pPr>
@@ -16222,9 +16264,9 @@
       </w:tcPr>
     </w:tblStylePr>
   </w:style>
-  <w:style w:type="table" w:styleId="MediumGrid1">
+  <w:style w:type="table" w:styleId="LiVa1">
     <w:name w:val="Medium Grid 1"/>
-    <w:basedOn w:val="TableNormal"/>
+    <w:basedOn w:val="BangThngthng"/>
     <w:uiPriority w:val="67"/>
     <w:rsid w:val="00CB0664"/>
     <w:pPr>
@@ -16288,9 +16330,9 @@
       </w:tcPr>
     </w:tblStylePr>
   </w:style>
-  <w:style w:type="table" w:styleId="MediumGrid1-Accent1">
+  <w:style w:type="table" w:styleId="LiVa1-Nhnmanh1">
     <w:name w:val="Medium Grid 1 Accent 1"/>
-    <w:basedOn w:val="TableNormal"/>
+    <w:basedOn w:val="BangThngthng"/>
     <w:uiPriority w:val="67"/>
     <w:rsid w:val="00CB0664"/>
     <w:pPr>
@@ -16354,9 +16396,9 @@
       </w:tcPr>
     </w:tblStylePr>
   </w:style>
-  <w:style w:type="table" w:styleId="MediumGrid1-Accent2">
+  <w:style w:type="table" w:styleId="LiVa1-Nhnmanh2">
     <w:name w:val="Medium Grid 1 Accent 2"/>
-    <w:basedOn w:val="TableNormal"/>
+    <w:basedOn w:val="BangThngthng"/>
     <w:uiPriority w:val="67"/>
     <w:rsid w:val="00CB0664"/>
     <w:pPr>
@@ -16420,9 +16462,9 @@
       </w:tcPr>
     </w:tblStylePr>
   </w:style>
-  <w:style w:type="table" w:styleId="MediumGrid1-Accent3">
+  <w:style w:type="table" w:styleId="LiVa1-Nhnmanh3">
     <w:name w:val="Medium Grid 1 Accent 3"/>
-    <w:basedOn w:val="TableNormal"/>
+    <w:basedOn w:val="BangThngthng"/>
     <w:uiPriority w:val="67"/>
     <w:rsid w:val="00CB0664"/>
     <w:pPr>
@@ -16486,9 +16528,9 @@
       </w:tcPr>
     </w:tblStylePr>
   </w:style>
-  <w:style w:type="table" w:styleId="MediumGrid1-Accent4">
+  <w:style w:type="table" w:styleId="LiVa1-Nhnmanh4">
     <w:name w:val="Medium Grid 1 Accent 4"/>
-    <w:basedOn w:val="TableNormal"/>
+    <w:basedOn w:val="BangThngthng"/>
     <w:uiPriority w:val="67"/>
     <w:rsid w:val="00CB0664"/>
     <w:pPr>
@@ -16552,9 +16594,9 @@
       </w:tcPr>
     </w:tblStylePr>
   </w:style>
-  <w:style w:type="table" w:styleId="MediumGrid1-Accent5">
+  <w:style w:type="table" w:styleId="LiVa1-Nhnmanh5">
     <w:name w:val="Medium Grid 1 Accent 5"/>
-    <w:basedOn w:val="TableNormal"/>
+    <w:basedOn w:val="BangThngthng"/>
     <w:uiPriority w:val="67"/>
     <w:rsid w:val="00CB0664"/>
     <w:pPr>
@@ -16618,9 +16660,9 @@
       </w:tcPr>
     </w:tblStylePr>
   </w:style>
-  <w:style w:type="table" w:styleId="MediumGrid1-Accent6">
+  <w:style w:type="table" w:styleId="LiVa1-Nhnmanh6">
     <w:name w:val="Medium Grid 1 Accent 6"/>
-    <w:basedOn w:val="TableNormal"/>
+    <w:basedOn w:val="BangThngthng"/>
     <w:uiPriority w:val="67"/>
     <w:rsid w:val="00CB0664"/>
     <w:pPr>
@@ -16684,9 +16726,9 @@
       </w:tcPr>
     </w:tblStylePr>
   </w:style>
-  <w:style w:type="table" w:styleId="MediumGrid2">
+  <w:style w:type="table" w:styleId="LiVa2">
     <w:name w:val="Medium Grid 2"/>
-    <w:basedOn w:val="TableNormal"/>
+    <w:basedOn w:val="BangThngthng"/>
     <w:uiPriority w:val="68"/>
     <w:rsid w:val="00CB0664"/>
     <w:pPr>
@@ -16802,9 +16844,9 @@
       </w:tcPr>
     </w:tblStylePr>
   </w:style>
-  <w:style w:type="table" w:styleId="MediumGrid2-Accent1">
+  <w:style w:type="table" w:styleId="LiVa2-Nhnmanh1">
     <w:name w:val="Medium Grid 2 Accent 1"/>
-    <w:basedOn w:val="TableNormal"/>
+    <w:basedOn w:val="BangThngthng"/>
     <w:uiPriority w:val="68"/>
     <w:rsid w:val="00CB0664"/>
     <w:pPr>
@@ -16920,9 +16962,9 @@
       </w:tcPr>
     </w:tblStylePr>
   </w:style>
-  <w:style w:type="table" w:styleId="MediumGrid2-Accent2">
+  <w:style w:type="table" w:styleId="LiVa2-Nhnmanh2">
     <w:name w:val="Medium Grid 2 Accent 2"/>
-    <w:basedOn w:val="TableNormal"/>
+    <w:basedOn w:val="BangThngthng"/>
     <w:uiPriority w:val="68"/>
     <w:rsid w:val="00CB0664"/>
     <w:pPr>
@@ -17038,9 +17080,9 @@
       </w:tcPr>
     </w:tblStylePr>
   </w:style>
-  <w:style w:type="table" w:styleId="MediumGrid2-Accent3">
+  <w:style w:type="table" w:styleId="LiVa2-Nhnmanh3">
     <w:name w:val="Medium Grid 2 Accent 3"/>
-    <w:basedOn w:val="TableNormal"/>
+    <w:basedOn w:val="BangThngthng"/>
     <w:uiPriority w:val="68"/>
     <w:rsid w:val="00CB0664"/>
     <w:pPr>
@@ -17156,9 +17198,9 @@
       </w:tcPr>
     </w:tblStylePr>
   </w:style>
-  <w:style w:type="table" w:styleId="MediumGrid2-Accent4">
+  <w:style w:type="table" w:styleId="LiVa2-Nhnmanh4">
     <w:name w:val="Medium Grid 2 Accent 4"/>
-    <w:basedOn w:val="TableNormal"/>
+    <w:basedOn w:val="BangThngthng"/>
     <w:uiPriority w:val="68"/>
     <w:rsid w:val="00CB0664"/>
     <w:pPr>
@@ -17274,9 +17316,9 @@
       </w:tcPr>
     </w:tblStylePr>
   </w:style>
-  <w:style w:type="table" w:styleId="MediumGrid2-Accent5">
+  <w:style w:type="table" w:styleId="LiVa2-Nhnmanh5">
     <w:name w:val="Medium Grid 2 Accent 5"/>
-    <w:basedOn w:val="TableNormal"/>
+    <w:basedOn w:val="BangThngthng"/>
     <w:uiPriority w:val="68"/>
     <w:rsid w:val="00CB0664"/>
     <w:pPr>
@@ -17392,9 +17434,9 @@
       </w:tcPr>
     </w:tblStylePr>
   </w:style>
-  <w:style w:type="table" w:styleId="MediumGrid2-Accent6">
+  <w:style w:type="table" w:styleId="LiVa2-Nhnmanh6">
     <w:name w:val="Medium Grid 2 Accent 6"/>
-    <w:basedOn w:val="TableNormal"/>
+    <w:basedOn w:val="BangThngthng"/>
     <w:uiPriority w:val="68"/>
     <w:rsid w:val="00CB0664"/>
     <w:pPr>
@@ -17510,9 +17552,9 @@
       </w:tcPr>
     </w:tblStylePr>
   </w:style>
-  <w:style w:type="table" w:styleId="MediumGrid3">
+  <w:style w:type="table" w:styleId="LiVa3">
     <w:name w:val="Medium Grid 3"/>
-    <w:basedOn w:val="TableNormal"/>
+    <w:basedOn w:val="BangThngthng"/>
     <w:uiPriority w:val="69"/>
     <w:rsid w:val="00CB0664"/>
     <w:pPr>
@@ -17644,9 +17686,9 @@
       </w:tcPr>
     </w:tblStylePr>
   </w:style>
-  <w:style w:type="table" w:styleId="MediumGrid3-Accent1">
+  <w:style w:type="table" w:styleId="LiVa3-Nhnmanh1">
     <w:name w:val="Medium Grid 3 Accent 1"/>
-    <w:basedOn w:val="TableNormal"/>
+    <w:basedOn w:val="BangThngthng"/>
     <w:uiPriority w:val="69"/>
     <w:rsid w:val="00CB0664"/>
     <w:pPr>
@@ -17778,9 +17820,9 @@
       </w:tcPr>
     </w:tblStylePr>
   </w:style>
-  <w:style w:type="table" w:styleId="MediumGrid3-Accent2">
+  <w:style w:type="table" w:styleId="LiVa3-Nhnmanh2">
     <w:name w:val="Medium Grid 3 Accent 2"/>
-    <w:basedOn w:val="TableNormal"/>
+    <w:basedOn w:val="BangThngthng"/>
     <w:uiPriority w:val="69"/>
     <w:rsid w:val="00CB0664"/>
     <w:pPr>
@@ -17912,9 +17954,9 @@
       </w:tcPr>
     </w:tblStylePr>
   </w:style>
-  <w:style w:type="table" w:styleId="MediumGrid3-Accent3">
+  <w:style w:type="table" w:styleId="LiVa3-Nhnmanh3">
     <w:name w:val="Medium Grid 3 Accent 3"/>
-    <w:basedOn w:val="TableNormal"/>
+    <w:basedOn w:val="BangThngthng"/>
     <w:uiPriority w:val="69"/>
     <w:rsid w:val="00CB0664"/>
     <w:pPr>
@@ -18046,9 +18088,9 @@
       </w:tcPr>
     </w:tblStylePr>
   </w:style>
-  <w:style w:type="table" w:styleId="MediumGrid3-Accent4">
+  <w:style w:type="table" w:styleId="LiVa3-Nhnmanh4">
     <w:name w:val="Medium Grid 3 Accent 4"/>
-    <w:basedOn w:val="TableNormal"/>
+    <w:basedOn w:val="BangThngthng"/>
     <w:uiPriority w:val="69"/>
     <w:rsid w:val="00CB0664"/>
     <w:pPr>
@@ -18180,9 +18222,9 @@
       </w:tcPr>
     </w:tblStylePr>
   </w:style>
-  <w:style w:type="table" w:styleId="MediumGrid3-Accent5">
+  <w:style w:type="table" w:styleId="LiVa3-Nhnmanh5">
     <w:name w:val="Medium Grid 3 Accent 5"/>
-    <w:basedOn w:val="TableNormal"/>
+    <w:basedOn w:val="BangThngthng"/>
     <w:uiPriority w:val="69"/>
     <w:rsid w:val="00CB0664"/>
     <w:pPr>
@@ -18314,9 +18356,9 @@
       </w:tcPr>
     </w:tblStylePr>
   </w:style>
-  <w:style w:type="table" w:styleId="MediumGrid3-Accent6">
+  <w:style w:type="table" w:styleId="LiVa3-Nhnmanh6">
     <w:name w:val="Medium Grid 3 Accent 6"/>
-    <w:basedOn w:val="TableNormal"/>
+    <w:basedOn w:val="BangThngthng"/>
     <w:uiPriority w:val="69"/>
     <w:rsid w:val="00CB0664"/>
     <w:pPr>
@@ -18448,9 +18490,9 @@
       </w:tcPr>
     </w:tblStylePr>
   </w:style>
-  <w:style w:type="table" w:styleId="DarkList">
+  <w:style w:type="table" w:styleId="DanhsachSm">
     <w:name w:val="Dark List"/>
-    <w:basedOn w:val="TableNormal"/>
+    <w:basedOn w:val="BangThngthng"/>
     <w:uiPriority w:val="70"/>
     <w:rsid w:val="00CB0664"/>
     <w:pPr>
@@ -18555,9 +18597,9 @@
       </w:tcPr>
     </w:tblStylePr>
   </w:style>
-  <w:style w:type="table" w:styleId="DarkList-Accent1">
+  <w:style w:type="table" w:styleId="DanhsachSm-Nhnmanh1">
     <w:name w:val="Dark List Accent 1"/>
-    <w:basedOn w:val="TableNormal"/>
+    <w:basedOn w:val="BangThngthng"/>
     <w:uiPriority w:val="70"/>
     <w:rsid w:val="00CB0664"/>
     <w:pPr>
@@ -18662,9 +18704,9 @@
       </w:tcPr>
     </w:tblStylePr>
   </w:style>
-  <w:style w:type="table" w:styleId="DarkList-Accent2">
+  <w:style w:type="table" w:styleId="DanhsachSm-Nhnmanh2">
     <w:name w:val="Dark List Accent 2"/>
-    <w:basedOn w:val="TableNormal"/>
+    <w:basedOn w:val="BangThngthng"/>
     <w:uiPriority w:val="70"/>
     <w:rsid w:val="00CB0664"/>
     <w:pPr>
@@ -18769,9 +18811,9 @@
       </w:tcPr>
     </w:tblStylePr>
   </w:style>
-  <w:style w:type="table" w:styleId="DarkList-Accent3">
+  <w:style w:type="table" w:styleId="DanhsachSm-Nhnmanh3">
     <w:name w:val="Dark List Accent 3"/>
-    <w:basedOn w:val="TableNormal"/>
+    <w:basedOn w:val="BangThngthng"/>
     <w:uiPriority w:val="70"/>
     <w:rsid w:val="00CB0664"/>
     <w:pPr>
@@ -18876,9 +18918,9 @@
       </w:tcPr>
     </w:tblStylePr>
   </w:style>
-  <w:style w:type="table" w:styleId="DarkList-Accent4">
+  <w:style w:type="table" w:styleId="DanhsachSm-Nhnmanh4">
     <w:name w:val="Dark List Accent 4"/>
-    <w:basedOn w:val="TableNormal"/>
+    <w:basedOn w:val="BangThngthng"/>
     <w:uiPriority w:val="70"/>
     <w:rsid w:val="00CB0664"/>
     <w:pPr>
@@ -18983,9 +19025,9 @@
       </w:tcPr>
     </w:tblStylePr>
   </w:style>
-  <w:style w:type="table" w:styleId="DarkList-Accent5">
+  <w:style w:type="table" w:styleId="DanhsachSm-Nhnmanh5">
     <w:name w:val="Dark List Accent 5"/>
-    <w:basedOn w:val="TableNormal"/>
+    <w:basedOn w:val="BangThngthng"/>
     <w:uiPriority w:val="70"/>
     <w:rsid w:val="00CB0664"/>
     <w:pPr>
@@ -19090,9 +19132,9 @@
       </w:tcPr>
     </w:tblStylePr>
   </w:style>
-  <w:style w:type="table" w:styleId="DarkList-Accent6">
+  <w:style w:type="table" w:styleId="DanhsachSm-Nhnmanh6">
     <w:name w:val="Dark List Accent 6"/>
-    <w:basedOn w:val="TableNormal"/>
+    <w:basedOn w:val="BangThngthng"/>
     <w:uiPriority w:val="70"/>
     <w:rsid w:val="00CB0664"/>
     <w:pPr>
@@ -19197,9 +19239,9 @@
       </w:tcPr>
     </w:tblStylePr>
   </w:style>
-  <w:style w:type="table" w:styleId="ColorfulShading">
+  <w:style w:type="table" w:styleId="TnnScs">
     <w:name w:val="Colorful Shading"/>
-    <w:basedOn w:val="TableNormal"/>
+    <w:basedOn w:val="BangThngthng"/>
     <w:uiPriority w:val="71"/>
     <w:rsid w:val="00CB0664"/>
     <w:pPr>
@@ -19312,9 +19354,9 @@
       </w:rPr>
     </w:tblStylePr>
   </w:style>
-  <w:style w:type="table" w:styleId="ColorfulShading-Accent1">
+  <w:style w:type="table" w:styleId="TnnScs-Nhnmanh1">
     <w:name w:val="Colorful Shading Accent 1"/>
-    <w:basedOn w:val="TableNormal"/>
+    <w:basedOn w:val="BangThngthng"/>
     <w:uiPriority w:val="71"/>
     <w:rsid w:val="00CB0664"/>
     <w:pPr>
@@ -19427,9 +19469,9 @@
       </w:rPr>
     </w:tblStylePr>
   </w:style>
-  <w:style w:type="table" w:styleId="ColorfulShading-Accent2">
+  <w:style w:type="table" w:styleId="TnnScs-Nhnmanh2">
     <w:name w:val="Colorful Shading Accent 2"/>
-    <w:basedOn w:val="TableNormal"/>
+    <w:basedOn w:val="BangThngthng"/>
     <w:uiPriority w:val="71"/>
     <w:rsid w:val="00CB0664"/>
     <w:pPr>
@@ -19542,9 +19584,9 @@
       </w:rPr>
     </w:tblStylePr>
   </w:style>
-  <w:style w:type="table" w:styleId="ColorfulShading-Accent3">
+  <w:style w:type="table" w:styleId="TnnScs-Nhnmanh3">
     <w:name w:val="Colorful Shading Accent 3"/>
-    <w:basedOn w:val="TableNormal"/>
+    <w:basedOn w:val="BangThngthng"/>
     <w:uiPriority w:val="71"/>
     <w:rsid w:val="00CB0664"/>
     <w:pPr>
@@ -19647,9 +19689,9 @@
       </w:tcPr>
     </w:tblStylePr>
   </w:style>
-  <w:style w:type="table" w:styleId="ColorfulShading-Accent4">
+  <w:style w:type="table" w:styleId="TnnScs-Nhnmanh4">
     <w:name w:val="Colorful Shading Accent 4"/>
-    <w:basedOn w:val="TableNormal"/>
+    <w:basedOn w:val="BangThngthng"/>
     <w:uiPriority w:val="71"/>
     <w:rsid w:val="00CB0664"/>
     <w:pPr>
@@ -19762,9 +19804,9 @@
       </w:rPr>
     </w:tblStylePr>
   </w:style>
-  <w:style w:type="table" w:styleId="ColorfulShading-Accent5">
+  <w:style w:type="table" w:styleId="TnnScs-Nhnmanh5">
     <w:name w:val="Colorful Shading Accent 5"/>
-    <w:basedOn w:val="TableNormal"/>
+    <w:basedOn w:val="BangThngthng"/>
     <w:uiPriority w:val="71"/>
     <w:rsid w:val="00CB0664"/>
     <w:pPr>
@@ -19877,9 +19919,9 @@
       </w:rPr>
     </w:tblStylePr>
   </w:style>
-  <w:style w:type="table" w:styleId="ColorfulShading-Accent6">
+  <w:style w:type="table" w:styleId="TnnScs-Nhnmanh6">
     <w:name w:val="Colorful Shading Accent 6"/>
-    <w:basedOn w:val="TableNormal"/>
+    <w:basedOn w:val="BangThngthng"/>
     <w:uiPriority w:val="71"/>
     <w:rsid w:val="00CB0664"/>
     <w:pPr>
@@ -19992,9 +20034,9 @@
       </w:rPr>
     </w:tblStylePr>
   </w:style>
-  <w:style w:type="table" w:styleId="ColorfulList">
+  <w:style w:type="table" w:styleId="DanhsachScs">
     <w:name w:val="Colorful List"/>
-    <w:basedOn w:val="TableNormal"/>
+    <w:basedOn w:val="BangThngthng"/>
     <w:uiPriority w:val="72"/>
     <w:rsid w:val="00CB0664"/>
     <w:pPr>
@@ -20071,9 +20113,9 @@
       </w:tcPr>
     </w:tblStylePr>
   </w:style>
-  <w:style w:type="table" w:styleId="ColorfulList-Accent1">
+  <w:style w:type="table" w:styleId="DanhsachScs-Nhnmanh1">
     <w:name w:val="Colorful List Accent 1"/>
-    <w:basedOn w:val="TableNormal"/>
+    <w:basedOn w:val="BangThngthng"/>
     <w:uiPriority w:val="72"/>
     <w:rsid w:val="00CB0664"/>
     <w:pPr>
@@ -20150,9 +20192,9 @@
       </w:tcPr>
     </w:tblStylePr>
   </w:style>
-  <w:style w:type="table" w:styleId="ColorfulList-Accent2">
+  <w:style w:type="table" w:styleId="DanhsachScs-Nhnmanh2">
     <w:name w:val="Colorful List Accent 2"/>
-    <w:basedOn w:val="TableNormal"/>
+    <w:basedOn w:val="BangThngthng"/>
     <w:uiPriority w:val="72"/>
     <w:rsid w:val="00CB0664"/>
     <w:pPr>
@@ -20229,9 +20271,9 @@
       </w:tcPr>
     </w:tblStylePr>
   </w:style>
-  <w:style w:type="table" w:styleId="ColorfulList-Accent3">
+  <w:style w:type="table" w:styleId="DanhsachScs-Nhnmanh3">
     <w:name w:val="Colorful List Accent 3"/>
-    <w:basedOn w:val="TableNormal"/>
+    <w:basedOn w:val="BangThngthng"/>
     <w:uiPriority w:val="72"/>
     <w:rsid w:val="00CB0664"/>
     <w:pPr>
@@ -20308,9 +20350,9 @@
       </w:tcPr>
     </w:tblStylePr>
   </w:style>
-  <w:style w:type="table" w:styleId="ColorfulList-Accent4">
+  <w:style w:type="table" w:styleId="DanhsachScs-Nhnmanh4">
     <w:name w:val="Colorful List Accent 4"/>
-    <w:basedOn w:val="TableNormal"/>
+    <w:basedOn w:val="BangThngthng"/>
     <w:uiPriority w:val="72"/>
     <w:rsid w:val="00CB0664"/>
     <w:pPr>
@@ -20387,9 +20429,9 @@
       </w:tcPr>
     </w:tblStylePr>
   </w:style>
-  <w:style w:type="table" w:styleId="ColorfulList-Accent5">
+  <w:style w:type="table" w:styleId="DanhsachScs-Nhnmanh5">
     <w:name w:val="Colorful List Accent 5"/>
-    <w:basedOn w:val="TableNormal"/>
+    <w:basedOn w:val="BangThngthng"/>
     <w:uiPriority w:val="72"/>
     <w:rsid w:val="00CB0664"/>
     <w:pPr>
@@ -20466,9 +20508,9 @@
       </w:tcPr>
     </w:tblStylePr>
   </w:style>
-  <w:style w:type="table" w:styleId="ColorfulList-Accent6">
+  <w:style w:type="table" w:styleId="DanhsachScs-Nhnmanh6">
     <w:name w:val="Colorful List Accent 6"/>
-    <w:basedOn w:val="TableNormal"/>
+    <w:basedOn w:val="BangThngthng"/>
     <w:uiPriority w:val="72"/>
     <w:rsid w:val="00CB0664"/>
     <w:pPr>
@@ -20545,9 +20587,9 @@
       </w:tcPr>
     </w:tblStylePr>
   </w:style>
-  <w:style w:type="table" w:styleId="ColorfulGrid">
+  <w:style w:type="table" w:styleId="LiScs">
     <w:name w:val="Colorful Grid"/>
-    <w:basedOn w:val="TableNormal"/>
+    <w:basedOn w:val="BangThngthng"/>
     <w:uiPriority w:val="73"/>
     <w:rsid w:val="00CB0664"/>
     <w:pPr>
@@ -20618,9 +20660,9 @@
       </w:tcPr>
     </w:tblStylePr>
   </w:style>
-  <w:style w:type="table" w:styleId="ColorfulGrid-Accent1">
+  <w:style w:type="table" w:styleId="LiScs-Nhnmanh1">
     <w:name w:val="Colorful Grid Accent 1"/>
-    <w:basedOn w:val="TableNormal"/>
+    <w:basedOn w:val="BangThngthng"/>
     <w:uiPriority w:val="73"/>
     <w:rsid w:val="00CB0664"/>
     <w:pPr>
@@ -20691,9 +20733,9 @@
       </w:tcPr>
     </w:tblStylePr>
   </w:style>
-  <w:style w:type="table" w:styleId="ColorfulGrid-Accent2">
+  <w:style w:type="table" w:styleId="LiScs-Nhnmanh2">
     <w:name w:val="Colorful Grid Accent 2"/>
-    <w:basedOn w:val="TableNormal"/>
+    <w:basedOn w:val="BangThngthng"/>
     <w:uiPriority w:val="73"/>
     <w:rsid w:val="00CB0664"/>
     <w:pPr>
@@ -20764,9 +20806,9 @@
       </w:tcPr>
     </w:tblStylePr>
   </w:style>
-  <w:style w:type="table" w:styleId="ColorfulGrid-Accent3">
+  <w:style w:type="table" w:styleId="LiScs-Nhnmanh3">
     <w:name w:val="Colorful Grid Accent 3"/>
-    <w:basedOn w:val="TableNormal"/>
+    <w:basedOn w:val="BangThngthng"/>
     <w:uiPriority w:val="73"/>
     <w:rsid w:val="00CB0664"/>
     <w:pPr>
@@ -20837,9 +20879,9 @@
       </w:tcPr>
     </w:tblStylePr>
   </w:style>
-  <w:style w:type="table" w:styleId="ColorfulGrid-Accent4">
+  <w:style w:type="table" w:styleId="LiScs-Nhnmanh4">
     <w:name w:val="Colorful Grid Accent 4"/>
-    <w:basedOn w:val="TableNormal"/>
+    <w:basedOn w:val="BangThngthng"/>
     <w:uiPriority w:val="73"/>
     <w:rsid w:val="00CB0664"/>
     <w:pPr>
@@ -20910,9 +20952,9 @@
       </w:tcPr>
     </w:tblStylePr>
   </w:style>
-  <w:style w:type="table" w:styleId="ColorfulGrid-Accent5">
+  <w:style w:type="table" w:styleId="LiScs-Nhnmanh5">
     <w:name w:val="Colorful Grid Accent 5"/>
-    <w:basedOn w:val="TableNormal"/>
+    <w:basedOn w:val="BangThngthng"/>
     <w:uiPriority w:val="73"/>
     <w:rsid w:val="00CB0664"/>
     <w:pPr>
@@ -20983,9 +21025,9 @@
       </w:tcPr>
     </w:tblStylePr>
   </w:style>
-  <w:style w:type="table" w:styleId="ColorfulGrid-Accent6">
+  <w:style w:type="table" w:styleId="LiScs-Nhnmanh6">
     <w:name w:val="Colorful Grid Accent 6"/>
-    <w:basedOn w:val="TableNormal"/>
+    <w:basedOn w:val="BangThngthng"/>
     <w:uiPriority w:val="73"/>
     <w:rsid w:val="00CB0664"/>
     <w:pPr>

</xml_diff>

<commit_message>
fix: nén khoảng trắng thừa + thu nhỏ 16 ảnh screenshot SQL của Trung (mục 7, 11)
Ảnh gốc là screenshot toàn màn hình SSMS có nhiều khoảng trắng thừa (vùng
code editor trống, panel Messages phần lớn để trống). Viết thuật toán nén
khoảng trắng dọc (giữ nguyên mọi dòng có nội dung thật - code/text/status
bar, chỉ cắt bớt các đoạn nền đồng màu dài, loại trừ vùng thanh cuộn/viền để
tránh nhận nhầm là "có nội dung") - không mất bất kỳ dòng code/dữ liệu nào,
đã xem lại từng ảnh để xác nhận. Kết hợp resize 6.0in -> 5.0in, giảm tổng
~13 inch chiều cao trên 16 ảnh.

Co-Authored-By: Claude Sonnet 5 <noreply@anthropic.com>
</commit_message>
<xml_diff>
--- a/slide-report/Report.docx
+++ b/slide-report/Report.docx
@@ -4428,10 +4428,9 @@
           <w:noProof/>
           <w:lang w:val="vi-VN"/>
         </w:rPr>
-        <w:lastRenderedPageBreak/>
         <w:drawing>
           <wp:inline distT="0" distB="0" distL="0" distR="0" wp14:anchorId="337C305D" wp14:editId="35BCA4E6">
-            <wp:extent cx="5486400" cy="2853690"/>
+            <wp:extent cx="4572000" cy="1972573"/>
             <wp:effectExtent l="0" t="0" r="0" b="3810"/>
             <wp:docPr id="645015453" name="Picture 1"/>
             <wp:cNvGraphicFramePr>
@@ -4453,7 +4452,7 @@
                   <pic:spPr>
                     <a:xfrm>
                       <a:off x="0" y="0"/>
-                      <a:ext cx="5486400" cy="2853690"/>
+                      <a:ext cx="4572000" cy="1972573"/>
                     </a:xfrm>
                     <a:prstGeom prst="rect">
                       <a:avLst/>
@@ -4471,6 +4470,7 @@
         <w:pStyle w:val="u2"/>
       </w:pPr>
       <w:r>
+        <w:lastRenderedPageBreak/>
         <w:t>7.2. Index phục vụ hiệu năng truy vấn</w:t>
       </w:r>
     </w:p>
@@ -4596,10 +4596,9 @@
           <w:noProof/>
           <w:lang w:val="vi-VN"/>
         </w:rPr>
-        <w:lastRenderedPageBreak/>
         <w:drawing>
           <wp:inline distT="0" distB="0" distL="0" distR="0" wp14:anchorId="26237856" wp14:editId="6FB89072">
-            <wp:extent cx="5486400" cy="2847975"/>
+            <wp:extent cx="4572000" cy="1968858"/>
             <wp:effectExtent l="0" t="0" r="0" b="9525"/>
             <wp:docPr id="751339373" name="Picture 1"/>
             <wp:cNvGraphicFramePr>
@@ -4621,7 +4620,7 @@
                   <pic:spPr>
                     <a:xfrm>
                       <a:off x="0" y="0"/>
-                      <a:ext cx="5486400" cy="2847975"/>
+                      <a:ext cx="4572000" cy="1968858"/>
                     </a:xfrm>
                     <a:prstGeom prst="rect">
                       <a:avLst/>
@@ -4796,6 +4795,7 @@
           </w:tcPr>
           <w:p>
             <w:r>
+              <w:lastRenderedPageBreak/>
               <w:t>region</w:t>
             </w:r>
           </w:p>
@@ -5027,10 +5027,9 @@
           <w:noProof/>
           <w:lang w:val="vi-VN"/>
         </w:rPr>
-        <w:lastRenderedPageBreak/>
         <w:drawing>
           <wp:inline distT="0" distB="0" distL="0" distR="0" wp14:anchorId="4CAFD131" wp14:editId="1110E9A2">
-            <wp:extent cx="5486400" cy="3082925"/>
+            <wp:extent cx="4572000" cy="2416806"/>
             <wp:effectExtent l="0" t="0" r="0" b="3175"/>
             <wp:docPr id="1240109539" name="Picture 1"/>
             <wp:cNvGraphicFramePr>
@@ -5052,7 +5051,7 @@
                   <pic:spPr>
                     <a:xfrm>
                       <a:off x="0" y="0"/>
-                      <a:ext cx="5486400" cy="3082925"/>
+                      <a:ext cx="4572000" cy="2416806"/>
                     </a:xfrm>
                     <a:prstGeom prst="rect">
                       <a:avLst/>
@@ -5152,9 +5151,10 @@
           <w:noProof/>
           <w:lang w:val="vi-VN"/>
         </w:rPr>
+        <w:lastRenderedPageBreak/>
         <w:drawing>
           <wp:inline distT="0" distB="0" distL="0" distR="0" wp14:anchorId="04690AAB" wp14:editId="65784EE9">
-            <wp:extent cx="5486400" cy="2788285"/>
+            <wp:extent cx="4572000" cy="1408450"/>
             <wp:effectExtent l="0" t="0" r="0" b="0"/>
             <wp:docPr id="1640362782" name="Picture 1"/>
             <wp:cNvGraphicFramePr>
@@ -5176,7 +5176,7 @@
                   <pic:spPr>
                     <a:xfrm>
                       <a:off x="0" y="0"/>
-                      <a:ext cx="5486400" cy="2788285"/>
+                      <a:ext cx="4572000" cy="1408450"/>
                     </a:xfrm>
                     <a:prstGeom prst="rect">
                       <a:avLst/>
@@ -5228,13 +5228,6 @@
           <w:sz w:val="18"/>
         </w:rPr>
         <w:br/>
-      </w:r>
-      <w:r>
-        <w:rPr>
-          <w:rFonts w:ascii="Consolas" w:hAnsi="Consolas"/>
-          <w:sz w:val="18"/>
-        </w:rPr>
-        <w:lastRenderedPageBreak/>
         <w:t>(2,'1C Company'),</w:t>
       </w:r>
       <w:r>
@@ -5285,7 +5278,7 @@
         </w:rPr>
         <w:drawing>
           <wp:inline distT="0" distB="0" distL="0" distR="0" wp14:anchorId="7B6461A2" wp14:editId="6F5701AD">
-            <wp:extent cx="5486400" cy="2984500"/>
+            <wp:extent cx="4572000" cy="2334306"/>
             <wp:effectExtent l="0" t="0" r="0" b="6350"/>
             <wp:docPr id="1621994634" name="Picture 1"/>
             <wp:cNvGraphicFramePr>
@@ -5307,7 +5300,7 @@
                   <pic:spPr>
                     <a:xfrm>
                       <a:off x="0" y="0"/>
-                      <a:ext cx="5486400" cy="2984500"/>
+                      <a:ext cx="4572000" cy="2334306"/>
                     </a:xfrm>
                     <a:prstGeom prst="rect">
                       <a:avLst/>
@@ -5393,7 +5386,7 @@
         </w:rPr>
         <w:drawing>
           <wp:inline distT="0" distB="0" distL="0" distR="0" wp14:anchorId="41CFBD9D" wp14:editId="0DC762C2">
-            <wp:extent cx="5486400" cy="1258570"/>
+            <wp:extent cx="4572000" cy="896348"/>
             <wp:effectExtent l="0" t="0" r="0" b="0"/>
             <wp:docPr id="1506933302" name="Picture 1"/>
             <wp:cNvGraphicFramePr>
@@ -5415,7 +5408,7 @@
                   <pic:spPr>
                     <a:xfrm>
                       <a:off x="0" y="0"/>
-                      <a:ext cx="5486400" cy="1258570"/>
+                      <a:ext cx="4572000" cy="896348"/>
                     </a:xfrm>
                     <a:prstGeom prst="rect">
                       <a:avLst/>
@@ -5433,6 +5426,7 @@
         <w:pStyle w:val="u2"/>
       </w:pPr>
       <w:r>
+        <w:lastRenderedPageBreak/>
         <w:t>Bảng game (11.360 dòng)</w:t>
       </w:r>
     </w:p>
@@ -5515,10 +5509,9 @@
           <w:noProof/>
           <w:lang w:val="vi-VN"/>
         </w:rPr>
-        <w:lastRenderedPageBreak/>
         <w:drawing>
           <wp:inline distT="0" distB="0" distL="0" distR="0" wp14:anchorId="3C1408D2" wp14:editId="756BDD5A">
-            <wp:extent cx="5486400" cy="2881630"/>
+            <wp:extent cx="4572000" cy="2279762"/>
             <wp:effectExtent l="0" t="0" r="0" b="0"/>
             <wp:docPr id="1240113516" name="Picture 1"/>
             <wp:cNvGraphicFramePr>
@@ -5540,7 +5533,7 @@
                   <pic:spPr>
                     <a:xfrm>
                       <a:off x="0" y="0"/>
-                      <a:ext cx="5486400" cy="2881630"/>
+                      <a:ext cx="4572000" cy="2279762"/>
                     </a:xfrm>
                     <a:prstGeom prst="rect">
                       <a:avLst/>
@@ -5642,7 +5635,7 @@
         </w:rPr>
         <w:drawing>
           <wp:inline distT="0" distB="0" distL="0" distR="0" wp14:anchorId="533740E8" wp14:editId="56BB8533">
-            <wp:extent cx="5486400" cy="3082925"/>
+            <wp:extent cx="4572000" cy="2447950"/>
             <wp:effectExtent l="0" t="0" r="0" b="3175"/>
             <wp:docPr id="1817399243" name="Picture 1"/>
             <wp:cNvGraphicFramePr>
@@ -5664,7 +5657,7 @@
                   <pic:spPr>
                     <a:xfrm>
                       <a:off x="0" y="0"/>
-                      <a:ext cx="5486400" cy="3082925"/>
+                      <a:ext cx="4572000" cy="2447950"/>
                     </a:xfrm>
                     <a:prstGeom prst="rect">
                       <a:avLst/>
@@ -5767,7 +5760,7 @@
         </w:rPr>
         <w:drawing>
           <wp:inline distT="0" distB="0" distL="0" distR="0" wp14:anchorId="51354AA2" wp14:editId="25912DDC">
-            <wp:extent cx="5486400" cy="3008630"/>
+            <wp:extent cx="4572000" cy="2385662"/>
             <wp:effectExtent l="0" t="0" r="0" b="1270"/>
             <wp:docPr id="1991787221" name="Picture 1"/>
             <wp:cNvGraphicFramePr>
@@ -5789,7 +5782,7 @@
                   <pic:spPr>
                     <a:xfrm>
                       <a:off x="0" y="0"/>
-                      <a:ext cx="5486400" cy="3008630"/>
+                      <a:ext cx="4572000" cy="2385662"/>
                     </a:xfrm>
                     <a:prstGeom prst="rect">
                       <a:avLst/>
@@ -5889,10 +5882,9 @@
           <w:noProof/>
           <w:lang w:val="vi-VN"/>
         </w:rPr>
-        <w:lastRenderedPageBreak/>
         <w:drawing>
           <wp:inline distT="0" distB="0" distL="0" distR="0" wp14:anchorId="19BB4DE6" wp14:editId="4A52B5E3">
-            <wp:extent cx="5486400" cy="2942590"/>
+            <wp:extent cx="4572000" cy="2331128"/>
             <wp:effectExtent l="0" t="0" r="0" b="0"/>
             <wp:docPr id="768638324" name="Picture 1"/>
             <wp:cNvGraphicFramePr>
@@ -5914,7 +5906,7 @@
                   <pic:spPr>
                     <a:xfrm>
                       <a:off x="0" y="0"/>
-                      <a:ext cx="5486400" cy="2942590"/>
+                      <a:ext cx="4572000" cy="2331128"/>
                     </a:xfrm>
                     <a:prstGeom prst="rect">
                       <a:avLst/>
@@ -5939,6 +5931,7 @@
         <w:pStyle w:val="u1"/>
       </w:pPr>
       <w:r>
+        <w:lastRenderedPageBreak/>
         <w:t>8. Truy vấn (Queries)</w:t>
       </w:r>
     </w:p>
@@ -6010,7 +6003,6 @@
         <w:rPr>
           <w:noProof/>
         </w:rPr>
-        <w:lastRenderedPageBreak/>
         <w:drawing>
           <wp:inline distT="0" distB="0" distL="0" distR="0" wp14:anchorId="0FAC703E" wp14:editId="655AC1EE">
             <wp:extent cx="5486400" cy="2094807"/>
@@ -6111,6 +6103,7 @@
         <w:rPr>
           <w:noProof/>
         </w:rPr>
+        <w:lastRenderedPageBreak/>
         <w:drawing>
           <wp:inline distT="0" distB="0" distL="0" distR="0" wp14:anchorId="65CEA545" wp14:editId="43A731CA">
             <wp:extent cx="5486400" cy="2078816"/>
@@ -6219,7 +6212,6 @@
         <w:rPr>
           <w:noProof/>
         </w:rPr>
-        <w:lastRenderedPageBreak/>
         <w:drawing>
           <wp:inline distT="0" distB="0" distL="0" distR="0" wp14:anchorId="002DF78A" wp14:editId="7E7E24D9">
             <wp:extent cx="5486400" cy="2055987"/>
@@ -6352,6 +6344,13 @@
           <w:sz w:val="20"/>
         </w:rPr>
         <w:br/>
+      </w:r>
+      <w:r>
+        <w:rPr>
+          <w:rFonts w:ascii="Consolas" w:hAnsi="Consolas"/>
+          <w:sz w:val="20"/>
+        </w:rPr>
+        <w:lastRenderedPageBreak/>
         <w:t>) AS genre_sales</w:t>
       </w:r>
       <w:r>
@@ -6460,13 +6459,6 @@
           <w:sz w:val="20"/>
         </w:rPr>
         <w:br/>
-      </w:r>
-      <w:r>
-        <w:rPr>
-          <w:rFonts w:ascii="Consolas" w:hAnsi="Consolas"/>
-          <w:sz w:val="20"/>
-        </w:rPr>
-        <w:lastRenderedPageBreak/>
         <w:t>JOIN game g ON g.id = gp.game_id</w:t>
       </w:r>
       <w:r>
@@ -6591,6 +6583,13 @@
           <w:sz w:val="20"/>
         </w:rPr>
         <w:br/>
+      </w:r>
+      <w:r>
+        <w:rPr>
+          <w:rFonts w:ascii="Consolas" w:hAnsi="Consolas"/>
+          <w:sz w:val="20"/>
+        </w:rPr>
+        <w:lastRenderedPageBreak/>
         <w:t>GROUP BY gpl.release_year</w:t>
       </w:r>
       <w:r>
@@ -6699,13 +6698,6 @@
           <w:sz w:val="20"/>
         </w:rPr>
         <w:br/>
-      </w:r>
-      <w:r>
-        <w:rPr>
-          <w:rFonts w:ascii="Consolas" w:hAnsi="Consolas"/>
-          <w:sz w:val="20"/>
-        </w:rPr>
-        <w:lastRenderedPageBreak/>
         <w:t>GROUP BY pf.platform_name</w:t>
       </w:r>
       <w:r>
@@ -6822,6 +6814,13 @@
           <w:sz w:val="20"/>
         </w:rPr>
         <w:br/>
+      </w:r>
+      <w:r>
+        <w:rPr>
+          <w:rFonts w:ascii="Consolas" w:hAnsi="Consolas"/>
+          <w:sz w:val="20"/>
+        </w:rPr>
+        <w:lastRenderedPageBreak/>
         <w:t xml:space="preserve">               PARTITION BY pf.platform_name</w:t>
       </w:r>
       <w:r>
@@ -6944,7 +6943,6 @@
         <w:pStyle w:val="u2"/>
       </w:pPr>
       <w:r>
-        <w:lastRenderedPageBreak/>
         <w:t>8.9. Doanh số thể loại theo khu vực</w:t>
       </w:r>
     </w:p>
@@ -7035,6 +7033,7 @@
         <w:rPr>
           <w:noProof/>
         </w:rPr>
+        <w:lastRenderedPageBreak/>
         <w:drawing>
           <wp:inline distT="0" distB="0" distL="0" distR="0" wp14:anchorId="08D70B82" wp14:editId="3CE13D5D">
             <wp:extent cx="5486400" cy="2065913"/>
@@ -7166,6 +7165,117 @@
           <w:sz w:val="18"/>
         </w:rPr>
         <w:br/>
+        <w:t xml:space="preserve">    @TopN INT = 10</w:t>
+      </w:r>
+      <w:r>
+        <w:rPr>
+          <w:rFonts w:ascii="Consolas" w:hAnsi="Consolas"/>
+          <w:sz w:val="18"/>
+        </w:rPr>
+        <w:br/>
+        <w:t>AS</w:t>
+      </w:r>
+      <w:r>
+        <w:rPr>
+          <w:rFonts w:ascii="Consolas" w:hAnsi="Consolas"/>
+          <w:sz w:val="18"/>
+        </w:rPr>
+        <w:br/>
+        <w:t>BEGIN</w:t>
+      </w:r>
+      <w:r>
+        <w:rPr>
+          <w:rFonts w:ascii="Consolas" w:hAnsi="Consolas"/>
+          <w:sz w:val="18"/>
+        </w:rPr>
+        <w:br/>
+        <w:t xml:space="preserve">    SET NOCOUNT ON;</w:t>
+      </w:r>
+      <w:r>
+        <w:rPr>
+          <w:rFonts w:ascii="Consolas" w:hAnsi="Consolas"/>
+          <w:sz w:val="18"/>
+        </w:rPr>
+        <w:br/>
+      </w:r>
+      <w:r>
+        <w:rPr>
+          <w:rFonts w:ascii="Consolas" w:hAnsi="Consolas"/>
+          <w:sz w:val="18"/>
+        </w:rPr>
+        <w:br/>
+        <w:t xml:space="preserve">    SELECT TOP (@TopN)</w:t>
+      </w:r>
+      <w:r>
+        <w:rPr>
+          <w:rFonts w:ascii="Consolas" w:hAnsi="Consolas"/>
+          <w:sz w:val="18"/>
+        </w:rPr>
+        <w:br/>
+        <w:t xml:space="preserve">        g.id AS game_id,</w:t>
+      </w:r>
+      <w:r>
+        <w:rPr>
+          <w:rFonts w:ascii="Consolas" w:hAnsi="Consolas"/>
+          <w:sz w:val="18"/>
+        </w:rPr>
+        <w:br/>
+        <w:t xml:space="preserve">        g.game_name,</w:t>
+      </w:r>
+      <w:r>
+        <w:rPr>
+          <w:rFonts w:ascii="Consolas" w:hAnsi="Consolas"/>
+          <w:sz w:val="18"/>
+        </w:rPr>
+        <w:br/>
+        <w:t xml:space="preserve">        gr.genre_name,</w:t>
+      </w:r>
+      <w:r>
+        <w:rPr>
+          <w:rFonts w:ascii="Consolas" w:hAnsi="Consolas"/>
+          <w:sz w:val="18"/>
+        </w:rPr>
+        <w:br/>
+        <w:t xml:space="preserve">        p.publisher_name,</w:t>
+      </w:r>
+      <w:r>
+        <w:rPr>
+          <w:rFonts w:ascii="Consolas" w:hAnsi="Consolas"/>
+          <w:sz w:val="18"/>
+        </w:rPr>
+        <w:br/>
+        <w:t xml:space="preserve">        pl.platform_name,</w:t>
+      </w:r>
+      <w:r>
+        <w:rPr>
+          <w:rFonts w:ascii="Consolas" w:hAnsi="Consolas"/>
+          <w:sz w:val="18"/>
+        </w:rPr>
+        <w:br/>
+        <w:t xml:space="preserve">        rs.num_sales</w:t>
+      </w:r>
+      <w:r>
+        <w:rPr>
+          <w:rFonts w:ascii="Consolas" w:hAnsi="Consolas"/>
+          <w:sz w:val="18"/>
+        </w:rPr>
+        <w:br/>
+        <w:t xml:space="preserve">    FROM region_sales rs</w:t>
+      </w:r>
+      <w:r>
+        <w:rPr>
+          <w:rFonts w:ascii="Consolas" w:hAnsi="Consolas"/>
+          <w:sz w:val="18"/>
+        </w:rPr>
+        <w:br/>
+        <w:t xml:space="preserve">    JOIN game_platform gpl ON gpl.id = rs.game_platform_id</w:t>
+      </w:r>
+      <w:r>
+        <w:rPr>
+          <w:rFonts w:ascii="Consolas" w:hAnsi="Consolas"/>
+          <w:sz w:val="18"/>
+        </w:rPr>
+        <w:br/>
       </w:r>
       <w:r>
         <w:rPr>
@@ -7173,117 +7283,6 @@
           <w:sz w:val="18"/>
         </w:rPr>
         <w:lastRenderedPageBreak/>
-        <w:t xml:space="preserve">    @TopN INT = 10</w:t>
-      </w:r>
-      <w:r>
-        <w:rPr>
-          <w:rFonts w:ascii="Consolas" w:hAnsi="Consolas"/>
-          <w:sz w:val="18"/>
-        </w:rPr>
-        <w:br/>
-        <w:t>AS</w:t>
-      </w:r>
-      <w:r>
-        <w:rPr>
-          <w:rFonts w:ascii="Consolas" w:hAnsi="Consolas"/>
-          <w:sz w:val="18"/>
-        </w:rPr>
-        <w:br/>
-        <w:t>BEGIN</w:t>
-      </w:r>
-      <w:r>
-        <w:rPr>
-          <w:rFonts w:ascii="Consolas" w:hAnsi="Consolas"/>
-          <w:sz w:val="18"/>
-        </w:rPr>
-        <w:br/>
-        <w:t xml:space="preserve">    SET NOCOUNT ON;</w:t>
-      </w:r>
-      <w:r>
-        <w:rPr>
-          <w:rFonts w:ascii="Consolas" w:hAnsi="Consolas"/>
-          <w:sz w:val="18"/>
-        </w:rPr>
-        <w:br/>
-      </w:r>
-      <w:r>
-        <w:rPr>
-          <w:rFonts w:ascii="Consolas" w:hAnsi="Consolas"/>
-          <w:sz w:val="18"/>
-        </w:rPr>
-        <w:br/>
-        <w:t xml:space="preserve">    SELECT TOP (@TopN)</w:t>
-      </w:r>
-      <w:r>
-        <w:rPr>
-          <w:rFonts w:ascii="Consolas" w:hAnsi="Consolas"/>
-          <w:sz w:val="18"/>
-        </w:rPr>
-        <w:br/>
-        <w:t xml:space="preserve">        g.id AS game_id,</w:t>
-      </w:r>
-      <w:r>
-        <w:rPr>
-          <w:rFonts w:ascii="Consolas" w:hAnsi="Consolas"/>
-          <w:sz w:val="18"/>
-        </w:rPr>
-        <w:br/>
-        <w:t xml:space="preserve">        g.game_name,</w:t>
-      </w:r>
-      <w:r>
-        <w:rPr>
-          <w:rFonts w:ascii="Consolas" w:hAnsi="Consolas"/>
-          <w:sz w:val="18"/>
-        </w:rPr>
-        <w:br/>
-        <w:t xml:space="preserve">        gr.genre_name,</w:t>
-      </w:r>
-      <w:r>
-        <w:rPr>
-          <w:rFonts w:ascii="Consolas" w:hAnsi="Consolas"/>
-          <w:sz w:val="18"/>
-        </w:rPr>
-        <w:br/>
-        <w:t xml:space="preserve">        p.publisher_name,</w:t>
-      </w:r>
-      <w:r>
-        <w:rPr>
-          <w:rFonts w:ascii="Consolas" w:hAnsi="Consolas"/>
-          <w:sz w:val="18"/>
-        </w:rPr>
-        <w:br/>
-        <w:t xml:space="preserve">        pl.platform_name,</w:t>
-      </w:r>
-      <w:r>
-        <w:rPr>
-          <w:rFonts w:ascii="Consolas" w:hAnsi="Consolas"/>
-          <w:sz w:val="18"/>
-        </w:rPr>
-        <w:br/>
-        <w:t xml:space="preserve">        rs.num_sales</w:t>
-      </w:r>
-      <w:r>
-        <w:rPr>
-          <w:rFonts w:ascii="Consolas" w:hAnsi="Consolas"/>
-          <w:sz w:val="18"/>
-        </w:rPr>
-        <w:br/>
-        <w:t xml:space="preserve">    FROM region_sales rs</w:t>
-      </w:r>
-      <w:r>
-        <w:rPr>
-          <w:rFonts w:ascii="Consolas" w:hAnsi="Consolas"/>
-          <w:sz w:val="18"/>
-        </w:rPr>
-        <w:br/>
-        <w:t xml:space="preserve">    JOIN game_platform gpl ON gpl.id = rs.game_platform_id</w:t>
-      </w:r>
-      <w:r>
-        <w:rPr>
-          <w:rFonts w:ascii="Consolas" w:hAnsi="Consolas"/>
-          <w:sz w:val="18"/>
-        </w:rPr>
-        <w:br/>
         <w:t xml:space="preserve">    JOIN game_publisher gp ON gp.id = gpl.game_publisher_id</w:t>
       </w:r>
       <w:r>
@@ -7358,7 +7357,7 @@
         </w:rPr>
         <w:drawing>
           <wp:inline distT="0" distB="0" distL="0" distR="0" wp14:anchorId="389016A6" wp14:editId="1AC7A811">
-            <wp:extent cx="5486400" cy="2843530"/>
+            <wp:extent cx="4572000" cy="1960252"/>
             <wp:effectExtent l="0" t="0" r="0" b="0"/>
             <wp:docPr id="1506358839" name="Picture 1"/>
             <wp:cNvGraphicFramePr>
@@ -7380,7 +7379,7 @@
                   <pic:spPr>
                     <a:xfrm>
                       <a:off x="0" y="0"/>
-                      <a:ext cx="5486400" cy="2843530"/>
+                      <a:ext cx="4572000" cy="1960252"/>
                     </a:xfrm>
                     <a:prstGeom prst="rect">
                       <a:avLst/>
@@ -7445,6 +7444,164 @@
           <w:sz w:val="18"/>
         </w:rPr>
         <w:br/>
+        <w:t xml:space="preserve">    @PublisherId INT,</w:t>
+      </w:r>
+      <w:r>
+        <w:rPr>
+          <w:rFonts w:ascii="Consolas" w:hAnsi="Consolas"/>
+          <w:sz w:val="18"/>
+        </w:rPr>
+        <w:br/>
+        <w:t xml:space="preserve">    @PlatformId INT,</w:t>
+      </w:r>
+      <w:r>
+        <w:rPr>
+          <w:rFonts w:ascii="Consolas" w:hAnsi="Consolas"/>
+          <w:sz w:val="18"/>
+        </w:rPr>
+        <w:br/>
+        <w:t xml:space="preserve">    @ReleaseYear INT = NULL,</w:t>
+      </w:r>
+      <w:r>
+        <w:rPr>
+          <w:rFonts w:ascii="Consolas" w:hAnsi="Consolas"/>
+          <w:sz w:val="18"/>
+        </w:rPr>
+        <w:br/>
+        <w:t xml:space="preserve">    @RegionId INT = NULL,</w:t>
+      </w:r>
+      <w:r>
+        <w:rPr>
+          <w:rFonts w:ascii="Consolas" w:hAnsi="Consolas"/>
+          <w:sz w:val="18"/>
+        </w:rPr>
+        <w:br/>
+        <w:t xml:space="preserve">    @NumSales DECIMAL(5,2) = NULL,</w:t>
+      </w:r>
+      <w:r>
+        <w:rPr>
+          <w:rFonts w:ascii="Consolas" w:hAnsi="Consolas"/>
+          <w:sz w:val="18"/>
+        </w:rPr>
+        <w:br/>
+        <w:t xml:space="preserve">    @NewGameId INT OUTPUT</w:t>
+      </w:r>
+      <w:r>
+        <w:rPr>
+          <w:rFonts w:ascii="Consolas" w:hAnsi="Consolas"/>
+          <w:sz w:val="18"/>
+        </w:rPr>
+        <w:br/>
+        <w:t>AS</w:t>
+      </w:r>
+      <w:r>
+        <w:rPr>
+          <w:rFonts w:ascii="Consolas" w:hAnsi="Consolas"/>
+          <w:sz w:val="18"/>
+        </w:rPr>
+        <w:br/>
+        <w:t>BEGIN</w:t>
+      </w:r>
+      <w:r>
+        <w:rPr>
+          <w:rFonts w:ascii="Consolas" w:hAnsi="Consolas"/>
+          <w:sz w:val="18"/>
+        </w:rPr>
+        <w:br/>
+        <w:t xml:space="preserve">    SET NOCOUNT ON;</w:t>
+      </w:r>
+      <w:r>
+        <w:rPr>
+          <w:rFonts w:ascii="Consolas" w:hAnsi="Consolas"/>
+          <w:sz w:val="18"/>
+        </w:rPr>
+        <w:br/>
+        <w:t xml:space="preserve">    DECLARE @GamePublisherId INT;</w:t>
+      </w:r>
+      <w:r>
+        <w:rPr>
+          <w:rFonts w:ascii="Consolas" w:hAnsi="Consolas"/>
+          <w:sz w:val="18"/>
+        </w:rPr>
+        <w:br/>
+        <w:t xml:space="preserve">    DECLARE @GamePlatformId INT;</w:t>
+      </w:r>
+      <w:r>
+        <w:rPr>
+          <w:rFonts w:ascii="Consolas" w:hAnsi="Consolas"/>
+          <w:sz w:val="18"/>
+        </w:rPr>
+        <w:br/>
+      </w:r>
+      <w:r>
+        <w:rPr>
+          <w:rFonts w:ascii="Consolas" w:hAnsi="Consolas"/>
+          <w:sz w:val="18"/>
+        </w:rPr>
+        <w:br/>
+        <w:t xml:space="preserve">    BEGIN TRANSACTION;</w:t>
+      </w:r>
+      <w:r>
+        <w:rPr>
+          <w:rFonts w:ascii="Consolas" w:hAnsi="Consolas"/>
+          <w:sz w:val="18"/>
+        </w:rPr>
+        <w:br/>
+        <w:t xml:space="preserve">    BEGIN TRY</w:t>
+      </w:r>
+      <w:r>
+        <w:rPr>
+          <w:rFonts w:ascii="Consolas" w:hAnsi="Consolas"/>
+          <w:sz w:val="18"/>
+        </w:rPr>
+        <w:br/>
+        <w:t xml:space="preserve">        SELECT @NewGameId = ISNULL(MAX(id), 0) + 1 FROM game;</w:t>
+      </w:r>
+      <w:r>
+        <w:rPr>
+          <w:rFonts w:ascii="Consolas" w:hAnsi="Consolas"/>
+          <w:sz w:val="18"/>
+        </w:rPr>
+        <w:br/>
+        <w:t xml:space="preserve">        INSERT INTO game (id, genre_id, game_name)</w:t>
+      </w:r>
+      <w:r>
+        <w:rPr>
+          <w:rFonts w:ascii="Consolas" w:hAnsi="Consolas"/>
+          <w:sz w:val="18"/>
+        </w:rPr>
+        <w:br/>
+        <w:t xml:space="preserve">        VALUES (@NewGameId, @GenreId, @GameName);</w:t>
+      </w:r>
+      <w:r>
+        <w:rPr>
+          <w:rFonts w:ascii="Consolas" w:hAnsi="Consolas"/>
+          <w:sz w:val="18"/>
+        </w:rPr>
+        <w:br/>
+      </w:r>
+      <w:r>
+        <w:rPr>
+          <w:rFonts w:ascii="Consolas" w:hAnsi="Consolas"/>
+          <w:sz w:val="18"/>
+        </w:rPr>
+        <w:br/>
+        <w:t xml:space="preserve">        SELECT @GamePublisherId = ISNULL(MAX(id), 0) + 1 FROM game_publisher;</w:t>
+      </w:r>
+      <w:r>
+        <w:rPr>
+          <w:rFonts w:ascii="Consolas" w:hAnsi="Consolas"/>
+          <w:sz w:val="18"/>
+        </w:rPr>
+        <w:br/>
+        <w:t xml:space="preserve">        INSERT INTO game_publisher (id, game_id, publisher_id)</w:t>
+      </w:r>
+      <w:r>
+        <w:rPr>
+          <w:rFonts w:ascii="Consolas" w:hAnsi="Consolas"/>
+          <w:sz w:val="18"/>
+        </w:rPr>
+        <w:br/>
       </w:r>
       <w:r>
         <w:rPr>
@@ -7452,164 +7609,6 @@
           <w:sz w:val="18"/>
         </w:rPr>
         <w:lastRenderedPageBreak/>
-        <w:t xml:space="preserve">    @PublisherId INT,</w:t>
-      </w:r>
-      <w:r>
-        <w:rPr>
-          <w:rFonts w:ascii="Consolas" w:hAnsi="Consolas"/>
-          <w:sz w:val="18"/>
-        </w:rPr>
-        <w:br/>
-        <w:t xml:space="preserve">    @PlatformId INT,</w:t>
-      </w:r>
-      <w:r>
-        <w:rPr>
-          <w:rFonts w:ascii="Consolas" w:hAnsi="Consolas"/>
-          <w:sz w:val="18"/>
-        </w:rPr>
-        <w:br/>
-        <w:t xml:space="preserve">    @ReleaseYear INT = NULL,</w:t>
-      </w:r>
-      <w:r>
-        <w:rPr>
-          <w:rFonts w:ascii="Consolas" w:hAnsi="Consolas"/>
-          <w:sz w:val="18"/>
-        </w:rPr>
-        <w:br/>
-        <w:t xml:space="preserve">    @RegionId INT = NULL,</w:t>
-      </w:r>
-      <w:r>
-        <w:rPr>
-          <w:rFonts w:ascii="Consolas" w:hAnsi="Consolas"/>
-          <w:sz w:val="18"/>
-        </w:rPr>
-        <w:br/>
-        <w:t xml:space="preserve">    @NumSales DECIMAL(5,2) = NULL,</w:t>
-      </w:r>
-      <w:r>
-        <w:rPr>
-          <w:rFonts w:ascii="Consolas" w:hAnsi="Consolas"/>
-          <w:sz w:val="18"/>
-        </w:rPr>
-        <w:br/>
-        <w:t xml:space="preserve">    @NewGameId INT OUTPUT</w:t>
-      </w:r>
-      <w:r>
-        <w:rPr>
-          <w:rFonts w:ascii="Consolas" w:hAnsi="Consolas"/>
-          <w:sz w:val="18"/>
-        </w:rPr>
-        <w:br/>
-        <w:t>AS</w:t>
-      </w:r>
-      <w:r>
-        <w:rPr>
-          <w:rFonts w:ascii="Consolas" w:hAnsi="Consolas"/>
-          <w:sz w:val="18"/>
-        </w:rPr>
-        <w:br/>
-        <w:t>BEGIN</w:t>
-      </w:r>
-      <w:r>
-        <w:rPr>
-          <w:rFonts w:ascii="Consolas" w:hAnsi="Consolas"/>
-          <w:sz w:val="18"/>
-        </w:rPr>
-        <w:br/>
-        <w:t xml:space="preserve">    SET NOCOUNT ON;</w:t>
-      </w:r>
-      <w:r>
-        <w:rPr>
-          <w:rFonts w:ascii="Consolas" w:hAnsi="Consolas"/>
-          <w:sz w:val="18"/>
-        </w:rPr>
-        <w:br/>
-        <w:t xml:space="preserve">    DECLARE @GamePublisherId INT;</w:t>
-      </w:r>
-      <w:r>
-        <w:rPr>
-          <w:rFonts w:ascii="Consolas" w:hAnsi="Consolas"/>
-          <w:sz w:val="18"/>
-        </w:rPr>
-        <w:br/>
-        <w:t xml:space="preserve">    DECLARE @GamePlatformId INT;</w:t>
-      </w:r>
-      <w:r>
-        <w:rPr>
-          <w:rFonts w:ascii="Consolas" w:hAnsi="Consolas"/>
-          <w:sz w:val="18"/>
-        </w:rPr>
-        <w:br/>
-      </w:r>
-      <w:r>
-        <w:rPr>
-          <w:rFonts w:ascii="Consolas" w:hAnsi="Consolas"/>
-          <w:sz w:val="18"/>
-        </w:rPr>
-        <w:br/>
-        <w:t xml:space="preserve">    BEGIN TRANSACTION;</w:t>
-      </w:r>
-      <w:r>
-        <w:rPr>
-          <w:rFonts w:ascii="Consolas" w:hAnsi="Consolas"/>
-          <w:sz w:val="18"/>
-        </w:rPr>
-        <w:br/>
-        <w:t xml:space="preserve">    BEGIN TRY</w:t>
-      </w:r>
-      <w:r>
-        <w:rPr>
-          <w:rFonts w:ascii="Consolas" w:hAnsi="Consolas"/>
-          <w:sz w:val="18"/>
-        </w:rPr>
-        <w:br/>
-        <w:t xml:space="preserve">        SELECT @NewGameId = ISNULL(MAX(id), 0) + 1 FROM game;</w:t>
-      </w:r>
-      <w:r>
-        <w:rPr>
-          <w:rFonts w:ascii="Consolas" w:hAnsi="Consolas"/>
-          <w:sz w:val="18"/>
-        </w:rPr>
-        <w:br/>
-        <w:t xml:space="preserve">        INSERT INTO game (id, genre_id, game_name)</w:t>
-      </w:r>
-      <w:r>
-        <w:rPr>
-          <w:rFonts w:ascii="Consolas" w:hAnsi="Consolas"/>
-          <w:sz w:val="18"/>
-        </w:rPr>
-        <w:br/>
-        <w:t xml:space="preserve">        VALUES (@NewGameId, @GenreId, @GameName);</w:t>
-      </w:r>
-      <w:r>
-        <w:rPr>
-          <w:rFonts w:ascii="Consolas" w:hAnsi="Consolas"/>
-          <w:sz w:val="18"/>
-        </w:rPr>
-        <w:br/>
-      </w:r>
-      <w:r>
-        <w:rPr>
-          <w:rFonts w:ascii="Consolas" w:hAnsi="Consolas"/>
-          <w:sz w:val="18"/>
-        </w:rPr>
-        <w:br/>
-        <w:t xml:space="preserve">        SELECT @GamePublisherId = ISNULL(MAX(id), 0) + 1 FROM game_publisher;</w:t>
-      </w:r>
-      <w:r>
-        <w:rPr>
-          <w:rFonts w:ascii="Consolas" w:hAnsi="Consolas"/>
-          <w:sz w:val="18"/>
-        </w:rPr>
-        <w:br/>
-        <w:t xml:space="preserve">        INSERT INTO game_publisher (id, game_id, publisher_id)</w:t>
-      </w:r>
-      <w:r>
-        <w:rPr>
-          <w:rFonts w:ascii="Consolas" w:hAnsi="Consolas"/>
-          <w:sz w:val="18"/>
-        </w:rPr>
-        <w:br/>
         <w:t xml:space="preserve">        VALUES (@GamePublisherId, @NewGameId, @PublisherId);</w:t>
       </w:r>
       <w:r>
@@ -7767,10 +7766,9 @@
           <w:noProof/>
           <w:lang w:val="vi-VN"/>
         </w:rPr>
-        <w:lastRenderedPageBreak/>
         <w:drawing>
           <wp:inline distT="0" distB="0" distL="0" distR="0" wp14:anchorId="16377344" wp14:editId="08A5AA6D">
-            <wp:extent cx="5486400" cy="2841625"/>
+            <wp:extent cx="4572000" cy="2203894"/>
             <wp:effectExtent l="0" t="0" r="0" b="0"/>
             <wp:docPr id="42994297" name="Picture 1"/>
             <wp:cNvGraphicFramePr>
@@ -7792,7 +7790,7 @@
                   <pic:spPr>
                     <a:xfrm>
                       <a:off x="0" y="0"/>
-                      <a:ext cx="5486400" cy="2841625"/>
+                      <a:ext cx="4572000" cy="2203894"/>
                     </a:xfrm>
                     <a:prstGeom prst="rect">
                       <a:avLst/>
@@ -7928,6 +7926,13 @@
           <w:sz w:val="18"/>
         </w:rPr>
         <w:br/>
+      </w:r>
+      <w:r>
+        <w:rPr>
+          <w:rFonts w:ascii="Consolas" w:hAnsi="Consolas"/>
+          <w:sz w:val="18"/>
+        </w:rPr>
+        <w:lastRenderedPageBreak/>
         <w:t xml:space="preserve">    END</w:t>
       </w:r>
       <w:r>
@@ -8047,13 +8052,6 @@
           <w:sz w:val="18"/>
         </w:rPr>
         <w:br/>
-      </w:r>
-      <w:r>
-        <w:rPr>
-          <w:rFonts w:ascii="Consolas" w:hAnsi="Consolas"/>
-          <w:sz w:val="18"/>
-        </w:rPr>
-        <w:lastRenderedPageBreak/>
         <w:t xml:space="preserve">    END</w:t>
       </w:r>
       <w:r>
@@ -8080,7 +8078,7 @@
         </w:rPr>
         <w:drawing>
           <wp:inline distT="0" distB="0" distL="0" distR="0" wp14:anchorId="0C098352" wp14:editId="0771EB8E">
-            <wp:extent cx="5486400" cy="2848610"/>
+            <wp:extent cx="4572000" cy="2209655"/>
             <wp:effectExtent l="0" t="0" r="0" b="8890"/>
             <wp:docPr id="1553113822" name="Picture 1"/>
             <wp:cNvGraphicFramePr>
@@ -8102,7 +8100,7 @@
                   <pic:spPr>
                     <a:xfrm>
                       <a:off x="0" y="0"/>
-                      <a:ext cx="5486400" cy="2848610"/>
+                      <a:ext cx="4572000" cy="2209655"/>
                     </a:xfrm>
                     <a:prstGeom prst="rect">
                       <a:avLst/>
@@ -8253,6 +8251,13 @@
           <w:sz w:val="18"/>
         </w:rPr>
         <w:br/>
+      </w:r>
+      <w:r>
+        <w:rPr>
+          <w:rFonts w:ascii="Consolas" w:hAnsi="Consolas"/>
+          <w:sz w:val="18"/>
+        </w:rPr>
+        <w:lastRenderedPageBreak/>
         <w:t xml:space="preserve">        DELETE rs</w:t>
       </w:r>
       <w:r>
@@ -8338,7 +8343,6 @@
           <w:rFonts w:ascii="Consolas" w:hAnsi="Consolas"/>
           <w:sz w:val="18"/>
         </w:rPr>
-        <w:lastRenderedPageBreak/>
         <w:br/>
         <w:t xml:space="preserve">        DELETE FROM game_publisher WHERE game_id = @GameId;</w:t>
       </w:r>
@@ -8429,7 +8433,7 @@
         </w:rPr>
         <w:drawing>
           <wp:inline distT="0" distB="0" distL="0" distR="0" wp14:anchorId="16E8FA2F" wp14:editId="46C86885">
-            <wp:extent cx="5486400" cy="2855595"/>
+            <wp:extent cx="4572000" cy="2215506"/>
             <wp:effectExtent l="0" t="0" r="0" b="1905"/>
             <wp:docPr id="1287349788" name="Picture 1"/>
             <wp:cNvGraphicFramePr>
@@ -8451,7 +8455,7 @@
                   <pic:spPr>
                     <a:xfrm>
                       <a:off x="0" y="0"/>
-                      <a:ext cx="5486400" cy="2855595"/>
+                      <a:ext cx="4572000" cy="2215506"/>
                     </a:xfrm>
                     <a:prstGeom prst="rect">
                       <a:avLst/>
@@ -8579,6 +8583,13 @@
           <w:sz w:val="18"/>
         </w:rPr>
         <w:br/>
+      </w:r>
+      <w:r>
+        <w:rPr>
+          <w:rFonts w:ascii="Consolas" w:hAnsi="Consolas"/>
+          <w:sz w:val="18"/>
+        </w:rPr>
+        <w:lastRenderedPageBreak/>
         <w:t xml:space="preserve">        g.game_name,</w:t>
       </w:r>
       <w:r>
@@ -8627,13 +8638,6 @@
           <w:sz w:val="18"/>
         </w:rPr>
         <w:br/>
-      </w:r>
-      <w:r>
-        <w:rPr>
-          <w:rFonts w:ascii="Consolas" w:hAnsi="Consolas"/>
-          <w:sz w:val="18"/>
-        </w:rPr>
-        <w:lastRenderedPageBreak/>
         <w:t xml:space="preserve">    FROM game g</w:t>
       </w:r>
       <w:r>
@@ -8756,7 +8760,7 @@
         </w:rPr>
         <w:drawing>
           <wp:inline distT="0" distB="0" distL="0" distR="0" wp14:anchorId="65B5E5A7" wp14:editId="753AB835">
-            <wp:extent cx="5486400" cy="2849880"/>
+            <wp:extent cx="4572000" cy="2211143"/>
             <wp:effectExtent l="0" t="0" r="0" b="7620"/>
             <wp:docPr id="592935860" name="Picture 1"/>
             <wp:cNvGraphicFramePr>
@@ -8778,7 +8782,7 @@
                   <pic:spPr>
                     <a:xfrm>
                       <a:off x="0" y="0"/>
-                      <a:ext cx="5486400" cy="2849880"/>
+                      <a:ext cx="4572000" cy="2211143"/>
                     </a:xfrm>
                     <a:prstGeom prst="rect">
                       <a:avLst/>
@@ -8912,14 +8916,8 @@
           <w:rFonts w:ascii="Consolas" w:hAnsi="Consolas"/>
           <w:sz w:val="18"/>
         </w:rPr>
-        <w:br/>
-      </w:r>
-      <w:r>
-        <w:rPr>
-          <w:rFonts w:ascii="Consolas" w:hAnsi="Consolas"/>
-          <w:sz w:val="18"/>
-        </w:rPr>
         <w:lastRenderedPageBreak/>
+        <w:br/>
         <w:t xml:space="preserve">    RETURN @Total;</w:t>
       </w:r>
       <w:r>
@@ -8945,7 +8943,7 @@
         </w:rPr>
         <w:drawing>
           <wp:inline distT="0" distB="0" distL="0" distR="0" wp14:anchorId="0FEF343B" wp14:editId="09F9EBAE">
-            <wp:extent cx="5486400" cy="2482215"/>
+            <wp:extent cx="4572000" cy="1363831"/>
             <wp:effectExtent l="0" t="0" r="0" b="0"/>
             <wp:docPr id="1410739821" name="Picture 1"/>
             <wp:cNvGraphicFramePr>
@@ -8967,7 +8965,7 @@
                   <pic:spPr>
                     <a:xfrm>
                       <a:off x="0" y="0"/>
-                      <a:ext cx="5486400" cy="2482215"/>
+                      <a:ext cx="4572000" cy="1363831"/>
                     </a:xfrm>
                     <a:prstGeom prst="rect">
                       <a:avLst/>

</xml_diff>